<commit_message>
Update paper PDF/DOCX and manage temp files
Replace the decision letter PDF and the manuscript DOCX with updated versions. Remove an obsolete temporary autosave file (~$per-04-01-2026.docx) and add a new temporary autosave (~$pp-mat-04-01-26.docx). This syncs the repo with the latest editorial decision and manuscript edits; consider excluding editor temp files in future commits.
</commit_message>
<xml_diff>
--- a/paper/paper-04-01-2026.docx
+++ b/paper/paper-04-01-2026.docx
@@ -7,12 +7,32 @@
         <w:pStyle w:val="H1"/>
         <w:spacing w:line="480" w:lineRule="auto"/>
         <w:rPr>
-          <w:ins w:id="0" w:author="Elvis F. Elli" w:date="2026-06-08T12:11:00Z" w16du:dateUtc="2026-06-08T17:11:00Z"/>
+          <w:ins w:id="0" w:author="Elvis F. Elli" w:date="2026-06-09T11:12:00Z" w16du:dateUtc="2026-06-09T16:12:00Z"/>
           <w:sz w:val="24"/>
           <w:szCs w:val="24"/>
         </w:rPr>
       </w:pPr>
-      <w:ins w:id="1" w:author="Elvis F. Elli" w:date="2026-06-08T12:11:00Z" w16du:dateUtc="2026-06-08T17:11:00Z">
+      <w:ins w:id="1" w:author="Elvis F. Elli" w:date="2026-06-09T11:12:00Z" w16du:dateUtc="2026-06-09T16:12:00Z">
+        <w:r>
+          <w:rPr>
+            <w:sz w:val="24"/>
+            <w:szCs w:val="24"/>
+          </w:rPr>
+          <w:t>Next: go one by one suggestions/add 1-2 new supp materials</w:t>
+        </w:r>
+      </w:ins>
+    </w:p>
+    <w:p>
+      <w:pPr>
+        <w:pStyle w:val="H1"/>
+        <w:spacing w:line="480" w:lineRule="auto"/>
+        <w:rPr>
+          <w:ins w:id="2" w:author="Elvis F. Elli" w:date="2026-06-08T12:11:00Z" w16du:dateUtc="2026-06-08T17:11:00Z"/>
+          <w:sz w:val="24"/>
+          <w:szCs w:val="24"/>
+        </w:rPr>
+      </w:pPr>
+      <w:ins w:id="3" w:author="Elvis F. Elli" w:date="2026-06-08T12:11:00Z" w16du:dateUtc="2026-06-08T17:11:00Z">
         <w:r>
           <w:rPr>
             <w:sz w:val="24"/>
@@ -1455,7 +1475,7 @@
         </w:rPr>
         <w:t>.</w:t>
       </w:r>
-      <w:ins w:id="2" w:author="Elvis F. Elli" w:date="2026-06-08T10:35:00Z" w16du:dateUtc="2026-06-08T15:35:00Z">
+      <w:ins w:id="4" w:author="Elvis F. Elli" w:date="2026-06-08T10:35:00Z" w16du:dateUtc="2026-06-08T15:35:00Z">
         <w:r>
           <w:rPr>
             <w:rFonts w:ascii="Times New Roman" w:hAnsi="Times New Roman" w:cs="Times New Roman"/>
@@ -1465,7 +1485,7 @@
           <w:t xml:space="preserve"> While </w:t>
         </w:r>
       </w:ins>
-      <w:ins w:id="3" w:author="Elvis F. Elli" w:date="2026-06-08T10:36:00Z" w16du:dateUtc="2026-06-08T15:36:00Z">
+      <w:ins w:id="5" w:author="Elvis F. Elli" w:date="2026-06-08T10:36:00Z" w16du:dateUtc="2026-06-08T15:36:00Z">
         <w:r>
           <w:rPr>
             <w:rFonts w:ascii="Times New Roman" w:hAnsi="Times New Roman" w:cs="Times New Roman"/>
@@ -1475,7 +1495,7 @@
           <w:t xml:space="preserve">projected </w:t>
         </w:r>
       </w:ins>
-      <w:ins w:id="4" w:author="Elvis F. Elli" w:date="2026-06-08T10:35:00Z" w16du:dateUtc="2026-06-08T15:35:00Z">
+      <w:ins w:id="6" w:author="Elvis F. Elli" w:date="2026-06-08T10:35:00Z" w16du:dateUtc="2026-06-08T15:35:00Z">
         <w:r>
           <w:rPr>
             <w:rFonts w:ascii="Times New Roman" w:hAnsi="Times New Roman" w:cs="Times New Roman"/>
@@ -1502,7 +1522,7 @@
           <w:t>] can offset heat-induced yield losses (Ainsworth et al., 2002; Kothari et al., 2022), complementary agronomic adaptation</w:t>
         </w:r>
       </w:ins>
-      <w:ins w:id="5" w:author="Elvis F. Elli" w:date="2026-06-08T10:37:00Z" w16du:dateUtc="2026-06-08T15:37:00Z">
+      <w:ins w:id="7" w:author="Elvis F. Elli" w:date="2026-06-08T10:37:00Z" w16du:dateUtc="2026-06-08T15:37:00Z">
         <w:r>
           <w:rPr>
             <w:rFonts w:ascii="Times New Roman" w:hAnsi="Times New Roman" w:cs="Times New Roman"/>
@@ -1512,7 +1532,7 @@
           <w:t xml:space="preserve"> may be needed </w:t>
         </w:r>
       </w:ins>
-      <w:ins w:id="6" w:author="Elvis F. Elli" w:date="2026-06-08T10:38:00Z" w16du:dateUtc="2026-06-08T15:38:00Z">
+      <w:ins w:id="8" w:author="Elvis F. Elli" w:date="2026-06-08T10:38:00Z" w16du:dateUtc="2026-06-08T15:38:00Z">
         <w:r>
           <w:rPr>
             <w:rFonts w:ascii="Times New Roman" w:hAnsi="Times New Roman" w:cs="Times New Roman"/>
@@ -1522,7 +1542,7 @@
           <w:t xml:space="preserve">in some environments </w:t>
         </w:r>
       </w:ins>
-      <w:ins w:id="7" w:author="Elvis F. Elli" w:date="2026-06-08T10:37:00Z" w16du:dateUtc="2026-06-08T15:37:00Z">
+      <w:ins w:id="9" w:author="Elvis F. Elli" w:date="2026-06-08T10:37:00Z" w16du:dateUtc="2026-06-08T15:37:00Z">
         <w:r>
           <w:rPr>
             <w:rFonts w:ascii="Times New Roman" w:hAnsi="Times New Roman" w:cs="Times New Roman"/>
@@ -1532,7 +1552,7 @@
           <w:t xml:space="preserve">to fully </w:t>
         </w:r>
       </w:ins>
-      <w:ins w:id="8" w:author="Elvis F. Elli" w:date="2026-06-08T10:38:00Z" w16du:dateUtc="2026-06-08T15:38:00Z">
+      <w:ins w:id="10" w:author="Elvis F. Elli" w:date="2026-06-08T10:38:00Z" w16du:dateUtc="2026-06-08T15:38:00Z">
         <w:r>
           <w:rPr>
             <w:rFonts w:ascii="Times New Roman" w:hAnsi="Times New Roman" w:cs="Times New Roman"/>
@@ -1542,7 +1562,7 @@
           <w:t>compensate for the</w:t>
         </w:r>
       </w:ins>
-      <w:ins w:id="9" w:author="Elvis F. Elli" w:date="2026-06-08T10:37:00Z" w16du:dateUtc="2026-06-08T15:37:00Z">
+      <w:ins w:id="11" w:author="Elvis F. Elli" w:date="2026-06-08T10:37:00Z" w16du:dateUtc="2026-06-08T15:37:00Z">
         <w:r>
           <w:rPr>
             <w:rFonts w:ascii="Times New Roman" w:hAnsi="Times New Roman" w:cs="Times New Roman"/>
@@ -1552,7 +1572,7 @@
           <w:t xml:space="preserve"> </w:t>
         </w:r>
       </w:ins>
-      <w:ins w:id="10" w:author="Elvis F. Elli" w:date="2026-06-08T10:38:00Z" w16du:dateUtc="2026-06-08T15:38:00Z">
+      <w:ins w:id="12" w:author="Elvis F. Elli" w:date="2026-06-08T10:38:00Z" w16du:dateUtc="2026-06-08T15:38:00Z">
         <w:r>
           <w:rPr>
             <w:rFonts w:ascii="Times New Roman" w:hAnsi="Times New Roman" w:cs="Times New Roman"/>
@@ -1562,7 +1582,7 @@
           <w:t>yield penalty</w:t>
         </w:r>
       </w:ins>
-      <w:ins w:id="11" w:author="Elvis F. Elli" w:date="2026-06-08T11:40:00Z" w16du:dateUtc="2026-06-08T16:40:00Z">
+      <w:ins w:id="13" w:author="Elvis F. Elli" w:date="2026-06-08T11:40:00Z" w16du:dateUtc="2026-06-08T16:40:00Z">
         <w:r>
           <w:rPr>
             <w:rFonts w:ascii="Times New Roman" w:hAnsi="Times New Roman" w:cs="Times New Roman"/>
@@ -1598,7 +1618,7 @@
           </w:r>
         </w:sdtContent>
       </w:sdt>
-      <w:ins w:id="12" w:author="Elvis F. Elli" w:date="2026-06-08T10:35:00Z" w16du:dateUtc="2026-06-08T15:35:00Z">
+      <w:ins w:id="14" w:author="Elvis F. Elli" w:date="2026-06-08T10:35:00Z" w16du:dateUtc="2026-06-08T15:35:00Z">
         <w:r>
           <w:rPr>
             <w:rFonts w:ascii="Times New Roman" w:hAnsi="Times New Roman" w:cs="Times New Roman"/>
@@ -2151,7 +2171,7 @@
         </w:rPr>
         <w:t>recommendations.</w:t>
       </w:r>
-      <w:ins w:id="13" w:author="Elvis F. Elli" w:date="2026-06-09T10:58:00Z" w16du:dateUtc="2026-06-09T15:58:00Z">
+      <w:ins w:id="15" w:author="Elvis F. Elli" w:date="2026-06-09T10:58:00Z" w16du:dateUtc="2026-06-09T15:58:00Z">
         <w:r>
           <w:rPr>
             <w:rFonts w:ascii="Times New Roman" w:hAnsi="Times New Roman" w:cs="Times New Roman"/>
@@ -2167,13 +2187,13 @@
       <w:pPr>
         <w:spacing w:before="120" w:after="0" w:line="480" w:lineRule="auto"/>
         <w:rPr>
-          <w:ins w:id="14" w:author="Elvis F. Elli" w:date="2026-06-08T12:13:00Z" w16du:dateUtc="2026-06-08T17:13:00Z"/>
+          <w:ins w:id="16" w:author="Elvis F. Elli" w:date="2026-06-08T12:13:00Z" w16du:dateUtc="2026-06-08T17:13:00Z"/>
           <w:rFonts w:ascii="Times New Roman" w:hAnsi="Times New Roman" w:cs="Times New Roman"/>
           <w:sz w:val="24"/>
           <w:szCs w:val="24"/>
         </w:rPr>
       </w:pPr>
-      <w:ins w:id="15" w:author="Elvis F. Elli" w:date="2026-06-08T12:13:00Z" w16du:dateUtc="2026-06-08T17:13:00Z">
+      <w:ins w:id="17" w:author="Elvis F. Elli" w:date="2026-06-08T12:13:00Z" w16du:dateUtc="2026-06-08T17:13:00Z">
         <w:r>
           <w:rPr>
             <w:rFonts w:ascii="Times New Roman" w:hAnsi="Times New Roman" w:cs="Times New Roman"/>
@@ -2258,7 +2278,7 @@
           <w:t xml:space="preserve"> area </w:t>
         </w:r>
       </w:ins>
-      <w:customXmlInsRangeStart w:id="16" w:author="Elvis F. Elli" w:date="2026-06-08T12:13:00Z"/>
+      <w:customXmlInsRangeStart w:id="18" w:author="Elvis F. Elli" w:date="2026-06-08T12:13:00Z"/>
       <w:sdt>
         <w:sdtPr>
           <w:rPr>
@@ -2274,7 +2294,7 @@
           </w:placeholder>
         </w:sdtPr>
         <w:sdtContent>
-          <w:customXmlInsRangeEnd w:id="16"/>
+          <w:customXmlInsRangeEnd w:id="18"/>
           <w:r>
             <w:rPr>
               <w:rFonts w:ascii="Times New Roman" w:hAnsi="Times New Roman" w:cs="Times New Roman"/>
@@ -2284,11 +2304,11 @@
             </w:rPr>
             <w:t>(NASS, 2023)</w:t>
           </w:r>
-          <w:customXmlInsRangeStart w:id="17" w:author="Elvis F. Elli" w:date="2026-06-08T12:13:00Z"/>
+          <w:customXmlInsRangeStart w:id="19" w:author="Elvis F. Elli" w:date="2026-06-08T12:13:00Z"/>
         </w:sdtContent>
       </w:sdt>
-      <w:customXmlInsRangeEnd w:id="17"/>
-      <w:ins w:id="18" w:author="Elvis F. Elli" w:date="2026-06-08T12:13:00Z" w16du:dateUtc="2026-06-08T17:13:00Z">
+      <w:customXmlInsRangeEnd w:id="19"/>
+      <w:ins w:id="20" w:author="Elvis F. Elli" w:date="2026-06-08T12:13:00Z" w16du:dateUtc="2026-06-08T17:13:00Z">
         <w:r>
           <w:rPr>
             <w:rFonts w:ascii="Times New Roman" w:hAnsi="Times New Roman" w:cs="Times New Roman"/>
@@ -3782,7 +3802,35 @@
           <w:sz w:val="24"/>
           <w:szCs w:val="24"/>
         </w:rPr>
-        <w:t xml:space="preserve"> to define the simulation fields, which were resampled to a 2.5 km grid (~0.025°) and clipped to the </w:t>
+        <w:t xml:space="preserve"> to </w:t>
+      </w:r>
+      <w:ins w:id="21" w:author="Elvis F. Elli" w:date="2026-06-09T11:07:00Z" w16du:dateUtc="2026-06-09T16:07:00Z">
+        <w:r>
+          <w:rPr>
+            <w:rFonts w:ascii="Times New Roman" w:hAnsi="Times New Roman" w:cs="Times New Roman"/>
+            <w:sz w:val="24"/>
+            <w:szCs w:val="24"/>
+          </w:rPr>
+          <w:t>identify soybean-cropped pixels and define the spatial extent of the simulation fields</w:t>
+        </w:r>
+      </w:ins>
+      <w:del w:id="22" w:author="Elvis F. Elli" w:date="2026-06-09T11:07:00Z" w16du:dateUtc="2026-06-09T16:07:00Z">
+        <w:r>
+          <w:rPr>
+            <w:rFonts w:ascii="Times New Roman" w:hAnsi="Times New Roman" w:cs="Times New Roman"/>
+            <w:sz w:val="24"/>
+            <w:szCs w:val="24"/>
+          </w:rPr>
+          <w:delText>define the simulation fields</w:delText>
+        </w:r>
+      </w:del>
+      <w:r>
+        <w:rPr>
+          <w:rFonts w:ascii="Times New Roman" w:hAnsi="Times New Roman" w:cs="Times New Roman"/>
+          <w:sz w:val="24"/>
+          <w:szCs w:val="24"/>
+        </w:rPr>
+        <w:t xml:space="preserve">, which were resampled to a 2.5 km grid (~0.025°) and clipped to the </w:t>
       </w:r>
       <w:r>
         <w:rPr>
@@ -3800,6 +3848,24 @@
         </w:rPr>
         <w:t xml:space="preserve">state boundary. </w:t>
       </w:r>
+      <w:ins w:id="23" w:author="Elvis F. Elli" w:date="2026-06-09T11:08:00Z" w16du:dateUtc="2026-06-09T16:08:00Z">
+        <w:r>
+          <w:rPr>
+            <w:rFonts w:ascii="Times New Roman" w:hAnsi="Times New Roman" w:cs="Times New Roman"/>
+            <w:sz w:val="24"/>
+            <w:szCs w:val="24"/>
+          </w:rPr>
+          <w:t>Each grid cell classified as soybean cropland was treated as one simulation field.</w:t>
+        </w:r>
+        <w:r>
+          <w:rPr>
+            <w:rFonts w:ascii="Times New Roman" w:hAnsi="Times New Roman" w:cs="Times New Roman"/>
+            <w:sz w:val="24"/>
+            <w:szCs w:val="24"/>
+          </w:rPr>
+          <w:t xml:space="preserve"> </w:t>
+        </w:r>
+      </w:ins>
       <w:r>
         <w:rPr>
           <w:rFonts w:ascii="Times New Roman" w:hAnsi="Times New Roman" w:cs="Times New Roman"/>
@@ -4556,6 +4622,7 @@
           <w:sz w:val="24"/>
           <w:szCs w:val="24"/>
         </w:rPr>
+        <w:lastRenderedPageBreak/>
         <w:t xml:space="preserve">For the </w:t>
       </w:r>
       <w:r>
@@ -4714,7 +4781,6 @@
           <w:sz w:val="24"/>
           <w:szCs w:val="24"/>
         </w:rPr>
-        <w:lastRenderedPageBreak/>
         <w:t xml:space="preserve">elevated </w:t>
       </w:r>
       <w:r>
@@ -5010,7 +5076,60 @@
           <w:sz w:val="24"/>
           <w:szCs w:val="24"/>
         </w:rPr>
-        <w:t xml:space="preserve"> advancing sowing date </w:t>
+        <w:t xml:space="preserve"> </w:t>
+      </w:r>
+      <w:del w:id="24" w:author="Elvis F. Elli" w:date="2026-06-09T11:05:00Z" w16du:dateUtc="2026-06-09T16:05:00Z">
+        <w:r>
+          <w:rPr>
+            <w:rFonts w:ascii="Times New Roman" w:hAnsi="Times New Roman" w:cs="Times New Roman"/>
+            <w:color w:val="000000"/>
+            <w:sz w:val="24"/>
+            <w:szCs w:val="24"/>
+          </w:rPr>
+          <w:delText xml:space="preserve">advancing </w:delText>
+        </w:r>
+      </w:del>
+      <w:ins w:id="25" w:author="Elvis F. Elli" w:date="2026-06-09T11:05:00Z" w16du:dateUtc="2026-06-09T16:05:00Z">
+        <w:r>
+          <w:rPr>
+            <w:rFonts w:ascii="Times New Roman" w:hAnsi="Times New Roman" w:cs="Times New Roman"/>
+            <w:color w:val="000000"/>
+            <w:sz w:val="24"/>
+            <w:szCs w:val="24"/>
+          </w:rPr>
+          <w:t>ear</w:t>
+        </w:r>
+      </w:ins>
+      <w:ins w:id="26" w:author="Elvis F. Elli" w:date="2026-06-09T11:06:00Z" w16du:dateUtc="2026-06-09T16:06:00Z">
+        <w:r>
+          <w:rPr>
+            <w:rFonts w:ascii="Times New Roman" w:hAnsi="Times New Roman" w:cs="Times New Roman"/>
+            <w:color w:val="000000"/>
+            <w:sz w:val="24"/>
+            <w:szCs w:val="24"/>
+          </w:rPr>
+          <w:t>ly</w:t>
+        </w:r>
+      </w:ins>
+      <w:ins w:id="27" w:author="Elvis F. Elli" w:date="2026-06-09T11:05:00Z" w16du:dateUtc="2026-06-09T16:05:00Z">
+        <w:r>
+          <w:rPr>
+            <w:rFonts w:ascii="Times New Roman" w:hAnsi="Times New Roman" w:cs="Times New Roman"/>
+            <w:color w:val="000000"/>
+            <w:sz w:val="24"/>
+            <w:szCs w:val="24"/>
+          </w:rPr>
+          <w:t xml:space="preserve"> </w:t>
+        </w:r>
+      </w:ins>
+      <w:r>
+        <w:rPr>
+          <w:rFonts w:ascii="Times New Roman" w:hAnsi="Times New Roman" w:cs="Times New Roman"/>
+          <w:color w:val="000000"/>
+          <w:sz w:val="24"/>
+          <w:szCs w:val="24"/>
+        </w:rPr>
+        <w:t xml:space="preserve">sowing date </w:t>
       </w:r>
       <w:r>
         <w:rPr>
@@ -6166,7 +6285,16 @@
           <w:sz w:val="24"/>
           <w:szCs w:val="24"/>
         </w:rPr>
-        <w:t>combined elevated temperature and [</w:t>
+        <w:t xml:space="preserve">combined elevated </w:t>
+      </w:r>
+      <w:r>
+        <w:rPr>
+          <w:rFonts w:ascii="Times New Roman" w:hAnsi="Times New Roman" w:cs="Times New Roman"/>
+          <w:sz w:val="24"/>
+          <w:szCs w:val="24"/>
+        </w:rPr>
+        <w:lastRenderedPageBreak/>
+        <w:t>temperature and [</w:t>
       </w:r>
       <w:r>
         <w:rPr>
@@ -6344,12 +6472,11 @@
         <w:rPr>
           <w:noProof/>
         </w:rPr>
-        <w:lastRenderedPageBreak/>
         <w:drawing>
-          <wp:inline distT="0" distB="0" distL="0" distR="0" wp14:anchorId="4CDCFB3D" wp14:editId="315D3F76">
-            <wp:extent cx="5216056" cy="5216056"/>
-            <wp:effectExtent l="0" t="0" r="3810" b="3810"/>
-            <wp:docPr id="775348671" name="Picture 1"/>
+          <wp:inline distT="0" distB="0" distL="0" distR="0" wp14:anchorId="3C8BB195" wp14:editId="56A6BCAB">
+            <wp:extent cx="5943600" cy="2971800"/>
+            <wp:effectExtent l="0" t="0" r="0" b="0"/>
+            <wp:docPr id="1704136995" name="Picture 2"/>
             <wp:cNvGraphicFramePr>
               <a:graphicFrameLocks xmlns:a="http://schemas.openxmlformats.org/drawingml/2006/main" noChangeAspect="1"/>
             </wp:cNvGraphicFramePr>
@@ -6357,7 +6484,7 @@
               <a:graphicData uri="http://schemas.openxmlformats.org/drawingml/2006/picture">
                 <pic:pic xmlns:pic="http://schemas.openxmlformats.org/drawingml/2006/picture">
                   <pic:nvPicPr>
-                    <pic:cNvPr id="0" name="Picture 1"/>
+                    <pic:cNvPr id="0" name="Picture 6"/>
                     <pic:cNvPicPr>
                       <a:picLocks noChangeAspect="1" noChangeArrowheads="1"/>
                     </pic:cNvPicPr>
@@ -6378,7 +6505,7 @@
                   <pic:spPr bwMode="auto">
                     <a:xfrm>
                       <a:off x="0" y="0"/>
-                      <a:ext cx="5218610" cy="5218610"/>
+                      <a:ext cx="5943600" cy="2971800"/>
                     </a:xfrm>
                     <a:prstGeom prst="rect">
                       <a:avLst/>
@@ -6520,8 +6647,58 @@
           <w:sz w:val="24"/>
           <w:szCs w:val="24"/>
         </w:rPr>
-        <w:t>in the US Mid-South.</w:t>
-      </w:r>
+        <w:t>in the US Mid-South</w:t>
+      </w:r>
+      <w:ins w:id="28" w:author="Elvis F. Elli" w:date="2026-06-09T11:01:00Z" w16du:dateUtc="2026-06-09T16:01:00Z">
+        <w:r>
+          <w:rPr>
+            <w:rFonts w:ascii="Times New Roman" w:hAnsi="Times New Roman" w:cs="Times New Roman"/>
+            <w:sz w:val="24"/>
+            <w:szCs w:val="24"/>
+          </w:rPr>
+          <w:t xml:space="preserve"> (A), and their </w:t>
+        </w:r>
+        <w:r>
+          <w:rPr>
+            <w:rFonts w:ascii="Times New Roman" w:hAnsi="Times New Roman" w:cs="Times New Roman"/>
+          </w:rPr>
+          <w:t>g</w:t>
+        </w:r>
+        <w:r>
+          <w:rPr>
+            <w:rFonts w:ascii="Times New Roman" w:hAnsi="Times New Roman" w:cs="Times New Roman"/>
+          </w:rPr>
+          <w:t xml:space="preserve">eographical distribution </w:t>
+        </w:r>
+        <w:r>
+          <w:rPr>
+            <w:rFonts w:ascii="Times New Roman" w:hAnsi="Times New Roman" w:cs="Times New Roman"/>
+          </w:rPr>
+          <w:t>(B)</w:t>
+        </w:r>
+        <w:r>
+          <w:rPr>
+            <w:rFonts w:ascii="Times New Roman" w:hAnsi="Times New Roman" w:cs="Times New Roman"/>
+          </w:rPr>
+          <w:t>. Values per pixel in panel B are averages across 40 weather years.</w:t>
+        </w:r>
+        <w:r>
+          <w:rPr>
+            <w:rFonts w:ascii="Times New Roman" w:hAnsi="Times New Roman" w:cs="Times New Roman"/>
+          </w:rPr>
+          <w:t xml:space="preserve"> LM &amp; ES represent the combined effect of a late-maturing variety and early sowing.</w:t>
+        </w:r>
+      </w:ins>
+      <w:del w:id="29" w:author="Elvis F. Elli" w:date="2026-06-09T11:01:00Z" w16du:dateUtc="2026-06-09T16:01:00Z">
+        <w:r>
+          <w:rPr>
+            <w:rFonts w:ascii="Times New Roman" w:hAnsi="Times New Roman" w:cs="Times New Roman"/>
+            <w:sz w:val="24"/>
+            <w:szCs w:val="24"/>
+          </w:rPr>
+          <w:delText>.</w:delText>
+        </w:r>
+      </w:del>
     </w:p>
     <w:p>
       <w:pPr>
@@ -7131,22 +7308,34 @@
         </w:rPr>
         <w:t xml:space="preserve">, particularly those located in the central-north region (Figure </w:t>
       </w:r>
-      <w:r>
-        <w:rPr>
-          <w:rFonts w:ascii="Times New Roman" w:hAnsi="Times New Roman" w:cs="Times New Roman"/>
-          <w:sz w:val="24"/>
-          <w:szCs w:val="24"/>
-        </w:rPr>
-        <w:t>S</w:t>
-      </w:r>
-      <w:r>
-        <w:rPr>
-          <w:rFonts w:ascii="Times New Roman" w:hAnsi="Times New Roman" w:cs="Times New Roman"/>
-          <w:sz w:val="24"/>
-          <w:szCs w:val="24"/>
-        </w:rPr>
-        <w:t>5</w:t>
-      </w:r>
+      <w:del w:id="30" w:author="Elvis F. Elli" w:date="2026-06-09T11:02:00Z" w16du:dateUtc="2026-06-09T16:02:00Z">
+        <w:r>
+          <w:rPr>
+            <w:rFonts w:ascii="Times New Roman" w:hAnsi="Times New Roman" w:cs="Times New Roman"/>
+            <w:sz w:val="24"/>
+            <w:szCs w:val="24"/>
+          </w:rPr>
+          <w:delText>S</w:delText>
+        </w:r>
+        <w:r>
+          <w:rPr>
+            <w:rFonts w:ascii="Times New Roman" w:hAnsi="Times New Roman" w:cs="Times New Roman"/>
+            <w:sz w:val="24"/>
+            <w:szCs w:val="24"/>
+          </w:rPr>
+          <w:delText>5</w:delText>
+        </w:r>
+      </w:del>
+      <w:ins w:id="31" w:author="Elvis F. Elli" w:date="2026-06-09T11:02:00Z" w16du:dateUtc="2026-06-09T16:02:00Z">
+        <w:r>
+          <w:rPr>
+            <w:rFonts w:ascii="Times New Roman" w:hAnsi="Times New Roman" w:cs="Times New Roman"/>
+            <w:sz w:val="24"/>
+            <w:szCs w:val="24"/>
+          </w:rPr>
+          <w:t>1B</w:t>
+        </w:r>
+      </w:ins>
       <w:r>
         <w:rPr>
           <w:rFonts w:ascii="Times New Roman" w:hAnsi="Times New Roman" w:cs="Times New Roman"/>
@@ -7801,7 +7990,7 @@
         </w:rPr>
         <w:t xml:space="preserve">. </w:t>
       </w:r>
-      <w:ins w:id="19" w:author="Elvis F. Elli" w:date="2026-06-08T12:30:00Z" w16du:dateUtc="2026-06-08T17:30:00Z">
+      <w:ins w:id="32" w:author="Elvis F. Elli" w:date="2026-06-08T12:30:00Z" w16du:dateUtc="2026-06-08T17:30:00Z">
         <w:r>
           <w:rPr>
             <w:rFonts w:ascii="Times New Roman" w:hAnsi="Times New Roman" w:cs="Times New Roman"/>
@@ -7835,7 +8024,7 @@
           <w:t xml:space="preserve"> </w:t>
         </w:r>
       </w:ins>
-      <w:customXmlInsRangeStart w:id="20" w:author="Elvis F. Elli" w:date="2026-06-08T12:30:00Z"/>
+      <w:customXmlInsRangeStart w:id="33" w:author="Elvis F. Elli" w:date="2026-06-08T12:30:00Z"/>
       <w:sdt>
         <w:sdtPr>
           <w:rPr>
@@ -7851,7 +8040,7 @@
           </w:placeholder>
         </w:sdtPr>
         <w:sdtContent>
-          <w:customXmlInsRangeEnd w:id="20"/>
+          <w:customXmlInsRangeEnd w:id="33"/>
           <w:r>
             <w:rPr>
               <w:rFonts w:ascii="Times New Roman" w:hAnsi="Times New Roman" w:cs="Times New Roman"/>
@@ -7861,11 +8050,11 @@
             </w:rPr>
             <w:t>(Elli et al., 2022; Nendel et al., 2023)</w:t>
           </w:r>
-          <w:customXmlInsRangeStart w:id="21" w:author="Elvis F. Elli" w:date="2026-06-08T12:30:00Z"/>
+          <w:customXmlInsRangeStart w:id="34" w:author="Elvis F. Elli" w:date="2026-06-08T12:30:00Z"/>
         </w:sdtContent>
       </w:sdt>
-      <w:customXmlInsRangeEnd w:id="21"/>
-      <w:ins w:id="22" w:author="Elvis F. Elli" w:date="2026-06-08T12:30:00Z" w16du:dateUtc="2026-06-08T17:30:00Z">
+      <w:customXmlInsRangeEnd w:id="34"/>
+      <w:ins w:id="35" w:author="Elvis F. Elli" w:date="2026-06-08T12:30:00Z" w16du:dateUtc="2026-06-08T17:30:00Z">
         <w:r>
           <w:rPr>
             <w:rFonts w:ascii="Times New Roman" w:hAnsi="Times New Roman" w:cs="Times New Roman"/>
@@ -8245,7 +8434,7 @@
         </w:rPr>
         <w:t xml:space="preserve">. </w:t>
       </w:r>
-      <w:ins w:id="23" w:author="Elvis F. Elli" w:date="2026-06-08T12:31:00Z" w16du:dateUtc="2026-06-08T17:31:00Z">
+      <w:ins w:id="36" w:author="Elvis F. Elli" w:date="2026-06-08T12:31:00Z" w16du:dateUtc="2026-06-08T17:31:00Z">
         <w:r>
           <w:rPr>
             <w:rFonts w:ascii="Times New Roman" w:hAnsi="Times New Roman" w:cs="Times New Roman"/>
@@ -9789,14 +9978,130 @@
         </w:rPr>
         <w:t xml:space="preserve">for sustaining soybean seed yields under </w:t>
       </w:r>
-      <w:r>
-        <w:rPr>
-          <w:rFonts w:ascii="Times New Roman" w:hAnsi="Times New Roman" w:cs="Times New Roman"/>
-          <w:sz w:val="24"/>
-          <w:szCs w:val="24"/>
-        </w:rPr>
-        <w:t>high temperature risks</w:t>
-      </w:r>
+      <w:proofErr w:type="spellStart"/>
+      <w:r>
+        <w:rPr>
+          <w:rFonts w:ascii="Times New Roman" w:hAnsi="Times New Roman" w:cs="Times New Roman"/>
+          <w:sz w:val="24"/>
+          <w:szCs w:val="24"/>
+        </w:rPr>
+        <w:t>high</w:t>
+      </w:r>
+      <w:del w:id="37" w:author="Elvis F. Elli" w:date="2026-06-09T11:14:00Z" w16du:dateUtc="2026-06-09T16:14:00Z">
+        <w:r>
+          <w:rPr>
+            <w:rFonts w:ascii="Times New Roman" w:hAnsi="Times New Roman" w:cs="Times New Roman"/>
+            <w:sz w:val="24"/>
+            <w:szCs w:val="24"/>
+          </w:rPr>
+          <w:delText xml:space="preserve"> </w:delText>
+        </w:r>
+      </w:del>
+      <w:r>
+        <w:rPr>
+          <w:rFonts w:ascii="Times New Roman" w:hAnsi="Times New Roman" w:cs="Times New Roman"/>
+          <w:sz w:val="24"/>
+          <w:szCs w:val="24"/>
+        </w:rPr>
+        <w:t>temperature</w:t>
+      </w:r>
+      <w:proofErr w:type="spellEnd"/>
+      <w:r>
+        <w:rPr>
+          <w:rFonts w:ascii="Times New Roman" w:hAnsi="Times New Roman" w:cs="Times New Roman"/>
+          <w:sz w:val="24"/>
+          <w:szCs w:val="24"/>
+        </w:rPr>
+        <w:t xml:space="preserve"> risks</w:t>
+      </w:r>
+      <w:ins w:id="38" w:author="Elvis F. Elli" w:date="2026-06-09T11:13:00Z" w16du:dateUtc="2026-06-09T16:13:00Z">
+        <w:r>
+          <w:rPr>
+            <w:rFonts w:ascii="Times New Roman" w:hAnsi="Times New Roman" w:cs="Times New Roman"/>
+            <w:sz w:val="24"/>
+            <w:szCs w:val="24"/>
+          </w:rPr>
+          <w:t xml:space="preserve">, </w:t>
+        </w:r>
+        <w:r>
+          <w:rPr>
+            <w:rFonts w:ascii="Times New Roman" w:hAnsi="Times New Roman" w:cs="Times New Roman"/>
+            <w:sz w:val="24"/>
+            <w:szCs w:val="24"/>
+          </w:rPr>
+          <w:t xml:space="preserve">providing </w:t>
+        </w:r>
+      </w:ins>
+      <w:ins w:id="39" w:author="Elvis F. Elli" w:date="2026-06-09T11:14:00Z" w16du:dateUtc="2026-06-09T16:14:00Z">
+        <w:r>
+          <w:rPr>
+            <w:rFonts w:ascii="Times New Roman" w:hAnsi="Times New Roman" w:cs="Times New Roman"/>
+            <w:sz w:val="24"/>
+            <w:szCs w:val="24"/>
+          </w:rPr>
+          <w:t xml:space="preserve">new </w:t>
+        </w:r>
+      </w:ins>
+      <w:ins w:id="40" w:author="Elvis F. Elli" w:date="2026-06-09T11:13:00Z" w16du:dateUtc="2026-06-09T16:13:00Z">
+        <w:r>
+          <w:rPr>
+            <w:rFonts w:ascii="Times New Roman" w:hAnsi="Times New Roman" w:cs="Times New Roman"/>
+            <w:sz w:val="24"/>
+            <w:szCs w:val="24"/>
+          </w:rPr>
+          <w:t xml:space="preserve">quantitative </w:t>
+        </w:r>
+      </w:ins>
+      <w:ins w:id="41" w:author="Elvis F. Elli" w:date="2026-06-09T11:14:00Z" w16du:dateUtc="2026-06-09T16:14:00Z">
+        <w:r>
+          <w:rPr>
+            <w:rFonts w:ascii="Times New Roman" w:hAnsi="Times New Roman" w:cs="Times New Roman"/>
+            <w:sz w:val="24"/>
+            <w:szCs w:val="24"/>
+          </w:rPr>
+          <w:t xml:space="preserve">evidence </w:t>
+        </w:r>
+      </w:ins>
+      <w:ins w:id="42" w:author="Elvis F. Elli" w:date="2026-06-09T11:13:00Z" w16du:dateUtc="2026-06-09T16:13:00Z">
+        <w:r>
+          <w:rPr>
+            <w:rFonts w:ascii="Times New Roman" w:hAnsi="Times New Roman" w:cs="Times New Roman"/>
+            <w:sz w:val="24"/>
+            <w:szCs w:val="24"/>
+          </w:rPr>
+          <w:t xml:space="preserve">for the irrigated Arkansas delta that </w:t>
+        </w:r>
+      </w:ins>
+      <w:ins w:id="43" w:author="Elvis F. Elli" w:date="2026-06-09T11:15:00Z" w16du:dateUtc="2026-06-09T16:15:00Z">
+        <w:r>
+          <w:rPr>
+            <w:rFonts w:ascii="Times New Roman" w:hAnsi="Times New Roman" w:cs="Times New Roman"/>
+            <w:sz w:val="24"/>
+            <w:szCs w:val="24"/>
+          </w:rPr>
+          <w:t>extends</w:t>
+        </w:r>
+      </w:ins>
+      <w:ins w:id="44" w:author="Elvis F. Elli" w:date="2026-06-09T11:13:00Z" w16du:dateUtc="2026-06-09T16:13:00Z">
+        <w:r>
+          <w:rPr>
+            <w:rFonts w:ascii="Times New Roman" w:hAnsi="Times New Roman" w:cs="Times New Roman"/>
+            <w:sz w:val="24"/>
+            <w:szCs w:val="24"/>
+          </w:rPr>
+          <w:t xml:space="preserve"> </w:t>
+        </w:r>
+      </w:ins>
+      <w:ins w:id="45" w:author="Elvis F. Elli" w:date="2026-06-09T11:14:00Z" w16du:dateUtc="2026-06-09T16:14:00Z">
+        <w:r>
+          <w:rPr>
+            <w:rFonts w:ascii="Times New Roman" w:hAnsi="Times New Roman" w:cs="Times New Roman"/>
+            <w:sz w:val="24"/>
+            <w:szCs w:val="24"/>
+          </w:rPr>
+          <w:t>existing literature</w:t>
+        </w:r>
+      </w:ins>
       <w:r>
         <w:rPr>
           <w:rFonts w:ascii="Times New Roman" w:hAnsi="Times New Roman" w:cs="Times New Roman"/>
@@ -10295,7 +10600,14 @@
         <w:rPr>
           <w:szCs w:val="24"/>
         </w:rPr>
-        <w:t xml:space="preserve">Writing - review &amp; editing; </w:t>
+        <w:t xml:space="preserve">Writing - review &amp; </w:t>
+      </w:r>
+      <w:r>
+        <w:rPr>
+          <w:szCs w:val="24"/>
+        </w:rPr>
+        <w:lastRenderedPageBreak/>
+        <w:t xml:space="preserve">editing; </w:t>
       </w:r>
       <w:r>
         <w:rPr>
@@ -10337,7 +10649,6 @@
         <w:rPr>
           <w:szCs w:val="24"/>
         </w:rPr>
-        <w:lastRenderedPageBreak/>
         <w:t>Acknowledgments</w:t>
       </w:r>
     </w:p>
@@ -10701,7 +11012,16 @@
           <w:sz w:val="24"/>
           <w:szCs w:val="24"/>
         </w:rPr>
-        <w:t xml:space="preserve"> Environmental characterization of baseline conditions across all studied site-years (A) and number of calendar days to flower under baseline and the 2°C temperature increase scenario (B). Panel A contains the APSIM phenology response curve (0-1), where 1 represents maximum development rate. The solid vertical and horizontal lines indicate the median growing-season average temperature and total growing-season precipitation, respectively.</w:t>
+        <w:t xml:space="preserve"> Environmental characterization of baseline conditions across all studied site-years (A) and number of calendar days to flower under baseline and the 2°C temperature increase scenario (B). Panel A contains the APSIM phenology response curve (0-1), where 1 represents </w:t>
+      </w:r>
+      <w:r>
+        <w:rPr>
+          <w:rFonts w:ascii="Times New Roman" w:hAnsi="Times New Roman" w:cs="Times New Roman"/>
+          <w:sz w:val="24"/>
+          <w:szCs w:val="24"/>
+        </w:rPr>
+        <w:lastRenderedPageBreak/>
+        <w:t>maximum development rate. The solid vertical and horizontal lines indicate the median growing-season average temperature and total growing-season precipitation, respectively.</w:t>
       </w:r>
     </w:p>
     <w:p>
@@ -10721,7 +11041,6 @@
           <w:sz w:val="24"/>
           <w:szCs w:val="24"/>
         </w:rPr>
-        <w:lastRenderedPageBreak/>
         <w:t>Figure S4.</w:t>
       </w:r>
       <w:r>
@@ -11115,6 +11434,7 @@
           <w:sz w:val="24"/>
           <w:szCs w:val="24"/>
         </w:rPr>
+        <w:lastRenderedPageBreak/>
         <w:t xml:space="preserve">Archontoulis, S. V., Castellano, M. J., Licht, M. A., Nichols, V., Baum, M., Huber, I., Martinez-Feria, R., Puntel, L., Ordóñez, R. A., Iqbal, J., Wright, E. E., Dietzel, R. N., Helmers, M., Vanloocke, A., Liebman, M., Hatfield, J. L., </w:t>
       </w:r>
       <w:proofErr w:type="spellStart"/>
@@ -11133,16 +11453,7 @@
           <w:sz w:val="24"/>
           <w:szCs w:val="24"/>
         </w:rPr>
-        <w:t xml:space="preserve">, D., Cordova, S. C., Edmonds, P., &amp; </w:t>
-      </w:r>
-      <w:r>
-        <w:rPr>
-          <w:rFonts w:ascii="Times New Roman" w:hAnsi="Times New Roman" w:cs="Times New Roman"/>
-          <w:sz w:val="24"/>
-          <w:szCs w:val="24"/>
-        </w:rPr>
-        <w:lastRenderedPageBreak/>
-        <w:t xml:space="preserve">Togliatti, K. (2020). Predicting crop yields and soil‐plant nitrogen dynamics in the US Corn Belt. </w:t>
+        <w:t xml:space="preserve">, D., Cordova, S. C., Edmonds, P., &amp; Togliatti, K. (2020). Predicting crop yields and soil‐plant nitrogen dynamics in the US Corn Belt. </w:t>
       </w:r>
       <w:r>
         <w:rPr>
@@ -11506,25 +11817,7 @@
           <w:sz w:val="24"/>
           <w:szCs w:val="24"/>
         </w:rPr>
-        <w:t xml:space="preserve">, N., Price, J., &amp; Warren, R. (2014). Global </w:t>
-      </w:r>
-      <w:proofErr w:type="gramStart"/>
-      <w:r>
-        <w:rPr>
-          <w:rFonts w:ascii="Times New Roman" w:hAnsi="Times New Roman" w:cs="Times New Roman"/>
-          <w:sz w:val="24"/>
-          <w:szCs w:val="24"/>
-        </w:rPr>
-        <w:t>crop</w:t>
-      </w:r>
-      <w:proofErr w:type="gramEnd"/>
-      <w:r>
-        <w:rPr>
-          <w:rFonts w:ascii="Times New Roman" w:hAnsi="Times New Roman" w:cs="Times New Roman"/>
-          <w:sz w:val="24"/>
-          <w:szCs w:val="24"/>
-        </w:rPr>
-        <w:t xml:space="preserve"> yield response to extreme heat stress under multiple climate change futures. </w:t>
+        <w:t xml:space="preserve">, N., Price, J., &amp; Warren, R. (2014). Global crop yield response to extreme heat stress under multiple climate change futures. </w:t>
       </w:r>
       <w:r>
         <w:rPr>
@@ -11674,6 +11967,7 @@
           <w:sz w:val="24"/>
           <w:szCs w:val="24"/>
         </w:rPr>
+        <w:lastRenderedPageBreak/>
         <w:t xml:space="preserve">Edwards, J. T., Purcell, L. C., Vories, E. D., Shannon, J. G., &amp; Ashlock, L. O. (2003). Short-season soybean cultivars have similar yields with less irrigation than longer-season cultivars. </w:t>
       </w:r>
       <w:r>
@@ -11740,7 +12034,6 @@
           <w:sz w:val="24"/>
           <w:szCs w:val="24"/>
         </w:rPr>
-        <w:lastRenderedPageBreak/>
         <w:t xml:space="preserve">Elli, E. F., &amp; Archontoulis, S. V. (2023). Dissecting the contribution of weather and management on water table dynamics under present and future climate scenarios in the US Corn Belt. </w:t>
       </w:r>
       <w:r>
@@ -11927,25 +12220,7 @@
           <w:sz w:val="24"/>
           <w:szCs w:val="24"/>
         </w:rPr>
-        <w:t xml:space="preserve"> a </w:t>
-      </w:r>
-      <w:proofErr w:type="gramStart"/>
-      <w:r>
-        <w:rPr>
-          <w:rFonts w:ascii="Times New Roman" w:hAnsi="Times New Roman" w:cs="Times New Roman"/>
-          <w:sz w:val="24"/>
-          <w:szCs w:val="24"/>
-        </w:rPr>
-        <w:t>farming systems model</w:t>
-      </w:r>
-      <w:proofErr w:type="gramEnd"/>
-      <w:r>
-        <w:rPr>
-          <w:rFonts w:ascii="Times New Roman" w:hAnsi="Times New Roman" w:cs="Times New Roman"/>
-          <w:sz w:val="24"/>
-          <w:szCs w:val="24"/>
-        </w:rPr>
-        <w:t xml:space="preserve">. </w:t>
+        <w:t xml:space="preserve"> a farming systems model. </w:t>
       </w:r>
       <w:r>
         <w:rPr>
@@ -12113,6 +12388,7 @@
           <w:sz w:val="24"/>
           <w:szCs w:val="24"/>
         </w:rPr>
+        <w:lastRenderedPageBreak/>
         <w:t xml:space="preserve">Kothari, K., Battisti, R., Boote, K. J., Archontoulis, S. V., Confalone, A., Constantin, J., Cuadra, S. V., Debaeke, P., Faye, B., Grant, B., Hoogenboom, G., Jing, Q., van der Laan, M., da Silva, F. A. M., Marin, F. R., </w:t>
       </w:r>
       <w:proofErr w:type="spellStart"/>
@@ -12140,7 +12416,6 @@
           <w:sz w:val="24"/>
           <w:szCs w:val="24"/>
         </w:rPr>
-        <w:lastRenderedPageBreak/>
         <w:t>Schoving</w:t>
       </w:r>
       <w:proofErr w:type="spellEnd"/>
@@ -12582,25 +12857,16 @@
           <w:sz w:val="24"/>
           <w:szCs w:val="24"/>
         </w:rPr>
-        <w:t xml:space="preserve">, C., Stella, T., &amp; Battisti, R. (2023). Future area expansion outweighs increasing drought risk for </w:t>
-      </w:r>
-      <w:proofErr w:type="gramStart"/>
-      <w:r>
-        <w:rPr>
-          <w:rFonts w:ascii="Times New Roman" w:hAnsi="Times New Roman" w:cs="Times New Roman"/>
-          <w:sz w:val="24"/>
-          <w:szCs w:val="24"/>
-        </w:rPr>
-        <w:t>soybean</w:t>
-      </w:r>
-      <w:proofErr w:type="gramEnd"/>
-      <w:r>
-        <w:rPr>
-          <w:rFonts w:ascii="Times New Roman" w:hAnsi="Times New Roman" w:cs="Times New Roman"/>
-          <w:sz w:val="24"/>
-          <w:szCs w:val="24"/>
-        </w:rPr>
-        <w:t xml:space="preserve"> in Europe. </w:t>
+        <w:t xml:space="preserve">, C., Stella, T., &amp; Battisti, R. (2023). Future area expansion outweighs increasing drought risk </w:t>
+      </w:r>
+      <w:r>
+        <w:rPr>
+          <w:rFonts w:ascii="Times New Roman" w:hAnsi="Times New Roman" w:cs="Times New Roman"/>
+          <w:sz w:val="24"/>
+          <w:szCs w:val="24"/>
+        </w:rPr>
+        <w:lastRenderedPageBreak/>
+        <w:t xml:space="preserve">for soybean in Europe. </w:t>
       </w:r>
       <w:r>
         <w:rPr>
@@ -12730,7 +12996,6 @@
           <w:sz w:val="24"/>
           <w:szCs w:val="24"/>
         </w:rPr>
-        <w:lastRenderedPageBreak/>
         <w:t xml:space="preserve">Richetti, J., </w:t>
       </w:r>
       <w:proofErr w:type="spellStart"/>
@@ -13139,6 +13404,7 @@
           <w:sz w:val="24"/>
           <w:szCs w:val="24"/>
         </w:rPr>
+        <w:lastRenderedPageBreak/>
         <w:t xml:space="preserve">Salmerón, M., &amp; Purcell, L. C. (2016). Simplifying the prediction of phenology with the DSSAT-CROPGRO-soybean model based on relative maturity group and determinacy. </w:t>
       </w:r>
       <w:r>
@@ -13242,7 +13508,6 @@
           <w:sz w:val="24"/>
           <w:szCs w:val="24"/>
         </w:rPr>
-        <w:lastRenderedPageBreak/>
         <w:t xml:space="preserve">Thornton, P. K., Ericksen, P. J., Herrero, M., &amp; Challinor, A. J. (2014). Climate variability and vulnerability to climate change: A review. </w:t>
       </w:r>
       <w:r>
@@ -15326,6 +15591,7 @@
     <w:rsid w:val="006527C5"/>
     <w:rsid w:val="006670BA"/>
     <w:rsid w:val="006D4EE0"/>
+    <w:rsid w:val="0072051F"/>
     <w:rsid w:val="007426A6"/>
     <w:rsid w:val="007E7425"/>
     <w:rsid w:val="00820B2A"/>
@@ -15347,6 +15613,7 @@
     <w:rsid w:val="00B104B2"/>
     <w:rsid w:val="00B945B0"/>
     <w:rsid w:val="00CD6D94"/>
+    <w:rsid w:val="00D80035"/>
     <w:rsid w:val="00DB5EA0"/>
     <w:rsid w:val="00DC5C2A"/>
     <w:rsid w:val="00E02C7D"/>
@@ -15355,6 +15622,7 @@
     <w:rsid w:val="00E91A2E"/>
     <w:rsid w:val="00E947C7"/>
     <w:rsid w:val="00EC677C"/>
+    <w:rsid w:val="00F41BF7"/>
     <w:rsid w:val="00F459E4"/>
     <w:rsid w:val="00F471E8"/>
     <w:rsid w:val="00F92F05"/>

</xml_diff>

<commit_message>
Update manuscript and supplementary files
Update main manuscript (paper/paper-04-01-2026.docx) and supplementary material (paper/supp-mat-04-01-26.docx). A temporary Office lock file (paper/~$pp-mat-04-01-26.docx) was also added—likely accidental; consider removing it from the commit and adding a rule to ignore transient Office files.
</commit_message>
<xml_diff>
--- a/paper/paper-04-01-2026.docx
+++ b/paper/paper-04-01-2026.docx
@@ -4373,25 +4373,7 @@
           <w:sz w:val="24"/>
           <w:szCs w:val="24"/>
         </w:rPr>
-        <w:t>he sowing date was May 15, an average value for the studied region based on USDA-</w:t>
-      </w:r>
-      <w:proofErr w:type="gramStart"/>
-      <w:r>
-        <w:rPr>
-          <w:rFonts w:ascii="Times New Roman" w:hAnsi="Times New Roman" w:cs="Times New Roman"/>
-          <w:sz w:val="24"/>
-          <w:szCs w:val="24"/>
-        </w:rPr>
-        <w:t>NASS</w:t>
-      </w:r>
-      <w:proofErr w:type="gramEnd"/>
-      <w:r>
-        <w:rPr>
-          <w:rFonts w:ascii="Times New Roman" w:hAnsi="Times New Roman" w:cs="Times New Roman"/>
-          <w:sz w:val="24"/>
-          <w:szCs w:val="24"/>
-        </w:rPr>
-        <w:t xml:space="preserve"> 50% sowing progress</w:t>
+        <w:t>he sowing date was May 15, an average value for the studied region based on USDA-NASS 50% sowing progress</w:t>
       </w:r>
       <w:r>
         <w:rPr>
@@ -6705,187 +6687,205 @@
         <w:spacing w:before="120" w:after="0" w:line="480" w:lineRule="auto"/>
         <w:jc w:val="center"/>
         <w:rPr>
+          <w:ins w:id="30" w:author="Elvis F. Elli" w:date="2026-06-11T10:26:00Z" w16du:dateUtc="2026-06-11T15:26:00Z"/>
           <w:rFonts w:ascii="Times New Roman" w:hAnsi="Times New Roman" w:cs="Times New Roman"/>
           <w:sz w:val="24"/>
           <w:szCs w:val="24"/>
         </w:rPr>
       </w:pPr>
-      <w:r>
-        <w:rPr>
-          <w:noProof/>
-        </w:rPr>
-        <w:lastRenderedPageBreak/>
-        <w:drawing>
-          <wp:inline distT="0" distB="0" distL="0" distR="0" wp14:anchorId="65F71681" wp14:editId="700D07F2">
-            <wp:extent cx="5758336" cy="4600575"/>
-            <wp:effectExtent l="0" t="0" r="0" b="0"/>
-            <wp:docPr id="2111182142" name="Picture 2"/>
-            <wp:cNvGraphicFramePr>
-              <a:graphicFrameLocks xmlns:a="http://schemas.openxmlformats.org/drawingml/2006/main" noChangeAspect="1"/>
-            </wp:cNvGraphicFramePr>
-            <a:graphic xmlns:a="http://schemas.openxmlformats.org/drawingml/2006/main">
-              <a:graphicData uri="http://schemas.openxmlformats.org/drawingml/2006/picture">
-                <pic:pic xmlns:pic="http://schemas.openxmlformats.org/drawingml/2006/picture">
-                  <pic:nvPicPr>
-                    <pic:cNvPr id="0" name="Picture 3"/>
-                    <pic:cNvPicPr>
-                      <a:picLocks noChangeAspect="1" noChangeArrowheads="1"/>
-                    </pic:cNvPicPr>
-                  </pic:nvPicPr>
-                  <pic:blipFill>
-                    <a:blip r:embed="rId8" cstate="print">
-                      <a:extLst>
-                        <a:ext uri="{28A0092B-C50C-407E-A947-70E740481C1C}">
-                          <a14:useLocalDpi xmlns:a14="http://schemas.microsoft.com/office/drawing/2010/main" val="0"/>
-                        </a:ext>
-                      </a:extLst>
-                    </a:blip>
-                    <a:srcRect/>
-                    <a:stretch>
-                      <a:fillRect/>
-                    </a:stretch>
-                  </pic:blipFill>
-                  <pic:spPr bwMode="auto">
-                    <a:xfrm>
-                      <a:off x="0" y="0"/>
-                      <a:ext cx="5759447" cy="4601463"/>
-                    </a:xfrm>
-                    <a:prstGeom prst="rect">
-                      <a:avLst/>
-                    </a:prstGeom>
-                    <a:noFill/>
-                    <a:ln>
+      <w:ins w:id="31" w:author="Elvis F. Elli" w:date="2026-06-11T10:26:00Z" w16du:dateUtc="2026-06-11T15:26:00Z">
+        <w:r>
+          <w:rPr>
+            <w:noProof/>
+          </w:rPr>
+          <w:lastRenderedPageBreak/>
+          <w:drawing>
+            <wp:inline distT="0" distB="0" distL="0" distR="0" wp14:anchorId="4875EBB1" wp14:editId="72403808">
+              <wp:extent cx="5943600" cy="5943600"/>
+              <wp:effectExtent l="0" t="0" r="0" b="0"/>
+              <wp:docPr id="1676974733" name="Picture 2"/>
+              <wp:cNvGraphicFramePr>
+                <a:graphicFrameLocks xmlns:a="http://schemas.openxmlformats.org/drawingml/2006/main" noChangeAspect="1"/>
+              </wp:cNvGraphicFramePr>
+              <a:graphic xmlns:a="http://schemas.openxmlformats.org/drawingml/2006/main">
+                <a:graphicData uri="http://schemas.openxmlformats.org/drawingml/2006/picture">
+                  <pic:pic xmlns:pic="http://schemas.openxmlformats.org/drawingml/2006/picture">
+                    <pic:nvPicPr>
+                      <pic:cNvPr id="0" name="Picture 3"/>
+                      <pic:cNvPicPr>
+                        <a:picLocks noChangeAspect="1" noChangeArrowheads="1"/>
+                      </pic:cNvPicPr>
+                    </pic:nvPicPr>
+                    <pic:blipFill>
+                      <a:blip r:embed="rId8" cstate="print">
+                        <a:extLst>
+                          <a:ext uri="{28A0092B-C50C-407E-A947-70E740481C1C}">
+                            <a14:useLocalDpi xmlns:a14="http://schemas.microsoft.com/office/drawing/2010/main" val="0"/>
+                          </a:ext>
+                        </a:extLst>
+                      </a:blip>
+                      <a:srcRect/>
+                      <a:stretch>
+                        <a:fillRect/>
+                      </a:stretch>
+                    </pic:blipFill>
+                    <pic:spPr bwMode="auto">
+                      <a:xfrm>
+                        <a:off x="0" y="0"/>
+                        <a:ext cx="5943600" cy="5943600"/>
+                      </a:xfrm>
+                      <a:prstGeom prst="rect">
+                        <a:avLst/>
+                      </a:prstGeom>
                       <a:noFill/>
-                    </a:ln>
-                  </pic:spPr>
-                </pic:pic>
-              </a:graphicData>
-            </a:graphic>
-          </wp:inline>
-        </w:drawing>
-      </w:r>
+                      <a:ln>
+                        <a:noFill/>
+                      </a:ln>
+                    </pic:spPr>
+                  </pic:pic>
+                </a:graphicData>
+              </a:graphic>
+            </wp:inline>
+          </w:drawing>
+        </w:r>
+      </w:ins>
     </w:p>
     <w:p>
       <w:pPr>
         <w:spacing w:before="120" w:after="0" w:line="480" w:lineRule="auto"/>
         <w:rPr>
+          <w:ins w:id="32" w:author="Elvis F. Elli" w:date="2026-06-11T10:26:00Z" w16du:dateUtc="2026-06-11T15:26:00Z"/>
           <w:rFonts w:ascii="Times New Roman" w:hAnsi="Times New Roman" w:cs="Times New Roman"/>
           <w:sz w:val="24"/>
           <w:szCs w:val="24"/>
         </w:rPr>
       </w:pPr>
-      <w:r>
-        <w:rPr>
-          <w:rFonts w:ascii="Times New Roman" w:hAnsi="Times New Roman" w:cs="Times New Roman"/>
-          <w:b/>
-          <w:bCs/>
-          <w:sz w:val="24"/>
-          <w:szCs w:val="24"/>
-        </w:rPr>
-        <w:t xml:space="preserve">Figure </w:t>
-      </w:r>
-      <w:r>
-        <w:rPr>
-          <w:rFonts w:ascii="Times New Roman" w:hAnsi="Times New Roman" w:cs="Times New Roman"/>
-          <w:b/>
-          <w:bCs/>
-          <w:sz w:val="24"/>
-          <w:szCs w:val="24"/>
-        </w:rPr>
-        <w:t>2</w:t>
-      </w:r>
-      <w:r>
-        <w:rPr>
-          <w:rFonts w:ascii="Times New Roman" w:hAnsi="Times New Roman" w:cs="Times New Roman"/>
-          <w:b/>
-          <w:bCs/>
-          <w:sz w:val="24"/>
-          <w:szCs w:val="24"/>
-        </w:rPr>
-        <w:t>.</w:t>
-      </w:r>
-      <w:r>
-        <w:rPr>
-          <w:rFonts w:ascii="Times New Roman" w:hAnsi="Times New Roman" w:cs="Times New Roman"/>
-          <w:sz w:val="24"/>
-          <w:szCs w:val="24"/>
-        </w:rPr>
-        <w:t xml:space="preserve"> Relationship between season temperature</w:t>
-      </w:r>
-      <w:r>
-        <w:rPr>
-          <w:rFonts w:ascii="Times New Roman" w:hAnsi="Times New Roman" w:cs="Times New Roman"/>
-          <w:sz w:val="24"/>
-          <w:szCs w:val="24"/>
-        </w:rPr>
-        <w:t xml:space="preserve"> (May-October)</w:t>
-      </w:r>
-      <w:r>
-        <w:rPr>
-          <w:rFonts w:ascii="Times New Roman" w:hAnsi="Times New Roman" w:cs="Times New Roman"/>
-          <w:sz w:val="24"/>
-          <w:szCs w:val="24"/>
-        </w:rPr>
-        <w:t xml:space="preserve"> and soybean seed yield across </w:t>
-      </w:r>
-      <w:r>
-        <w:rPr>
-          <w:rFonts w:ascii="Times New Roman" w:hAnsi="Times New Roman" w:cs="Times New Roman"/>
-          <w:sz w:val="24"/>
-          <w:szCs w:val="24"/>
-        </w:rPr>
-        <w:t>4</w:t>
-      </w:r>
-      <w:r>
-        <w:rPr>
-          <w:rFonts w:ascii="Times New Roman" w:hAnsi="Times New Roman" w:cs="Times New Roman"/>
-          <w:sz w:val="24"/>
-          <w:szCs w:val="24"/>
-        </w:rPr>
-        <w:t xml:space="preserve">0 years and </w:t>
-      </w:r>
-      <w:r>
-        <w:rPr>
-          <w:rFonts w:ascii="Times New Roman" w:hAnsi="Times New Roman" w:cs="Times New Roman"/>
-          <w:sz w:val="24"/>
-          <w:szCs w:val="24"/>
-        </w:rPr>
-        <w:t xml:space="preserve">4,651 </w:t>
-      </w:r>
-      <w:r>
-        <w:rPr>
-          <w:rFonts w:ascii="Times New Roman" w:hAnsi="Times New Roman" w:cs="Times New Roman"/>
-          <w:sz w:val="24"/>
-          <w:szCs w:val="24"/>
-        </w:rPr>
-        <w:t xml:space="preserve">fields in the US Mid-South under a 2 °C temperature increase scenario. </w:t>
-      </w:r>
-      <w:r>
-        <w:rPr>
-          <w:rFonts w:ascii="Times New Roman" w:hAnsi="Times New Roman" w:cs="Times New Roman"/>
-          <w:sz w:val="24"/>
-          <w:szCs w:val="24"/>
-        </w:rPr>
-        <w:t xml:space="preserve">The text in the panel represents the equation slopes for the overall data and for filtered </w:t>
-      </w:r>
-      <w:r>
-        <w:rPr>
-          <w:rFonts w:ascii="Times New Roman" w:hAnsi="Times New Roman" w:cs="Times New Roman"/>
-          <w:sz w:val="24"/>
-          <w:szCs w:val="24"/>
-        </w:rPr>
-        <w:t>Warm/Dry site-years.</w:t>
-      </w:r>
-    </w:p>
-    <w:p>
-      <w:pPr>
-        <w:spacing w:before="120" w:after="0" w:line="480" w:lineRule="auto"/>
-        <w:rPr>
-          <w:rFonts w:ascii="Times New Roman" w:hAnsi="Times New Roman" w:cs="Times New Roman"/>
-          <w:sz w:val="24"/>
-          <w:szCs w:val="24"/>
-        </w:rPr>
-      </w:pPr>
+      <w:ins w:id="33" w:author="Elvis F. Elli" w:date="2026-06-11T10:26:00Z" w16du:dateUtc="2026-06-11T15:26:00Z">
+        <w:r>
+          <w:rPr>
+            <w:rFonts w:ascii="Times New Roman" w:hAnsi="Times New Roman" w:cs="Times New Roman"/>
+            <w:b/>
+            <w:bCs/>
+            <w:sz w:val="24"/>
+            <w:szCs w:val="24"/>
+          </w:rPr>
+          <w:t xml:space="preserve">Figure </w:t>
+        </w:r>
+        <w:r>
+          <w:rPr>
+            <w:rFonts w:ascii="Times New Roman" w:hAnsi="Times New Roman" w:cs="Times New Roman"/>
+            <w:b/>
+            <w:bCs/>
+            <w:sz w:val="24"/>
+            <w:szCs w:val="24"/>
+          </w:rPr>
+          <w:t>2</w:t>
+        </w:r>
+        <w:r>
+          <w:rPr>
+            <w:rFonts w:ascii="Times New Roman" w:hAnsi="Times New Roman" w:cs="Times New Roman"/>
+            <w:b/>
+            <w:bCs/>
+            <w:sz w:val="24"/>
+            <w:szCs w:val="24"/>
+          </w:rPr>
+          <w:t>.</w:t>
+        </w:r>
+        <w:r>
+          <w:rPr>
+            <w:rFonts w:ascii="Times New Roman" w:hAnsi="Times New Roman" w:cs="Times New Roman"/>
+            <w:sz w:val="24"/>
+            <w:szCs w:val="24"/>
+          </w:rPr>
+          <w:t xml:space="preserve"> </w:t>
+        </w:r>
+        <w:r>
+          <w:rPr>
+            <w:rFonts w:ascii="Times New Roman" w:hAnsi="Times New Roman" w:cs="Times New Roman"/>
+          </w:rPr>
+          <w:t>G</w:t>
+        </w:r>
+        <w:r>
+          <w:rPr>
+            <w:rFonts w:ascii="Times New Roman" w:hAnsi="Times New Roman" w:cs="Times New Roman"/>
+          </w:rPr>
+          <w:t xml:space="preserve">eographical distribution </w:t>
+        </w:r>
+        <w:r>
+          <w:rPr>
+            <w:rFonts w:ascii="Times New Roman" w:hAnsi="Times New Roman" w:cs="Times New Roman"/>
+          </w:rPr>
+          <w:t>of the o</w:t>
+        </w:r>
+        <w:r>
+          <w:rPr>
+            <w:rFonts w:ascii="Times New Roman" w:hAnsi="Times New Roman" w:cs="Times New Roman"/>
+            <w:sz w:val="24"/>
+            <w:szCs w:val="24"/>
+          </w:rPr>
+          <w:t>verall r</w:t>
+        </w:r>
+        <w:r>
+          <w:rPr>
+            <w:rFonts w:ascii="Times New Roman" w:hAnsi="Times New Roman" w:cs="Times New Roman"/>
+            <w:sz w:val="24"/>
+            <w:szCs w:val="24"/>
+          </w:rPr>
+          <w:t xml:space="preserve">elative effects of rising temperatures and </w:t>
+        </w:r>
+        <w:r>
+          <w:rPr>
+            <w:rFonts w:ascii="Times New Roman" w:hAnsi="Times New Roman" w:cs="Times New Roman"/>
+            <w:sz w:val="24"/>
+            <w:szCs w:val="24"/>
+          </w:rPr>
+          <w:t xml:space="preserve">adaptive genotypic and agronomic management strategies </w:t>
+        </w:r>
+        <w:r>
+          <w:rPr>
+            <w:rFonts w:ascii="Times New Roman" w:hAnsi="Times New Roman" w:cs="Times New Roman"/>
+            <w:sz w:val="24"/>
+            <w:szCs w:val="24"/>
+          </w:rPr>
+          <w:t xml:space="preserve">on soybean </w:t>
+        </w:r>
+        <w:r>
+          <w:rPr>
+            <w:rFonts w:ascii="Times New Roman" w:hAnsi="Times New Roman" w:cs="Times New Roman"/>
+            <w:sz w:val="24"/>
+            <w:szCs w:val="24"/>
+          </w:rPr>
+          <w:t xml:space="preserve">total crop cycle and seed-filling period changes across 4,651 soybean fields and 40 weather years </w:t>
+        </w:r>
+        <w:r>
+          <w:rPr>
+            <w:rFonts w:ascii="Times New Roman" w:hAnsi="Times New Roman" w:cs="Times New Roman"/>
+            <w:sz w:val="24"/>
+            <w:szCs w:val="24"/>
+          </w:rPr>
+          <w:t>in the US Mid-South</w:t>
+        </w:r>
+        <w:r>
+          <w:rPr>
+            <w:rFonts w:ascii="Times New Roman" w:hAnsi="Times New Roman" w:cs="Times New Roman"/>
+            <w:sz w:val="24"/>
+            <w:szCs w:val="24"/>
+          </w:rPr>
+          <w:t xml:space="preserve">. </w:t>
+        </w:r>
+        <w:r>
+          <w:rPr>
+            <w:rFonts w:ascii="Times New Roman" w:hAnsi="Times New Roman" w:cs="Times New Roman"/>
+          </w:rPr>
+          <w:t>Values per pixel in panel B are averages across 40 weather years.</w:t>
+        </w:r>
+        <w:r>
+          <w:rPr>
+            <w:rFonts w:ascii="Times New Roman" w:hAnsi="Times New Roman" w:cs="Times New Roman"/>
+          </w:rPr>
+          <w:t xml:space="preserve"> LM &amp; ES represent the combined effect of a late-maturing variety and early sowing.</w:t>
+        </w:r>
+      </w:ins>
     </w:p>
     <w:p>
       <w:pPr>
@@ -6956,6 +6956,7 @@
           <w:sz w:val="24"/>
           <w:szCs w:val="24"/>
         </w:rPr>
+        <w:lastRenderedPageBreak/>
         <w:t>Stacked</w:t>
       </w:r>
       <w:r>
@@ -7120,16 +7121,7 @@
           <w:sz w:val="24"/>
           <w:szCs w:val="24"/>
         </w:rPr>
-        <w:t xml:space="preserve">in combination with early sowing increased soybean seed yield by 9% under </w:t>
-      </w:r>
-      <w:r>
-        <w:rPr>
-          <w:rFonts w:ascii="Times New Roman" w:hAnsi="Times New Roman" w:cs="Times New Roman"/>
-          <w:sz w:val="24"/>
-          <w:szCs w:val="24"/>
-        </w:rPr>
-        <w:lastRenderedPageBreak/>
-        <w:t>the 2°C temperature increase scenario,</w:t>
+        <w:t>in combination with early sowing increased soybean seed yield by 9% under the 2°C temperature increase scenario,</w:t>
       </w:r>
       <w:r>
         <w:rPr>
@@ -7308,7 +7300,7 @@
         </w:rPr>
         <w:t xml:space="preserve">, particularly those located in the central-north region (Figure </w:t>
       </w:r>
-      <w:del w:id="30" w:author="Elvis F. Elli" w:date="2026-06-09T11:02:00Z" w16du:dateUtc="2026-06-09T16:02:00Z">
+      <w:del w:id="34" w:author="Elvis F. Elli" w:date="2026-06-09T11:02:00Z" w16du:dateUtc="2026-06-09T16:02:00Z">
         <w:r>
           <w:rPr>
             <w:rFonts w:ascii="Times New Roman" w:hAnsi="Times New Roman" w:cs="Times New Roman"/>
@@ -7326,7 +7318,7 @@
           <w:delText>5</w:delText>
         </w:r>
       </w:del>
-      <w:ins w:id="31" w:author="Elvis F. Elli" w:date="2026-06-09T11:02:00Z" w16du:dateUtc="2026-06-09T16:02:00Z">
+      <w:ins w:id="35" w:author="Elvis F. Elli" w:date="2026-06-09T11:02:00Z" w16du:dateUtc="2026-06-09T16:02:00Z">
         <w:r>
           <w:rPr>
             <w:rFonts w:ascii="Times New Roman" w:hAnsi="Times New Roman" w:cs="Times New Roman"/>
@@ -7990,7 +7982,7 @@
         </w:rPr>
         <w:t xml:space="preserve">. </w:t>
       </w:r>
-      <w:ins w:id="32" w:author="Elvis F. Elli" w:date="2026-06-08T12:30:00Z" w16du:dateUtc="2026-06-08T17:30:00Z">
+      <w:ins w:id="36" w:author="Elvis F. Elli" w:date="2026-06-08T12:30:00Z" w16du:dateUtc="2026-06-08T17:30:00Z">
         <w:r>
           <w:rPr>
             <w:rFonts w:ascii="Times New Roman" w:hAnsi="Times New Roman" w:cs="Times New Roman"/>
@@ -8024,7 +8016,7 @@
           <w:t xml:space="preserve"> </w:t>
         </w:r>
       </w:ins>
-      <w:customXmlInsRangeStart w:id="33" w:author="Elvis F. Elli" w:date="2026-06-08T12:30:00Z"/>
+      <w:customXmlInsRangeStart w:id="37" w:author="Elvis F. Elli" w:date="2026-06-08T12:30:00Z"/>
       <w:sdt>
         <w:sdtPr>
           <w:rPr>
@@ -8040,7 +8032,7 @@
           </w:placeholder>
         </w:sdtPr>
         <w:sdtContent>
-          <w:customXmlInsRangeEnd w:id="33"/>
+          <w:customXmlInsRangeEnd w:id="37"/>
           <w:r>
             <w:rPr>
               <w:rFonts w:ascii="Times New Roman" w:hAnsi="Times New Roman" w:cs="Times New Roman"/>
@@ -8050,11 +8042,11 @@
             </w:rPr>
             <w:t>(Elli et al., 2022; Nendel et al., 2023)</w:t>
           </w:r>
-          <w:customXmlInsRangeStart w:id="34" w:author="Elvis F. Elli" w:date="2026-06-08T12:30:00Z"/>
+          <w:customXmlInsRangeStart w:id="38" w:author="Elvis F. Elli" w:date="2026-06-08T12:30:00Z"/>
         </w:sdtContent>
       </w:sdt>
-      <w:customXmlInsRangeEnd w:id="34"/>
-      <w:ins w:id="35" w:author="Elvis F. Elli" w:date="2026-06-08T12:30:00Z" w16du:dateUtc="2026-06-08T17:30:00Z">
+      <w:customXmlInsRangeEnd w:id="38"/>
+      <w:ins w:id="39" w:author="Elvis F. Elli" w:date="2026-06-08T12:30:00Z" w16du:dateUtc="2026-06-08T17:30:00Z">
         <w:r>
           <w:rPr>
             <w:rFonts w:ascii="Times New Roman" w:hAnsi="Times New Roman" w:cs="Times New Roman"/>
@@ -8190,7 +8182,16 @@
           <w:sz w:val="24"/>
           <w:szCs w:val="24"/>
         </w:rPr>
-        <w:t xml:space="preserve"> farmers can rapidly adopt these changed management practices without </w:t>
+        <w:t xml:space="preserve"> </w:t>
+      </w:r>
+      <w:r>
+        <w:rPr>
+          <w:rFonts w:ascii="Times New Roman" w:hAnsi="Times New Roman" w:cs="Times New Roman"/>
+          <w:sz w:val="24"/>
+          <w:szCs w:val="24"/>
+        </w:rPr>
+        <w:lastRenderedPageBreak/>
+        <w:t xml:space="preserve">farmers can rapidly adopt these changed management practices without </w:t>
       </w:r>
       <w:r>
         <w:rPr>
@@ -8364,17 +8365,7 @@
           <w:sz w:val="24"/>
           <w:szCs w:val="24"/>
         </w:rPr>
-        <w:t xml:space="preserve">reported a 19% </w:t>
-      </w:r>
-      <w:r>
-        <w:rPr>
-          <w:rFonts w:ascii="Times New Roman" w:hAnsi="Times New Roman" w:cs="Times New Roman"/>
-          <w:color w:val="000000"/>
-          <w:sz w:val="24"/>
-          <w:szCs w:val="24"/>
-        </w:rPr>
-        <w:lastRenderedPageBreak/>
-        <w:t>average reduction in seed yield across 10 locations</w:t>
+        <w:t>reported a 19% average reduction in seed yield across 10 locations</w:t>
       </w:r>
       <w:r>
         <w:rPr>
@@ -8434,7 +8425,7 @@
         </w:rPr>
         <w:t xml:space="preserve">. </w:t>
       </w:r>
-      <w:ins w:id="36" w:author="Elvis F. Elli" w:date="2026-06-08T12:31:00Z" w16du:dateUtc="2026-06-08T17:31:00Z">
+      <w:ins w:id="40" w:author="Elvis F. Elli" w:date="2026-06-08T12:31:00Z" w16du:dateUtc="2026-06-08T17:31:00Z">
         <w:r>
           <w:rPr>
             <w:rFonts w:ascii="Times New Roman" w:hAnsi="Times New Roman" w:cs="Times New Roman"/>
@@ -9443,7 +9434,16 @@
           <w:sz w:val="24"/>
           <w:szCs w:val="24"/>
         </w:rPr>
-        <w:t xml:space="preserve">the impacts of extreme heat and drought </w:t>
+        <w:t xml:space="preserve">the impacts of extreme heat and </w:t>
+      </w:r>
+      <w:r>
+        <w:rPr>
+          <w:rFonts w:ascii="Times New Roman" w:hAnsi="Times New Roman" w:cs="Times New Roman"/>
+          <w:sz w:val="24"/>
+          <w:szCs w:val="24"/>
+        </w:rPr>
+        <w:lastRenderedPageBreak/>
+        <w:t xml:space="preserve">drought </w:t>
       </w:r>
       <w:r>
         <w:rPr>
@@ -9664,17 +9664,7 @@
           <w:sz w:val="24"/>
           <w:szCs w:val="24"/>
         </w:rPr>
-        <w:t xml:space="preserve">Given the important </w:t>
-      </w:r>
-      <w:r>
-        <w:rPr>
-          <w:rFonts w:ascii="Times New Roman" w:hAnsi="Times New Roman" w:cs="Times New Roman"/>
-          <w:color w:val="000000"/>
-          <w:sz w:val="24"/>
-          <w:szCs w:val="24"/>
-        </w:rPr>
-        <w:lastRenderedPageBreak/>
-        <w:t xml:space="preserve">role of adapting </w:t>
+        <w:t xml:space="preserve">Given the important role of adapting </w:t>
       </w:r>
       <w:r>
         <w:rPr>
@@ -9987,7 +9977,7 @@
         </w:rPr>
         <w:t>high</w:t>
       </w:r>
-      <w:del w:id="37" w:author="Elvis F. Elli" w:date="2026-06-09T11:14:00Z" w16du:dateUtc="2026-06-09T16:14:00Z">
+      <w:del w:id="41" w:author="Elvis F. Elli" w:date="2026-06-09T11:14:00Z" w16du:dateUtc="2026-06-09T16:14:00Z">
         <w:r>
           <w:rPr>
             <w:rFonts w:ascii="Times New Roman" w:hAnsi="Times New Roman" w:cs="Times New Roman"/>
@@ -10014,25 +10004,17 @@
         </w:rPr>
         <w:t xml:space="preserve"> risks</w:t>
       </w:r>
-      <w:ins w:id="38" w:author="Elvis F. Elli" w:date="2026-06-09T11:13:00Z" w16du:dateUtc="2026-06-09T16:13:00Z">
+      <w:ins w:id="42" w:author="Elvis F. Elli" w:date="2026-06-09T11:13:00Z" w16du:dateUtc="2026-06-09T16:13:00Z">
         <w:r>
           <w:rPr>
             <w:rFonts w:ascii="Times New Roman" w:hAnsi="Times New Roman" w:cs="Times New Roman"/>
             <w:sz w:val="24"/>
             <w:szCs w:val="24"/>
           </w:rPr>
-          <w:t xml:space="preserve">, </w:t>
-        </w:r>
-        <w:r>
-          <w:rPr>
-            <w:rFonts w:ascii="Times New Roman" w:hAnsi="Times New Roman" w:cs="Times New Roman"/>
-            <w:sz w:val="24"/>
-            <w:szCs w:val="24"/>
-          </w:rPr>
-          <w:t xml:space="preserve">providing </w:t>
+          <w:t xml:space="preserve">, providing </w:t>
         </w:r>
       </w:ins>
-      <w:ins w:id="39" w:author="Elvis F. Elli" w:date="2026-06-09T11:14:00Z" w16du:dateUtc="2026-06-09T16:14:00Z">
+      <w:ins w:id="43" w:author="Elvis F. Elli" w:date="2026-06-09T11:14:00Z" w16du:dateUtc="2026-06-09T16:14:00Z">
         <w:r>
           <w:rPr>
             <w:rFonts w:ascii="Times New Roman" w:hAnsi="Times New Roman" w:cs="Times New Roman"/>
@@ -10040,46 +10022,6 @@
             <w:szCs w:val="24"/>
           </w:rPr>
           <w:t xml:space="preserve">new </w:t>
-        </w:r>
-      </w:ins>
-      <w:ins w:id="40" w:author="Elvis F. Elli" w:date="2026-06-09T11:13:00Z" w16du:dateUtc="2026-06-09T16:13:00Z">
-        <w:r>
-          <w:rPr>
-            <w:rFonts w:ascii="Times New Roman" w:hAnsi="Times New Roman" w:cs="Times New Roman"/>
-            <w:sz w:val="24"/>
-            <w:szCs w:val="24"/>
-          </w:rPr>
-          <w:t xml:space="preserve">quantitative </w:t>
-        </w:r>
-      </w:ins>
-      <w:ins w:id="41" w:author="Elvis F. Elli" w:date="2026-06-09T11:14:00Z" w16du:dateUtc="2026-06-09T16:14:00Z">
-        <w:r>
-          <w:rPr>
-            <w:rFonts w:ascii="Times New Roman" w:hAnsi="Times New Roman" w:cs="Times New Roman"/>
-            <w:sz w:val="24"/>
-            <w:szCs w:val="24"/>
-          </w:rPr>
-          <w:t xml:space="preserve">evidence </w:t>
-        </w:r>
-      </w:ins>
-      <w:ins w:id="42" w:author="Elvis F. Elli" w:date="2026-06-09T11:13:00Z" w16du:dateUtc="2026-06-09T16:13:00Z">
-        <w:r>
-          <w:rPr>
-            <w:rFonts w:ascii="Times New Roman" w:hAnsi="Times New Roman" w:cs="Times New Roman"/>
-            <w:sz w:val="24"/>
-            <w:szCs w:val="24"/>
-          </w:rPr>
-          <w:t xml:space="preserve">for the irrigated Arkansas delta that </w:t>
-        </w:r>
-      </w:ins>
-      <w:ins w:id="43" w:author="Elvis F. Elli" w:date="2026-06-09T11:15:00Z" w16du:dateUtc="2026-06-09T16:15:00Z">
-        <w:r>
-          <w:rPr>
-            <w:rFonts w:ascii="Times New Roman" w:hAnsi="Times New Roman" w:cs="Times New Roman"/>
-            <w:sz w:val="24"/>
-            <w:szCs w:val="24"/>
-          </w:rPr>
-          <w:t>extends</w:t>
         </w:r>
       </w:ins>
       <w:ins w:id="44" w:author="Elvis F. Elli" w:date="2026-06-09T11:13:00Z" w16du:dateUtc="2026-06-09T16:13:00Z">
@@ -10089,10 +10031,50 @@
             <w:sz w:val="24"/>
             <w:szCs w:val="24"/>
           </w:rPr>
+          <w:t xml:space="preserve">quantitative </w:t>
+        </w:r>
+      </w:ins>
+      <w:ins w:id="45" w:author="Elvis F. Elli" w:date="2026-06-09T11:14:00Z" w16du:dateUtc="2026-06-09T16:14:00Z">
+        <w:r>
+          <w:rPr>
+            <w:rFonts w:ascii="Times New Roman" w:hAnsi="Times New Roman" w:cs="Times New Roman"/>
+            <w:sz w:val="24"/>
+            <w:szCs w:val="24"/>
+          </w:rPr>
+          <w:t xml:space="preserve">evidence </w:t>
+        </w:r>
+      </w:ins>
+      <w:ins w:id="46" w:author="Elvis F. Elli" w:date="2026-06-09T11:13:00Z" w16du:dateUtc="2026-06-09T16:13:00Z">
+        <w:r>
+          <w:rPr>
+            <w:rFonts w:ascii="Times New Roman" w:hAnsi="Times New Roman" w:cs="Times New Roman"/>
+            <w:sz w:val="24"/>
+            <w:szCs w:val="24"/>
+          </w:rPr>
+          <w:t xml:space="preserve">for the irrigated Arkansas delta that </w:t>
+        </w:r>
+      </w:ins>
+      <w:ins w:id="47" w:author="Elvis F. Elli" w:date="2026-06-09T11:15:00Z" w16du:dateUtc="2026-06-09T16:15:00Z">
+        <w:r>
+          <w:rPr>
+            <w:rFonts w:ascii="Times New Roman" w:hAnsi="Times New Roman" w:cs="Times New Roman"/>
+            <w:sz w:val="24"/>
+            <w:szCs w:val="24"/>
+          </w:rPr>
+          <w:t>extends</w:t>
+        </w:r>
+      </w:ins>
+      <w:ins w:id="48" w:author="Elvis F. Elli" w:date="2026-06-09T11:13:00Z" w16du:dateUtc="2026-06-09T16:13:00Z">
+        <w:r>
+          <w:rPr>
+            <w:rFonts w:ascii="Times New Roman" w:hAnsi="Times New Roman" w:cs="Times New Roman"/>
+            <w:sz w:val="24"/>
+            <w:szCs w:val="24"/>
+          </w:rPr>
           <w:t xml:space="preserve"> </w:t>
         </w:r>
       </w:ins>
-      <w:ins w:id="45" w:author="Elvis F. Elli" w:date="2026-06-09T11:14:00Z" w16du:dateUtc="2026-06-09T16:14:00Z">
+      <w:ins w:id="49" w:author="Elvis F. Elli" w:date="2026-06-09T11:14:00Z" w16du:dateUtc="2026-06-09T16:14:00Z">
         <w:r>
           <w:rPr>
             <w:rFonts w:ascii="Times New Roman" w:hAnsi="Times New Roman" w:cs="Times New Roman"/>
@@ -10519,6 +10501,7 @@
           <w:bCs/>
           <w:szCs w:val="24"/>
         </w:rPr>
+        <w:lastRenderedPageBreak/>
         <w:t>Elvis F. Elli</w:t>
       </w:r>
       <w:r>
@@ -10600,14 +10583,7 @@
         <w:rPr>
           <w:szCs w:val="24"/>
         </w:rPr>
-        <w:t xml:space="preserve">Writing - review &amp; </w:t>
-      </w:r>
-      <w:r>
-        <w:rPr>
-          <w:szCs w:val="24"/>
-        </w:rPr>
-        <w:lastRenderedPageBreak/>
-        <w:t xml:space="preserve">editing; </w:t>
+        <w:t xml:space="preserve">Writing - review &amp; editing; </w:t>
       </w:r>
       <w:r>
         <w:rPr>
@@ -10984,6 +10960,7 @@
           <w:sz w:val="24"/>
           <w:szCs w:val="24"/>
         </w:rPr>
+        <w:lastRenderedPageBreak/>
         <w:t>Figure S</w:t>
       </w:r>
       <w:r>
@@ -11012,16 +10989,7 @@
           <w:sz w:val="24"/>
           <w:szCs w:val="24"/>
         </w:rPr>
-        <w:t xml:space="preserve"> Environmental characterization of baseline conditions across all studied site-years (A) and number of calendar days to flower under baseline and the 2°C temperature increase scenario (B). Panel A contains the APSIM phenology response curve (0-1), where 1 represents </w:t>
-      </w:r>
-      <w:r>
-        <w:rPr>
-          <w:rFonts w:ascii="Times New Roman" w:hAnsi="Times New Roman" w:cs="Times New Roman"/>
-          <w:sz w:val="24"/>
-          <w:szCs w:val="24"/>
-        </w:rPr>
-        <w:lastRenderedPageBreak/>
-        <w:t>maximum development rate. The solid vertical and horizontal lines indicate the median growing-season average temperature and total growing-season precipitation, respectively.</w:t>
+        <w:t xml:space="preserve"> Environmental characterization of baseline conditions across all studied site-years (A) and number of calendar days to flower under baseline and the 2°C temperature increase scenario (B). Panel A contains the APSIM phenology response curve (0-1), where 1 represents maximum development rate. The solid vertical and horizontal lines indicate the median growing-season average temperature and total growing-season precipitation, respectively.</w:t>
       </w:r>
     </w:p>
     <w:p>
@@ -11368,7 +11336,16 @@
           <w:sz w:val="24"/>
           <w:szCs w:val="24"/>
         </w:rPr>
-        <w:t xml:space="preserve">) physiology, growth and yield. </w:t>
+        <w:t xml:space="preserve">) physiology, growth and </w:t>
+      </w:r>
+      <w:r>
+        <w:rPr>
+          <w:rFonts w:ascii="Times New Roman" w:hAnsi="Times New Roman" w:cs="Times New Roman"/>
+          <w:sz w:val="24"/>
+          <w:szCs w:val="24"/>
+        </w:rPr>
+        <w:lastRenderedPageBreak/>
+        <w:t xml:space="preserve">yield. </w:t>
       </w:r>
       <w:r>
         <w:rPr>
@@ -11434,7 +11411,6 @@
           <w:sz w:val="24"/>
           <w:szCs w:val="24"/>
         </w:rPr>
-        <w:lastRenderedPageBreak/>
         <w:t xml:space="preserve">Archontoulis, S. V., Castellano, M. J., Licht, M. A., Nichols, V., Baum, M., Huber, I., Martinez-Feria, R., Puntel, L., Ordóñez, R. A., Iqbal, J., Wright, E. E., Dietzel, R. N., Helmers, M., Vanloocke, A., Liebman, M., Hatfield, J. L., </w:t>
       </w:r>
       <w:proofErr w:type="spellStart"/>
@@ -11883,6 +11859,7 @@
           <w:sz w:val="24"/>
           <w:szCs w:val="24"/>
         </w:rPr>
+        <w:lastRenderedPageBreak/>
         <w:t xml:space="preserve">Djanaguiraman, M., Prasad, P. V. V., Boyle, D. L., &amp; </w:t>
       </w:r>
       <w:proofErr w:type="spellStart"/>
@@ -11967,7 +11944,6 @@
           <w:sz w:val="24"/>
           <w:szCs w:val="24"/>
         </w:rPr>
-        <w:lastRenderedPageBreak/>
         <w:t xml:space="preserve">Edwards, J. T., Purcell, L. C., Vories, E. D., Shannon, J. G., &amp; Ashlock, L. O. (2003). Short-season soybean cultivars have similar yields with less irrigation than longer-season cultivars. </w:t>
       </w:r>
       <w:r>
@@ -12322,7 +12298,16 @@
           <w:sz w:val="24"/>
           <w:szCs w:val="24"/>
         </w:rPr>
-        <w:t xml:space="preserve">, C., Silva, E. H. F. M., Smith, W., Soltani, A., Srivastava, A., Vieira, N. A., Slone, S., &amp; Salmerón, M. (2022). Are soybean models ready for climate change food impact assessments? </w:t>
+        <w:t xml:space="preserve">, C., Silva, E. H. F. M., Smith, W., Soltani, A., Srivastava, A., Vieira, N. A., </w:t>
+      </w:r>
+      <w:r>
+        <w:rPr>
+          <w:rFonts w:ascii="Times New Roman" w:hAnsi="Times New Roman" w:cs="Times New Roman"/>
+          <w:sz w:val="24"/>
+          <w:szCs w:val="24"/>
+        </w:rPr>
+        <w:lastRenderedPageBreak/>
+        <w:t xml:space="preserve">Slone, S., &amp; Salmerón, M. (2022). Are soybean models ready for climate change food impact assessments? </w:t>
       </w:r>
       <w:r>
         <w:rPr>
@@ -12388,7 +12373,6 @@
           <w:sz w:val="24"/>
           <w:szCs w:val="24"/>
         </w:rPr>
-        <w:lastRenderedPageBreak/>
         <w:t xml:space="preserve">Kothari, K., Battisti, R., Boote, K. J., Archontoulis, S. V., Confalone, A., Constantin, J., Cuadra, S. V., Debaeke, P., Faye, B., Grant, B., Hoogenboom, G., Jing, Q., van der Laan, M., da Silva, F. A. M., Marin, F. R., </w:t>
       </w:r>
       <w:proofErr w:type="spellStart"/>
@@ -12785,6 +12769,7 @@
           <w:sz w:val="24"/>
           <w:szCs w:val="24"/>
         </w:rPr>
+        <w:lastRenderedPageBreak/>
         <w:t xml:space="preserve">Nendel, C., Reckling, M., </w:t>
       </w:r>
       <w:proofErr w:type="spellStart"/>
@@ -12857,16 +12842,7 @@
           <w:sz w:val="24"/>
           <w:szCs w:val="24"/>
         </w:rPr>
-        <w:t xml:space="preserve">, C., Stella, T., &amp; Battisti, R. (2023). Future area expansion outweighs increasing drought risk </w:t>
-      </w:r>
-      <w:r>
-        <w:rPr>
-          <w:rFonts w:ascii="Times New Roman" w:hAnsi="Times New Roman" w:cs="Times New Roman"/>
-          <w:sz w:val="24"/>
-          <w:szCs w:val="24"/>
-        </w:rPr>
-        <w:lastRenderedPageBreak/>
-        <w:t xml:space="preserve">for soybean in Europe. </w:t>
+        <w:t xml:space="preserve">, C., Stella, T., &amp; Battisti, R. (2023). Future area expansion outweighs increasing drought risk for soybean in Europe. </w:t>
       </w:r>
       <w:r>
         <w:rPr>
@@ -13338,7 +13314,16 @@
           <w:sz w:val="24"/>
           <w:szCs w:val="24"/>
         </w:rPr>
-        <w:t xml:space="preserve">, D. A., Vories, E. D., Wiebold, W. J., &amp; Purcell, L. C. (2016). Yield response to planting date among soybean maturity groups for irrigated production in the US Midsouth. </w:t>
+        <w:t xml:space="preserve">, D. A., Vories, E. D., Wiebold, W. J., &amp; Purcell, L. C. (2016). Yield </w:t>
+      </w:r>
+      <w:r>
+        <w:rPr>
+          <w:rFonts w:ascii="Times New Roman" w:hAnsi="Times New Roman" w:cs="Times New Roman"/>
+          <w:sz w:val="24"/>
+          <w:szCs w:val="24"/>
+        </w:rPr>
+        <w:lastRenderedPageBreak/>
+        <w:t xml:space="preserve">response to planting date among soybean maturity groups for irrigated production in the US Midsouth. </w:t>
       </w:r>
       <w:r>
         <w:rPr>
@@ -13404,7 +13389,6 @@
           <w:sz w:val="24"/>
           <w:szCs w:val="24"/>
         </w:rPr>
-        <w:lastRenderedPageBreak/>
         <w:t xml:space="preserve">Salmerón, M., &amp; Purcell, L. C. (2016). Simplifying the prediction of phenology with the DSSAT-CROPGRO-soybean model based on relative maturity group and determinacy. </w:t>
       </w:r>
       <w:r>
@@ -15570,6 +15554,7 @@
     <w:rsid w:val="001A5E80"/>
     <w:rsid w:val="001B38E1"/>
     <w:rsid w:val="001D298D"/>
+    <w:rsid w:val="00203205"/>
     <w:rsid w:val="0024394A"/>
     <w:rsid w:val="00257DF2"/>
     <w:rsid w:val="00290619"/>
@@ -15581,6 +15566,7 @@
     <w:rsid w:val="00330CA9"/>
     <w:rsid w:val="003466F5"/>
     <w:rsid w:val="003B7BEE"/>
+    <w:rsid w:val="004A5FDA"/>
     <w:rsid w:val="004B2F2E"/>
     <w:rsid w:val="004C4724"/>
     <w:rsid w:val="00563F06"/>

</xml_diff>

<commit_message>
Add analysis/plotting code; update project metadata
Replace .Rhistory with analysis/figure-generation code: loads simulation results, applies QC filters, defines spatial helpers and plotting theme, builds stars raster helpers and map/violin plot functions (used for manuscript Figures such as panel 5 and 9), computes summary statistics for manuscript sections, and prepares figure objects. Also create figures/ and wire up plot-theme sourcing. Project metadata updates: tweak RStudio pane/window layout (.Rproj.user), add rmd-outputs and saved_source_markers, remove transient Word lock files, and update APSIM template and related template DB/backup files (soybean-mg4-baseline.apsimx/.bak/.db*).
</commit_message>
<xml_diff>
--- a/paper/paper-04-01-2026.docx
+++ b/paper/paper-04-01-2026.docx
@@ -5529,6 +5529,7 @@
       <w:pPr>
         <w:spacing w:before="120" w:after="0" w:line="480" w:lineRule="auto"/>
         <w:rPr>
+          <w:del w:id="28" w:author="Elvis F. Elli" w:date="2026-06-11T11:25:00Z" w16du:dateUtc="2026-06-11T16:25:00Z"/>
           <w:rFonts w:ascii="Times New Roman" w:hAnsi="Times New Roman" w:cs="Times New Roman"/>
           <w:sz w:val="24"/>
           <w:szCs w:val="24"/>
@@ -5960,7 +5961,35 @@
           <w:sz w:val="24"/>
           <w:szCs w:val="24"/>
         </w:rPr>
-        <w:t>Figure 2)</w:t>
+        <w:t xml:space="preserve">Figure </w:t>
+      </w:r>
+      <w:ins w:id="29" w:author="Elvis F. Elli" w:date="2026-06-11T10:31:00Z" w16du:dateUtc="2026-06-11T15:31:00Z">
+        <w:r>
+          <w:rPr>
+            <w:rFonts w:ascii="Times New Roman" w:hAnsi="Times New Roman" w:cs="Times New Roman"/>
+            <w:sz w:val="24"/>
+            <w:szCs w:val="24"/>
+          </w:rPr>
+          <w:t>S5</w:t>
+        </w:r>
+      </w:ins>
+      <w:del w:id="30" w:author="Elvis F. Elli" w:date="2026-06-11T10:31:00Z" w16du:dateUtc="2026-06-11T15:31:00Z">
+        <w:r>
+          <w:rPr>
+            <w:rFonts w:ascii="Times New Roman" w:hAnsi="Times New Roman" w:cs="Times New Roman"/>
+            <w:sz w:val="24"/>
+            <w:szCs w:val="24"/>
+          </w:rPr>
+          <w:delText>2</w:delText>
+        </w:r>
+      </w:del>
+      <w:r>
+        <w:rPr>
+          <w:rFonts w:ascii="Times New Roman" w:hAnsi="Times New Roman" w:cs="Times New Roman"/>
+          <w:sz w:val="24"/>
+          <w:szCs w:val="24"/>
+        </w:rPr>
+        <w:t>)</w:t>
       </w:r>
       <w:r>
         <w:rPr>
@@ -6066,8 +6095,18 @@
           <w:sz w:val="24"/>
           <w:szCs w:val="24"/>
         </w:rPr>
-        <w:t>conditions (Figure 2)</w:t>
-      </w:r>
+        <w:t>conditions</w:t>
+      </w:r>
+      <w:del w:id="31" w:author="Elvis F. Elli" w:date="2026-06-11T10:32:00Z" w16du:dateUtc="2026-06-11T15:32:00Z">
+        <w:r>
+          <w:rPr>
+            <w:rFonts w:ascii="Times New Roman" w:hAnsi="Times New Roman" w:cs="Times New Roman"/>
+            <w:sz w:val="24"/>
+            <w:szCs w:val="24"/>
+          </w:rPr>
+          <w:delText xml:space="preserve"> (Figure 2)</w:delText>
+        </w:r>
+      </w:del>
       <w:r>
         <w:rPr>
           <w:rFonts w:ascii="Times New Roman" w:hAnsi="Times New Roman" w:cs="Times New Roman"/>
@@ -6439,6 +6478,220 @@
         </w:rPr>
         <w:t>.</w:t>
       </w:r>
+      <w:ins w:id="32" w:author="Elvis F. Elli" w:date="2026-06-11T10:32:00Z" w16du:dateUtc="2026-06-11T15:32:00Z">
+        <w:r>
+          <w:rPr>
+            <w:rFonts w:ascii="Times New Roman" w:hAnsi="Times New Roman" w:cs="Times New Roman"/>
+            <w:sz w:val="24"/>
+            <w:szCs w:val="24"/>
+          </w:rPr>
+          <w:t xml:space="preserve"> </w:t>
+        </w:r>
+      </w:ins>
+      <w:ins w:id="33" w:author="Elvis F. Elli" w:date="2026-06-11T11:24:00Z" w16du:dateUtc="2026-06-11T16:24:00Z">
+        <w:r>
+          <w:rPr>
+            <w:rFonts w:ascii="Times New Roman" w:hAnsi="Times New Roman" w:cs="Times New Roman"/>
+            <w:sz w:val="24"/>
+            <w:szCs w:val="24"/>
+          </w:rPr>
+          <w:t xml:space="preserve">A shortening of the </w:t>
+        </w:r>
+        <w:r>
+          <w:rPr>
+            <w:rFonts w:ascii="Times New Roman" w:hAnsi="Times New Roman" w:cs="Times New Roman"/>
+            <w:sz w:val="24"/>
+            <w:szCs w:val="24"/>
+          </w:rPr>
+          <w:t xml:space="preserve">total </w:t>
+        </w:r>
+        <w:r>
+          <w:rPr>
+            <w:rFonts w:ascii="Times New Roman" w:hAnsi="Times New Roman" w:cs="Times New Roman"/>
+            <w:sz w:val="24"/>
+            <w:szCs w:val="24"/>
+          </w:rPr>
+          <w:t xml:space="preserve">crop cycle was observed in </w:t>
+        </w:r>
+      </w:ins>
+      <w:ins w:id="34" w:author="Elvis F. Elli" w:date="2026-06-11T11:32:00Z" w16du:dateUtc="2026-06-11T16:32:00Z">
+        <w:r>
+          <w:rPr>
+            <w:rFonts w:ascii="Times New Roman" w:hAnsi="Times New Roman" w:cs="Times New Roman"/>
+            <w:sz w:val="24"/>
+            <w:szCs w:val="24"/>
+          </w:rPr>
+          <w:t>70%</w:t>
+        </w:r>
+      </w:ins>
+      <w:ins w:id="35" w:author="Elvis F. Elli" w:date="2026-06-11T11:24:00Z" w16du:dateUtc="2026-06-11T16:24:00Z">
+        <w:r>
+          <w:rPr>
+            <w:rFonts w:ascii="Times New Roman" w:hAnsi="Times New Roman" w:cs="Times New Roman"/>
+            <w:sz w:val="24"/>
+            <w:szCs w:val="24"/>
+          </w:rPr>
+          <w:t xml:space="preserve"> of the 4,651 fields</w:t>
+        </w:r>
+        <w:r>
+          <w:rPr>
+            <w:rFonts w:ascii="Times New Roman" w:hAnsi="Times New Roman" w:cs="Times New Roman"/>
+            <w:sz w:val="24"/>
+            <w:szCs w:val="24"/>
+          </w:rPr>
+          <w:t xml:space="preserve"> (Figure 2A)</w:t>
+        </w:r>
+      </w:ins>
+      <w:ins w:id="36" w:author="Elvis F. Elli" w:date="2026-06-11T11:26:00Z" w16du:dateUtc="2026-06-11T16:26:00Z">
+        <w:r>
+          <w:rPr>
+            <w:rFonts w:ascii="Times New Roman" w:hAnsi="Times New Roman" w:cs="Times New Roman"/>
+            <w:sz w:val="24"/>
+            <w:szCs w:val="24"/>
+          </w:rPr>
+          <w:t xml:space="preserve">. </w:t>
+        </w:r>
+        <w:r>
+          <w:rPr>
+            <w:rFonts w:ascii="Times New Roman" w:hAnsi="Times New Roman" w:cs="Times New Roman"/>
+            <w:sz w:val="24"/>
+            <w:szCs w:val="24"/>
+          </w:rPr>
+          <w:t xml:space="preserve">The total crop cycle length decreased by up to </w:t>
+        </w:r>
+      </w:ins>
+      <w:ins w:id="37" w:author="Elvis F. Elli" w:date="2026-06-11T11:32:00Z" w16du:dateUtc="2026-06-11T16:32:00Z">
+        <w:r>
+          <w:rPr>
+            <w:rFonts w:ascii="Times New Roman" w:hAnsi="Times New Roman" w:cs="Times New Roman"/>
+            <w:sz w:val="24"/>
+            <w:szCs w:val="24"/>
+          </w:rPr>
+          <w:t>2</w:t>
+        </w:r>
+      </w:ins>
+      <w:ins w:id="38" w:author="Elvis F. Elli" w:date="2026-06-11T11:26:00Z" w16du:dateUtc="2026-06-11T16:26:00Z">
+        <w:r>
+          <w:rPr>
+            <w:rFonts w:ascii="Times New Roman" w:hAnsi="Times New Roman" w:cs="Times New Roman"/>
+            <w:sz w:val="24"/>
+            <w:szCs w:val="24"/>
+          </w:rPr>
+          <w:t xml:space="preserve"> weeks across all site-years.</w:t>
+        </w:r>
+        <w:r>
+          <w:rPr>
+            <w:rFonts w:ascii="Times New Roman" w:hAnsi="Times New Roman" w:cs="Times New Roman"/>
+            <w:sz w:val="24"/>
+            <w:szCs w:val="24"/>
+          </w:rPr>
+          <w:t xml:space="preserve"> The</w:t>
+        </w:r>
+      </w:ins>
+      <w:ins w:id="39" w:author="Elvis F. Elli" w:date="2026-06-11T11:24:00Z" w16du:dateUtc="2026-06-11T16:24:00Z">
+        <w:r>
+          <w:rPr>
+            <w:rFonts w:ascii="Times New Roman" w:hAnsi="Times New Roman" w:cs="Times New Roman"/>
+            <w:sz w:val="24"/>
+            <w:szCs w:val="24"/>
+          </w:rPr>
+          <w:t xml:space="preserve"> seed </w:t>
+        </w:r>
+      </w:ins>
+      <w:ins w:id="40" w:author="Elvis F. Elli" w:date="2026-06-11T11:25:00Z" w16du:dateUtc="2026-06-11T16:25:00Z">
+        <w:r>
+          <w:rPr>
+            <w:rFonts w:ascii="Times New Roman" w:hAnsi="Times New Roman" w:cs="Times New Roman"/>
+            <w:sz w:val="24"/>
+            <w:szCs w:val="24"/>
+          </w:rPr>
+          <w:t>filling</w:t>
+        </w:r>
+      </w:ins>
+      <w:ins w:id="41" w:author="Elvis F. Elli" w:date="2026-06-11T11:24:00Z" w16du:dateUtc="2026-06-11T16:24:00Z">
+        <w:r>
+          <w:rPr>
+            <w:rFonts w:ascii="Times New Roman" w:hAnsi="Times New Roman" w:cs="Times New Roman"/>
+            <w:sz w:val="24"/>
+            <w:szCs w:val="24"/>
+          </w:rPr>
+          <w:t xml:space="preserve"> </w:t>
+        </w:r>
+      </w:ins>
+      <w:ins w:id="42" w:author="Elvis F. Elli" w:date="2026-06-11T11:25:00Z" w16du:dateUtc="2026-06-11T16:25:00Z">
+        <w:r>
+          <w:rPr>
+            <w:rFonts w:ascii="Times New Roman" w:hAnsi="Times New Roman" w:cs="Times New Roman"/>
+            <w:sz w:val="24"/>
+            <w:szCs w:val="24"/>
+          </w:rPr>
+          <w:t xml:space="preserve">period </w:t>
+        </w:r>
+      </w:ins>
+      <w:ins w:id="43" w:author="Elvis F. Elli" w:date="2026-06-11T11:24:00Z" w16du:dateUtc="2026-06-11T16:24:00Z">
+        <w:r>
+          <w:rPr>
+            <w:rFonts w:ascii="Times New Roman" w:hAnsi="Times New Roman" w:cs="Times New Roman"/>
+            <w:sz w:val="24"/>
+            <w:szCs w:val="24"/>
+          </w:rPr>
+          <w:t xml:space="preserve">was shortened only </w:t>
+        </w:r>
+      </w:ins>
+      <w:ins w:id="44" w:author="Elvis F. Elli" w:date="2026-06-11T11:25:00Z" w16du:dateUtc="2026-06-11T16:25:00Z">
+        <w:r>
+          <w:rPr>
+            <w:rFonts w:ascii="Times New Roman" w:hAnsi="Times New Roman" w:cs="Times New Roman"/>
+            <w:sz w:val="24"/>
+            <w:szCs w:val="24"/>
+          </w:rPr>
+          <w:t>in northern environments, where baseline temperatures are lower</w:t>
+        </w:r>
+      </w:ins>
+      <w:ins w:id="45" w:author="Elvis F. Elli" w:date="2026-06-11T11:33:00Z" w16du:dateUtc="2026-06-11T16:33:00Z">
+        <w:r>
+          <w:rPr>
+            <w:rFonts w:ascii="Times New Roman" w:hAnsi="Times New Roman" w:cs="Times New Roman"/>
+            <w:sz w:val="24"/>
+            <w:szCs w:val="24"/>
+          </w:rPr>
+          <w:t xml:space="preserve"> </w:t>
+        </w:r>
+        <w:r>
+          <w:rPr>
+            <w:rFonts w:ascii="Times New Roman" w:hAnsi="Times New Roman" w:cs="Times New Roman"/>
+            <w:sz w:val="24"/>
+            <w:szCs w:val="24"/>
+          </w:rPr>
+          <w:t>(Figure 2</w:t>
+        </w:r>
+        <w:r>
+          <w:rPr>
+            <w:rFonts w:ascii="Times New Roman" w:hAnsi="Times New Roman" w:cs="Times New Roman"/>
+            <w:sz w:val="24"/>
+            <w:szCs w:val="24"/>
+          </w:rPr>
+          <w:t>B</w:t>
+        </w:r>
+        <w:r>
+          <w:rPr>
+            <w:rFonts w:ascii="Times New Roman" w:hAnsi="Times New Roman" w:cs="Times New Roman"/>
+            <w:sz w:val="24"/>
+            <w:szCs w:val="24"/>
+          </w:rPr>
+          <w:t>).</w:t>
+        </w:r>
+      </w:ins>
+      <w:ins w:id="46" w:author="Elvis F. Elli" w:date="2026-06-11T11:25:00Z" w16du:dateUtc="2026-06-11T16:25:00Z">
+        <w:r>
+          <w:rPr>
+            <w:rFonts w:ascii="Times New Roman" w:hAnsi="Times New Roman" w:cs="Times New Roman"/>
+            <w:sz w:val="24"/>
+            <w:szCs w:val="24"/>
+          </w:rPr>
+          <w:t xml:space="preserve"> In central and southern locations, no substantial changes in the seed filling period were observed under the high-temperature scenario.</w:t>
+        </w:r>
+      </w:ins>
     </w:p>
     <w:p>
       <w:pPr>
@@ -6508,6 +6761,7 @@
       <w:pPr>
         <w:spacing w:before="120" w:after="0" w:line="480" w:lineRule="auto"/>
         <w:rPr>
+          <w:ins w:id="47" w:author="Elvis F. Elli" w:date="2026-06-11T10:33:00Z" w16du:dateUtc="2026-06-11T15:33:00Z"/>
           <w:rFonts w:ascii="Times New Roman" w:hAnsi="Times New Roman" w:cs="Times New Roman"/>
           <w:sz w:val="24"/>
           <w:szCs w:val="24"/>
@@ -6631,7 +6885,7 @@
         </w:rPr>
         <w:t>in the US Mid-South</w:t>
       </w:r>
-      <w:ins w:id="28" w:author="Elvis F. Elli" w:date="2026-06-09T11:01:00Z" w16du:dateUtc="2026-06-09T16:01:00Z">
+      <w:ins w:id="48" w:author="Elvis F. Elli" w:date="2026-06-09T11:01:00Z" w16du:dateUtc="2026-06-09T16:01:00Z">
         <w:r>
           <w:rPr>
             <w:rFonts w:ascii="Times New Roman" w:hAnsi="Times New Roman" w:cs="Times New Roman"/>
@@ -6671,7 +6925,7 @@
           <w:t xml:space="preserve"> LM &amp; ES represent the combined effect of a late-maturing variety and early sowing.</w:t>
         </w:r>
       </w:ins>
-      <w:del w:id="29" w:author="Elvis F. Elli" w:date="2026-06-09T11:01:00Z" w16du:dateUtc="2026-06-09T16:01:00Z">
+      <w:del w:id="49" w:author="Elvis F. Elli" w:date="2026-06-09T11:01:00Z" w16du:dateUtc="2026-06-09T16:01:00Z">
         <w:r>
           <w:rPr>
             <w:rFonts w:ascii="Times New Roman" w:hAnsi="Times New Roman" w:cs="Times New Roman"/>
@@ -6685,15 +6939,25 @@
     <w:p>
       <w:pPr>
         <w:spacing w:before="120" w:after="0" w:line="480" w:lineRule="auto"/>
+        <w:rPr>
+          <w:rFonts w:ascii="Times New Roman" w:hAnsi="Times New Roman" w:cs="Times New Roman"/>
+          <w:sz w:val="24"/>
+          <w:szCs w:val="24"/>
+        </w:rPr>
+      </w:pPr>
+    </w:p>
+    <w:p>
+      <w:pPr>
+        <w:spacing w:before="120" w:after="0" w:line="480" w:lineRule="auto"/>
         <w:jc w:val="center"/>
         <w:rPr>
-          <w:ins w:id="30" w:author="Elvis F. Elli" w:date="2026-06-11T10:26:00Z" w16du:dateUtc="2026-06-11T15:26:00Z"/>
+          <w:ins w:id="50" w:author="Elvis F. Elli" w:date="2026-06-11T10:26:00Z" w16du:dateUtc="2026-06-11T15:26:00Z"/>
           <w:rFonts w:ascii="Times New Roman" w:hAnsi="Times New Roman" w:cs="Times New Roman"/>
           <w:sz w:val="24"/>
           <w:szCs w:val="24"/>
         </w:rPr>
       </w:pPr>
-      <w:ins w:id="31" w:author="Elvis F. Elli" w:date="2026-06-11T10:26:00Z" w16du:dateUtc="2026-06-11T15:26:00Z">
+      <w:ins w:id="51" w:author="Elvis F. Elli" w:date="2026-06-11T10:26:00Z" w16du:dateUtc="2026-06-11T15:26:00Z">
         <w:r>
           <w:rPr>
             <w:noProof/>
@@ -6754,13 +7018,13 @@
       <w:pPr>
         <w:spacing w:before="120" w:after="0" w:line="480" w:lineRule="auto"/>
         <w:rPr>
-          <w:ins w:id="32" w:author="Elvis F. Elli" w:date="2026-06-11T10:26:00Z" w16du:dateUtc="2026-06-11T15:26:00Z"/>
+          <w:ins w:id="52" w:author="Elvis F. Elli" w:date="2026-06-11T10:26:00Z" w16du:dateUtc="2026-06-11T15:26:00Z"/>
           <w:rFonts w:ascii="Times New Roman" w:hAnsi="Times New Roman" w:cs="Times New Roman"/>
           <w:sz w:val="24"/>
           <w:szCs w:val="24"/>
         </w:rPr>
       </w:pPr>
-      <w:ins w:id="33" w:author="Elvis F. Elli" w:date="2026-06-11T10:26:00Z" w16du:dateUtc="2026-06-11T15:26:00Z">
+      <w:ins w:id="53" w:author="Elvis F. Elli" w:date="2026-06-11T10:26:00Z" w16du:dateUtc="2026-06-11T15:26:00Z">
         <w:r>
           <w:rPr>
             <w:rFonts w:ascii="Times New Roman" w:hAnsi="Times New Roman" w:cs="Times New Roman"/>
@@ -7162,7 +7426,35 @@
           <w:sz w:val="24"/>
           <w:szCs w:val="24"/>
         </w:rPr>
-        <w:t xml:space="preserve">. The standalone strategy of using a </w:t>
+        <w:t xml:space="preserve">. </w:t>
+      </w:r>
+      <w:ins w:id="54" w:author="Elvis F. Elli" w:date="2026-06-11T12:06:00Z" w16du:dateUtc="2026-06-11T17:06:00Z">
+        <w:r>
+          <w:rPr>
+            <w:rFonts w:ascii="Times New Roman" w:hAnsi="Times New Roman" w:cs="Times New Roman"/>
+            <w:sz w:val="24"/>
+            <w:szCs w:val="24"/>
+          </w:rPr>
+          <w:t xml:space="preserve">The combined adaptive scenario extended seed-filling period on average by 12 </w:t>
+        </w:r>
+      </w:ins>
+      <w:ins w:id="55" w:author="Elvis F. Elli" w:date="2026-06-11T12:07:00Z" w16du:dateUtc="2026-06-11T17:07:00Z">
+        <w:r>
+          <w:rPr>
+            <w:rFonts w:ascii="Times New Roman" w:hAnsi="Times New Roman" w:cs="Times New Roman"/>
+            <w:sz w:val="24"/>
+            <w:szCs w:val="24"/>
+          </w:rPr>
+          <w:t xml:space="preserve">days (Figure 2). </w:t>
+        </w:r>
+      </w:ins>
+      <w:r>
+        <w:rPr>
+          <w:rFonts w:ascii="Times New Roman" w:hAnsi="Times New Roman" w:cs="Times New Roman"/>
+          <w:sz w:val="24"/>
+          <w:szCs w:val="24"/>
+        </w:rPr>
+        <w:t xml:space="preserve">The standalone strategy of using a </w:t>
       </w:r>
       <w:r>
         <w:rPr>
@@ -7300,7 +7592,7 @@
         </w:rPr>
         <w:t xml:space="preserve">, particularly those located in the central-north region (Figure </w:t>
       </w:r>
-      <w:del w:id="34" w:author="Elvis F. Elli" w:date="2026-06-09T11:02:00Z" w16du:dateUtc="2026-06-09T16:02:00Z">
+      <w:del w:id="56" w:author="Elvis F. Elli" w:date="2026-06-09T11:02:00Z" w16du:dateUtc="2026-06-09T16:02:00Z">
         <w:r>
           <w:rPr>
             <w:rFonts w:ascii="Times New Roman" w:hAnsi="Times New Roman" w:cs="Times New Roman"/>
@@ -7318,7 +7610,7 @@
           <w:delText>5</w:delText>
         </w:r>
       </w:del>
-      <w:ins w:id="35" w:author="Elvis F. Elli" w:date="2026-06-09T11:02:00Z" w16du:dateUtc="2026-06-09T16:02:00Z">
+      <w:ins w:id="57" w:author="Elvis F. Elli" w:date="2026-06-09T11:02:00Z" w16du:dateUtc="2026-06-09T16:02:00Z">
         <w:r>
           <w:rPr>
             <w:rFonts w:ascii="Times New Roman" w:hAnsi="Times New Roman" w:cs="Times New Roman"/>
@@ -7982,7 +8274,7 @@
         </w:rPr>
         <w:t xml:space="preserve">. </w:t>
       </w:r>
-      <w:ins w:id="36" w:author="Elvis F. Elli" w:date="2026-06-08T12:30:00Z" w16du:dateUtc="2026-06-08T17:30:00Z">
+      <w:ins w:id="58" w:author="Elvis F. Elli" w:date="2026-06-08T12:30:00Z" w16du:dateUtc="2026-06-08T17:30:00Z">
         <w:r>
           <w:rPr>
             <w:rFonts w:ascii="Times New Roman" w:hAnsi="Times New Roman" w:cs="Times New Roman"/>
@@ -8016,7 +8308,7 @@
           <w:t xml:space="preserve"> </w:t>
         </w:r>
       </w:ins>
-      <w:customXmlInsRangeStart w:id="37" w:author="Elvis F. Elli" w:date="2026-06-08T12:30:00Z"/>
+      <w:customXmlInsRangeStart w:id="59" w:author="Elvis F. Elli" w:date="2026-06-08T12:30:00Z"/>
       <w:sdt>
         <w:sdtPr>
           <w:rPr>
@@ -8032,7 +8324,7 @@
           </w:placeholder>
         </w:sdtPr>
         <w:sdtContent>
-          <w:customXmlInsRangeEnd w:id="37"/>
+          <w:customXmlInsRangeEnd w:id="59"/>
           <w:r>
             <w:rPr>
               <w:rFonts w:ascii="Times New Roman" w:hAnsi="Times New Roman" w:cs="Times New Roman"/>
@@ -8042,11 +8334,11 @@
             </w:rPr>
             <w:t>(Elli et al., 2022; Nendel et al., 2023)</w:t>
           </w:r>
-          <w:customXmlInsRangeStart w:id="38" w:author="Elvis F. Elli" w:date="2026-06-08T12:30:00Z"/>
+          <w:customXmlInsRangeStart w:id="60" w:author="Elvis F. Elli" w:date="2026-06-08T12:30:00Z"/>
         </w:sdtContent>
       </w:sdt>
-      <w:customXmlInsRangeEnd w:id="38"/>
-      <w:ins w:id="39" w:author="Elvis F. Elli" w:date="2026-06-08T12:30:00Z" w16du:dateUtc="2026-06-08T17:30:00Z">
+      <w:customXmlInsRangeEnd w:id="60"/>
+      <w:ins w:id="61" w:author="Elvis F. Elli" w:date="2026-06-08T12:30:00Z" w16du:dateUtc="2026-06-08T17:30:00Z">
         <w:r>
           <w:rPr>
             <w:rFonts w:ascii="Times New Roman" w:hAnsi="Times New Roman" w:cs="Times New Roman"/>
@@ -8425,7 +8717,7 @@
         </w:rPr>
         <w:t xml:space="preserve">. </w:t>
       </w:r>
-      <w:ins w:id="40" w:author="Elvis F. Elli" w:date="2026-06-08T12:31:00Z" w16du:dateUtc="2026-06-08T17:31:00Z">
+      <w:ins w:id="62" w:author="Elvis F. Elli" w:date="2026-06-08T12:31:00Z" w16du:dateUtc="2026-06-08T17:31:00Z">
         <w:r>
           <w:rPr>
             <w:rFonts w:ascii="Times New Roman" w:hAnsi="Times New Roman" w:cs="Times New Roman"/>
@@ -9977,7 +10269,7 @@
         </w:rPr>
         <w:t>high</w:t>
       </w:r>
-      <w:del w:id="41" w:author="Elvis F. Elli" w:date="2026-06-09T11:14:00Z" w16du:dateUtc="2026-06-09T16:14:00Z">
+      <w:del w:id="63" w:author="Elvis F. Elli" w:date="2026-06-09T11:14:00Z" w16du:dateUtc="2026-06-09T16:14:00Z">
         <w:r>
           <w:rPr>
             <w:rFonts w:ascii="Times New Roman" w:hAnsi="Times New Roman" w:cs="Times New Roman"/>
@@ -10004,7 +10296,7 @@
         </w:rPr>
         <w:t xml:space="preserve"> risks</w:t>
       </w:r>
-      <w:ins w:id="42" w:author="Elvis F. Elli" w:date="2026-06-09T11:13:00Z" w16du:dateUtc="2026-06-09T16:13:00Z">
+      <w:ins w:id="64" w:author="Elvis F. Elli" w:date="2026-06-09T11:13:00Z" w16du:dateUtc="2026-06-09T16:13:00Z">
         <w:r>
           <w:rPr>
             <w:rFonts w:ascii="Times New Roman" w:hAnsi="Times New Roman" w:cs="Times New Roman"/>
@@ -10014,7 +10306,7 @@
           <w:t xml:space="preserve">, providing </w:t>
         </w:r>
       </w:ins>
-      <w:ins w:id="43" w:author="Elvis F. Elli" w:date="2026-06-09T11:14:00Z" w16du:dateUtc="2026-06-09T16:14:00Z">
+      <w:ins w:id="65" w:author="Elvis F. Elli" w:date="2026-06-09T11:14:00Z" w16du:dateUtc="2026-06-09T16:14:00Z">
         <w:r>
           <w:rPr>
             <w:rFonts w:ascii="Times New Roman" w:hAnsi="Times New Roman" w:cs="Times New Roman"/>
@@ -10024,7 +10316,7 @@
           <w:t xml:space="preserve">new </w:t>
         </w:r>
       </w:ins>
-      <w:ins w:id="44" w:author="Elvis F. Elli" w:date="2026-06-09T11:13:00Z" w16du:dateUtc="2026-06-09T16:13:00Z">
+      <w:ins w:id="66" w:author="Elvis F. Elli" w:date="2026-06-09T11:13:00Z" w16du:dateUtc="2026-06-09T16:13:00Z">
         <w:r>
           <w:rPr>
             <w:rFonts w:ascii="Times New Roman" w:hAnsi="Times New Roman" w:cs="Times New Roman"/>
@@ -10034,7 +10326,7 @@
           <w:t xml:space="preserve">quantitative </w:t>
         </w:r>
       </w:ins>
-      <w:ins w:id="45" w:author="Elvis F. Elli" w:date="2026-06-09T11:14:00Z" w16du:dateUtc="2026-06-09T16:14:00Z">
+      <w:ins w:id="67" w:author="Elvis F. Elli" w:date="2026-06-09T11:14:00Z" w16du:dateUtc="2026-06-09T16:14:00Z">
         <w:r>
           <w:rPr>
             <w:rFonts w:ascii="Times New Roman" w:hAnsi="Times New Roman" w:cs="Times New Roman"/>
@@ -10044,7 +10336,7 @@
           <w:t xml:space="preserve">evidence </w:t>
         </w:r>
       </w:ins>
-      <w:ins w:id="46" w:author="Elvis F. Elli" w:date="2026-06-09T11:13:00Z" w16du:dateUtc="2026-06-09T16:13:00Z">
+      <w:ins w:id="68" w:author="Elvis F. Elli" w:date="2026-06-09T11:13:00Z" w16du:dateUtc="2026-06-09T16:13:00Z">
         <w:r>
           <w:rPr>
             <w:rFonts w:ascii="Times New Roman" w:hAnsi="Times New Roman" w:cs="Times New Roman"/>
@@ -10054,7 +10346,7 @@
           <w:t xml:space="preserve">for the irrigated Arkansas delta that </w:t>
         </w:r>
       </w:ins>
-      <w:ins w:id="47" w:author="Elvis F. Elli" w:date="2026-06-09T11:15:00Z" w16du:dateUtc="2026-06-09T16:15:00Z">
+      <w:ins w:id="69" w:author="Elvis F. Elli" w:date="2026-06-09T11:15:00Z" w16du:dateUtc="2026-06-09T16:15:00Z">
         <w:r>
           <w:rPr>
             <w:rFonts w:ascii="Times New Roman" w:hAnsi="Times New Roman" w:cs="Times New Roman"/>
@@ -10064,7 +10356,7 @@
           <w:t>extends</w:t>
         </w:r>
       </w:ins>
-      <w:ins w:id="48" w:author="Elvis F. Elli" w:date="2026-06-09T11:13:00Z" w16du:dateUtc="2026-06-09T16:13:00Z">
+      <w:ins w:id="70" w:author="Elvis F. Elli" w:date="2026-06-09T11:13:00Z" w16du:dateUtc="2026-06-09T16:13:00Z">
         <w:r>
           <w:rPr>
             <w:rFonts w:ascii="Times New Roman" w:hAnsi="Times New Roman" w:cs="Times New Roman"/>
@@ -10074,7 +10366,7 @@
           <w:t xml:space="preserve"> </w:t>
         </w:r>
       </w:ins>
-      <w:ins w:id="49" w:author="Elvis F. Elli" w:date="2026-06-09T11:14:00Z" w16du:dateUtc="2026-06-09T16:14:00Z">
+      <w:ins w:id="71" w:author="Elvis F. Elli" w:date="2026-06-09T11:14:00Z" w16du:dateUtc="2026-06-09T16:14:00Z">
         <w:r>
           <w:rPr>
             <w:rFonts w:ascii="Times New Roman" w:hAnsi="Times New Roman" w:cs="Times New Roman"/>
@@ -15554,7 +15846,6 @@
     <w:rsid w:val="001A5E80"/>
     <w:rsid w:val="001B38E1"/>
     <w:rsid w:val="001D298D"/>
-    <w:rsid w:val="00203205"/>
     <w:rsid w:val="0024394A"/>
     <w:rsid w:val="00257DF2"/>
     <w:rsid w:val="00290619"/>
@@ -15564,6 +15855,7 @@
     <w:rsid w:val="002C74D3"/>
     <w:rsid w:val="00311B29"/>
     <w:rsid w:val="00330CA9"/>
+    <w:rsid w:val="00343661"/>
     <w:rsid w:val="003466F5"/>
     <w:rsid w:val="003B7BEE"/>
     <w:rsid w:val="004A5FDA"/>

</xml_diff>

<commit_message>
Add progress data and analysis script
Import USDA-NASS progress data and add an R analysis script to compute 50% dates for sowing and flowering. Added data/raw/progress.xlsx and code/utils/50%progress.R (implements data cleaning, logistic fits, slope estimates, and plotting). Updated .Rproj.user entries (sources/prop/* and INDEX) and adjusted RStudio window layout state. Also updated paper and supplementary Word documents and added temporary Word files.
</commit_message>
<xml_diff>
--- a/paper/paper-04-01-2026.docx
+++ b/paper/paper-04-01-2026.docx
@@ -900,6 +900,7 @@
       <w:pPr>
         <w:spacing w:before="120" w:after="0" w:line="480" w:lineRule="auto"/>
         <w:rPr>
+          <w:del w:id="4" w:author="Elvis F. Elli" w:date="2026-06-12T08:33:00Z" w16du:dateUtc="2026-06-12T13:33:00Z"/>
           <w:rFonts w:ascii="Times New Roman" w:hAnsi="Times New Roman" w:cs="Times New Roman"/>
           <w:sz w:val="24"/>
           <w:szCs w:val="24"/>
@@ -1151,341 +1152,347 @@
         </w:rPr>
         <w:t xml:space="preserve">. </w:t>
       </w:r>
-      <w:r>
-        <w:rPr>
-          <w:rFonts w:ascii="Times New Roman" w:hAnsi="Times New Roman" w:cs="Times New Roman"/>
-          <w:color w:val="000000"/>
-          <w:sz w:val="24"/>
-          <w:szCs w:val="24"/>
-        </w:rPr>
-        <w:t>Yet</w:t>
-      </w:r>
-      <w:r>
-        <w:rPr>
-          <w:rFonts w:ascii="Times New Roman" w:hAnsi="Times New Roman" w:cs="Times New Roman"/>
-          <w:color w:val="000000"/>
-          <w:sz w:val="24"/>
-          <w:szCs w:val="24"/>
-        </w:rPr>
-        <w:t>,</w:t>
-      </w:r>
-      <w:r>
-        <w:rPr>
-          <w:rFonts w:ascii="Times New Roman" w:hAnsi="Times New Roman" w:cs="Times New Roman"/>
-          <w:color w:val="000000"/>
-          <w:sz w:val="24"/>
-          <w:szCs w:val="24"/>
-        </w:rPr>
-        <w:t xml:space="preserve"> i</w:t>
-      </w:r>
-      <w:r>
-        <w:rPr>
-          <w:rFonts w:ascii="Times New Roman" w:hAnsi="Times New Roman" w:cs="Times New Roman"/>
-          <w:sz w:val="24"/>
-          <w:szCs w:val="24"/>
-        </w:rPr>
-        <w:t xml:space="preserve">t </w:t>
-      </w:r>
-      <w:r>
-        <w:rPr>
-          <w:rFonts w:ascii="Times New Roman" w:hAnsi="Times New Roman" w:cs="Times New Roman"/>
-          <w:sz w:val="24"/>
-          <w:szCs w:val="24"/>
-        </w:rPr>
-        <w:t>remains</w:t>
-      </w:r>
-      <w:r>
-        <w:rPr>
-          <w:rFonts w:ascii="Times New Roman" w:hAnsi="Times New Roman" w:cs="Times New Roman"/>
-          <w:sz w:val="24"/>
-          <w:szCs w:val="24"/>
-        </w:rPr>
-        <w:t xml:space="preserve"> unclear how </w:t>
-      </w:r>
-      <w:r>
-        <w:rPr>
-          <w:rFonts w:ascii="Times New Roman" w:hAnsi="Times New Roman" w:cs="Times New Roman"/>
-          <w:sz w:val="24"/>
-          <w:szCs w:val="24"/>
-        </w:rPr>
-        <w:t xml:space="preserve">concurrent alterations in soybean maturity group and sowing date </w:t>
-      </w:r>
-      <w:r>
-        <w:rPr>
-          <w:rFonts w:ascii="Times New Roman" w:hAnsi="Times New Roman" w:cs="Times New Roman"/>
-          <w:sz w:val="24"/>
-          <w:szCs w:val="24"/>
-        </w:rPr>
-        <w:t xml:space="preserve">will </w:t>
-      </w:r>
-      <w:r>
-        <w:rPr>
-          <w:rFonts w:ascii="Times New Roman" w:hAnsi="Times New Roman" w:cs="Times New Roman"/>
-          <w:sz w:val="24"/>
-          <w:szCs w:val="24"/>
-        </w:rPr>
-        <w:t>affect</w:t>
-      </w:r>
-      <w:r>
-        <w:rPr>
-          <w:rFonts w:ascii="Times New Roman" w:hAnsi="Times New Roman" w:cs="Times New Roman"/>
-          <w:sz w:val="24"/>
-          <w:szCs w:val="24"/>
-        </w:rPr>
-        <w:t xml:space="preserve"> yields</w:t>
-      </w:r>
-      <w:r>
-        <w:rPr>
-          <w:rFonts w:ascii="Times New Roman" w:hAnsi="Times New Roman" w:cs="Times New Roman"/>
-          <w:sz w:val="24"/>
-          <w:szCs w:val="24"/>
-        </w:rPr>
-        <w:t xml:space="preserve">, </w:t>
-      </w:r>
-      <w:r>
-        <w:rPr>
-          <w:rFonts w:ascii="Times New Roman" w:hAnsi="Times New Roman" w:cs="Times New Roman"/>
-          <w:sz w:val="24"/>
-          <w:szCs w:val="24"/>
-        </w:rPr>
-        <w:t xml:space="preserve">and </w:t>
-      </w:r>
-      <w:r>
-        <w:rPr>
-          <w:rFonts w:ascii="Times New Roman" w:hAnsi="Times New Roman" w:cs="Times New Roman"/>
-          <w:sz w:val="24"/>
-          <w:szCs w:val="24"/>
-        </w:rPr>
-        <w:t>w</w:t>
-      </w:r>
-      <w:r>
-        <w:rPr>
-          <w:rFonts w:ascii="Times New Roman" w:hAnsi="Times New Roman" w:cs="Times New Roman"/>
-          <w:sz w:val="24"/>
-          <w:szCs w:val="24"/>
-        </w:rPr>
-        <w:t>hether existing</w:t>
-      </w:r>
-      <w:r>
-        <w:rPr>
-          <w:rFonts w:ascii="Times New Roman" w:hAnsi="Times New Roman" w:cs="Times New Roman"/>
-          <w:sz w:val="24"/>
-          <w:szCs w:val="24"/>
-        </w:rPr>
-        <w:t xml:space="preserve"> genoty</w:t>
-      </w:r>
-      <w:r>
-        <w:rPr>
-          <w:rFonts w:ascii="Times New Roman" w:hAnsi="Times New Roman" w:cs="Times New Roman"/>
-          <w:sz w:val="24"/>
-          <w:szCs w:val="24"/>
-        </w:rPr>
-        <w:t>pic</w:t>
-      </w:r>
-      <w:r>
-        <w:rPr>
-          <w:rFonts w:ascii="Times New Roman" w:hAnsi="Times New Roman" w:cs="Times New Roman"/>
-          <w:sz w:val="24"/>
-          <w:szCs w:val="24"/>
-        </w:rPr>
-        <w:t xml:space="preserve"> availability and </w:t>
-      </w:r>
-      <w:r>
-        <w:rPr>
-          <w:rFonts w:ascii="Times New Roman" w:hAnsi="Times New Roman" w:cs="Times New Roman"/>
-          <w:sz w:val="24"/>
-          <w:szCs w:val="24"/>
-        </w:rPr>
-        <w:t>planting date</w:t>
-      </w:r>
-      <w:r>
-        <w:rPr>
-          <w:rFonts w:ascii="Times New Roman" w:hAnsi="Times New Roman" w:cs="Times New Roman"/>
-          <w:sz w:val="24"/>
-          <w:szCs w:val="24"/>
-        </w:rPr>
-        <w:t xml:space="preserve"> flexibility are</w:t>
-      </w:r>
-      <w:r>
-        <w:rPr>
-          <w:rFonts w:ascii="Times New Roman" w:hAnsi="Times New Roman" w:cs="Times New Roman"/>
-          <w:sz w:val="24"/>
-          <w:szCs w:val="24"/>
-        </w:rPr>
-        <w:t xml:space="preserve"> sufficient to offset </w:t>
-      </w:r>
-      <w:r>
-        <w:rPr>
-          <w:rFonts w:ascii="Times New Roman" w:hAnsi="Times New Roman" w:cs="Times New Roman"/>
-          <w:sz w:val="24"/>
-          <w:szCs w:val="24"/>
-        </w:rPr>
-        <w:t xml:space="preserve">the </w:t>
-      </w:r>
-      <w:r>
-        <w:rPr>
-          <w:rFonts w:ascii="Times New Roman" w:hAnsi="Times New Roman" w:cs="Times New Roman"/>
-          <w:sz w:val="24"/>
-          <w:szCs w:val="24"/>
-        </w:rPr>
-        <w:t xml:space="preserve">negative effects </w:t>
-      </w:r>
-      <w:r>
-        <w:rPr>
-          <w:rFonts w:ascii="Times New Roman" w:hAnsi="Times New Roman" w:cs="Times New Roman"/>
-          <w:sz w:val="24"/>
-          <w:szCs w:val="24"/>
-        </w:rPr>
-        <w:t>of high temperatures</w:t>
-      </w:r>
-      <w:r>
-        <w:rPr>
-          <w:rFonts w:ascii="Times New Roman" w:hAnsi="Times New Roman" w:cs="Times New Roman"/>
-          <w:sz w:val="24"/>
-          <w:szCs w:val="24"/>
-        </w:rPr>
-        <w:t xml:space="preserve">. </w:t>
-      </w:r>
-      <w:r>
-        <w:rPr>
-          <w:rFonts w:ascii="Times New Roman" w:hAnsi="Times New Roman" w:cs="Times New Roman"/>
-          <w:sz w:val="24"/>
-          <w:szCs w:val="24"/>
-        </w:rPr>
-        <w:t>This</w:t>
-      </w:r>
-      <w:r>
-        <w:rPr>
-          <w:rFonts w:ascii="Times New Roman" w:hAnsi="Times New Roman" w:cs="Times New Roman"/>
-          <w:sz w:val="24"/>
-          <w:szCs w:val="24"/>
-        </w:rPr>
-        <w:t xml:space="preserve"> study advances </w:t>
-      </w:r>
-      <w:r>
-        <w:rPr>
-          <w:rFonts w:ascii="Times New Roman" w:hAnsi="Times New Roman" w:cs="Times New Roman"/>
-          <w:sz w:val="24"/>
-          <w:szCs w:val="24"/>
-        </w:rPr>
-        <w:lastRenderedPageBreak/>
-        <w:t xml:space="preserve">our </w:t>
-      </w:r>
-      <w:r>
-        <w:rPr>
-          <w:rFonts w:ascii="Times New Roman" w:hAnsi="Times New Roman" w:cs="Times New Roman"/>
-          <w:sz w:val="24"/>
-          <w:szCs w:val="24"/>
-        </w:rPr>
-        <w:t xml:space="preserve">understanding of </w:t>
-      </w:r>
-      <w:r>
-        <w:rPr>
-          <w:rFonts w:ascii="Times New Roman" w:hAnsi="Times New Roman" w:cs="Times New Roman"/>
-          <w:sz w:val="24"/>
-          <w:szCs w:val="24"/>
-        </w:rPr>
-        <w:t xml:space="preserve">how </w:t>
-      </w:r>
-      <w:r>
-        <w:rPr>
-          <w:rFonts w:ascii="Times New Roman" w:hAnsi="Times New Roman" w:cs="Times New Roman"/>
-          <w:sz w:val="24"/>
-          <w:szCs w:val="24"/>
-        </w:rPr>
-        <w:t xml:space="preserve">stacked agronomic management </w:t>
-      </w:r>
-      <w:r>
-        <w:rPr>
-          <w:rFonts w:ascii="Times New Roman" w:hAnsi="Times New Roman" w:cs="Times New Roman"/>
-          <w:sz w:val="24"/>
-          <w:szCs w:val="24"/>
-        </w:rPr>
-        <w:t xml:space="preserve">strategies </w:t>
-      </w:r>
-      <w:r>
-        <w:rPr>
-          <w:rFonts w:ascii="Times New Roman" w:hAnsi="Times New Roman" w:cs="Times New Roman"/>
-          <w:sz w:val="24"/>
-          <w:szCs w:val="24"/>
-        </w:rPr>
-        <w:t xml:space="preserve">influence soybean yield under </w:t>
-      </w:r>
-      <w:r>
-        <w:rPr>
-          <w:rFonts w:ascii="Times New Roman" w:hAnsi="Times New Roman" w:cs="Times New Roman"/>
-          <w:sz w:val="24"/>
-          <w:szCs w:val="24"/>
-        </w:rPr>
-        <w:t>elevated temperature</w:t>
-      </w:r>
-      <w:r>
-        <w:rPr>
-          <w:rFonts w:ascii="Times New Roman" w:hAnsi="Times New Roman" w:cs="Times New Roman"/>
-          <w:sz w:val="24"/>
-          <w:szCs w:val="24"/>
-        </w:rPr>
-        <w:t xml:space="preserve"> </w:t>
-      </w:r>
-      <w:r>
-        <w:rPr>
-          <w:rFonts w:ascii="Times New Roman" w:hAnsi="Times New Roman" w:cs="Times New Roman"/>
-          <w:sz w:val="24"/>
-          <w:szCs w:val="24"/>
-        </w:rPr>
-        <w:t>in the</w:t>
-      </w:r>
-      <w:r>
-        <w:rPr>
-          <w:rFonts w:ascii="Times New Roman" w:hAnsi="Times New Roman" w:cs="Times New Roman"/>
-          <w:sz w:val="24"/>
-          <w:szCs w:val="24"/>
-        </w:rPr>
-        <w:t xml:space="preserve"> U.S. Midsouth, </w:t>
-      </w:r>
-      <w:r>
-        <w:rPr>
-          <w:rFonts w:ascii="Times New Roman" w:hAnsi="Times New Roman" w:cs="Times New Roman"/>
-          <w:sz w:val="24"/>
-          <w:szCs w:val="24"/>
-        </w:rPr>
-        <w:t xml:space="preserve">a </w:t>
-      </w:r>
-      <w:r>
-        <w:rPr>
-          <w:rFonts w:ascii="Times New Roman" w:hAnsi="Times New Roman" w:cs="Times New Roman"/>
-          <w:sz w:val="24"/>
-          <w:szCs w:val="24"/>
-        </w:rPr>
-        <w:t xml:space="preserve">region particularly </w:t>
-      </w:r>
-      <w:r>
-        <w:rPr>
-          <w:rFonts w:ascii="Times New Roman" w:hAnsi="Times New Roman" w:cs="Times New Roman"/>
-          <w:sz w:val="24"/>
-          <w:szCs w:val="24"/>
-        </w:rPr>
-        <w:t>vulnerable to global warming</w:t>
-      </w:r>
-      <w:r>
-        <w:rPr>
-          <w:rFonts w:ascii="Times New Roman" w:hAnsi="Times New Roman" w:cs="Times New Roman"/>
-          <w:sz w:val="24"/>
-          <w:szCs w:val="24"/>
-        </w:rPr>
-        <w:t>.</w:t>
-      </w:r>
-      <w:ins w:id="4" w:author="Elvis F. Elli" w:date="2026-06-08T10:35:00Z" w16du:dateUtc="2026-06-08T15:35:00Z">
-        <w:r>
-          <w:rPr>
-            <w:rFonts w:ascii="Times New Roman" w:hAnsi="Times New Roman" w:cs="Times New Roman"/>
-            <w:sz w:val="24"/>
-            <w:szCs w:val="24"/>
-          </w:rPr>
-          <w:t xml:space="preserve"> While </w:t>
+      <w:del w:id="5" w:author="Elvis F. Elli" w:date="2026-06-12T08:33:00Z" w16du:dateUtc="2026-06-12T13:33:00Z">
+        <w:r>
+          <w:rPr>
+            <w:rFonts w:ascii="Times New Roman" w:hAnsi="Times New Roman" w:cs="Times New Roman"/>
+            <w:color w:val="000000"/>
+            <w:sz w:val="24"/>
+            <w:szCs w:val="24"/>
+          </w:rPr>
+          <w:delText>Yet</w:delText>
+        </w:r>
+        <w:r>
+          <w:rPr>
+            <w:rFonts w:ascii="Times New Roman" w:hAnsi="Times New Roman" w:cs="Times New Roman"/>
+            <w:color w:val="000000"/>
+            <w:sz w:val="24"/>
+            <w:szCs w:val="24"/>
+          </w:rPr>
+          <w:delText>,</w:delText>
+        </w:r>
+        <w:r>
+          <w:rPr>
+            <w:rFonts w:ascii="Times New Roman" w:hAnsi="Times New Roman" w:cs="Times New Roman"/>
+            <w:color w:val="000000"/>
+            <w:sz w:val="24"/>
+            <w:szCs w:val="24"/>
+          </w:rPr>
+          <w:delText xml:space="preserve"> i</w:delText>
+        </w:r>
+        <w:r>
+          <w:rPr>
+            <w:rFonts w:ascii="Times New Roman" w:hAnsi="Times New Roman" w:cs="Times New Roman"/>
+            <w:sz w:val="24"/>
+            <w:szCs w:val="24"/>
+          </w:rPr>
+          <w:delText xml:space="preserve">t </w:delText>
+        </w:r>
+        <w:r>
+          <w:rPr>
+            <w:rFonts w:ascii="Times New Roman" w:hAnsi="Times New Roman" w:cs="Times New Roman"/>
+            <w:sz w:val="24"/>
+            <w:szCs w:val="24"/>
+          </w:rPr>
+          <w:delText>remains</w:delText>
+        </w:r>
+        <w:r>
+          <w:rPr>
+            <w:rFonts w:ascii="Times New Roman" w:hAnsi="Times New Roman" w:cs="Times New Roman"/>
+            <w:sz w:val="24"/>
+            <w:szCs w:val="24"/>
+          </w:rPr>
+          <w:delText xml:space="preserve"> unclear how </w:delText>
+        </w:r>
+        <w:r>
+          <w:rPr>
+            <w:rFonts w:ascii="Times New Roman" w:hAnsi="Times New Roman" w:cs="Times New Roman"/>
+            <w:sz w:val="24"/>
+            <w:szCs w:val="24"/>
+          </w:rPr>
+          <w:delText xml:space="preserve">concurrent alterations in soybean maturity group and sowing date </w:delText>
+        </w:r>
+        <w:r>
+          <w:rPr>
+            <w:rFonts w:ascii="Times New Roman" w:hAnsi="Times New Roman" w:cs="Times New Roman"/>
+            <w:sz w:val="24"/>
+            <w:szCs w:val="24"/>
+          </w:rPr>
+          <w:delText xml:space="preserve">will </w:delText>
+        </w:r>
+        <w:r>
+          <w:rPr>
+            <w:rFonts w:ascii="Times New Roman" w:hAnsi="Times New Roman" w:cs="Times New Roman"/>
+            <w:sz w:val="24"/>
+            <w:szCs w:val="24"/>
+          </w:rPr>
+          <w:delText>affect</w:delText>
+        </w:r>
+        <w:r>
+          <w:rPr>
+            <w:rFonts w:ascii="Times New Roman" w:hAnsi="Times New Roman" w:cs="Times New Roman"/>
+            <w:sz w:val="24"/>
+            <w:szCs w:val="24"/>
+          </w:rPr>
+          <w:delText xml:space="preserve"> yields</w:delText>
+        </w:r>
+        <w:r>
+          <w:rPr>
+            <w:rFonts w:ascii="Times New Roman" w:hAnsi="Times New Roman" w:cs="Times New Roman"/>
+            <w:sz w:val="24"/>
+            <w:szCs w:val="24"/>
+          </w:rPr>
+          <w:delText xml:space="preserve">, </w:delText>
+        </w:r>
+        <w:r>
+          <w:rPr>
+            <w:rFonts w:ascii="Times New Roman" w:hAnsi="Times New Roman" w:cs="Times New Roman"/>
+            <w:sz w:val="24"/>
+            <w:szCs w:val="24"/>
+          </w:rPr>
+          <w:delText xml:space="preserve">and </w:delText>
+        </w:r>
+        <w:r>
+          <w:rPr>
+            <w:rFonts w:ascii="Times New Roman" w:hAnsi="Times New Roman" w:cs="Times New Roman"/>
+            <w:sz w:val="24"/>
+            <w:szCs w:val="24"/>
+          </w:rPr>
+          <w:delText>w</w:delText>
+        </w:r>
+        <w:r>
+          <w:rPr>
+            <w:rFonts w:ascii="Times New Roman" w:hAnsi="Times New Roman" w:cs="Times New Roman"/>
+            <w:sz w:val="24"/>
+            <w:szCs w:val="24"/>
+          </w:rPr>
+          <w:delText>hether existing</w:delText>
+        </w:r>
+        <w:r>
+          <w:rPr>
+            <w:rFonts w:ascii="Times New Roman" w:hAnsi="Times New Roman" w:cs="Times New Roman"/>
+            <w:sz w:val="24"/>
+            <w:szCs w:val="24"/>
+          </w:rPr>
+          <w:delText xml:space="preserve"> genoty</w:delText>
+        </w:r>
+        <w:r>
+          <w:rPr>
+            <w:rFonts w:ascii="Times New Roman" w:hAnsi="Times New Roman" w:cs="Times New Roman"/>
+            <w:sz w:val="24"/>
+            <w:szCs w:val="24"/>
+          </w:rPr>
+          <w:delText>pic</w:delText>
+        </w:r>
+        <w:r>
+          <w:rPr>
+            <w:rFonts w:ascii="Times New Roman" w:hAnsi="Times New Roman" w:cs="Times New Roman"/>
+            <w:sz w:val="24"/>
+            <w:szCs w:val="24"/>
+          </w:rPr>
+          <w:delText xml:space="preserve"> availability and </w:delText>
+        </w:r>
+        <w:r>
+          <w:rPr>
+            <w:rFonts w:ascii="Times New Roman" w:hAnsi="Times New Roman" w:cs="Times New Roman"/>
+            <w:sz w:val="24"/>
+            <w:szCs w:val="24"/>
+          </w:rPr>
+          <w:delText>planting date</w:delText>
+        </w:r>
+        <w:r>
+          <w:rPr>
+            <w:rFonts w:ascii="Times New Roman" w:hAnsi="Times New Roman" w:cs="Times New Roman"/>
+            <w:sz w:val="24"/>
+            <w:szCs w:val="24"/>
+          </w:rPr>
+          <w:delText xml:space="preserve"> flexibility are</w:delText>
+        </w:r>
+        <w:r>
+          <w:rPr>
+            <w:rFonts w:ascii="Times New Roman" w:hAnsi="Times New Roman" w:cs="Times New Roman"/>
+            <w:sz w:val="24"/>
+            <w:szCs w:val="24"/>
+          </w:rPr>
+          <w:delText xml:space="preserve"> sufficient to offset </w:delText>
+        </w:r>
+        <w:r>
+          <w:rPr>
+            <w:rFonts w:ascii="Times New Roman" w:hAnsi="Times New Roman" w:cs="Times New Roman"/>
+            <w:sz w:val="24"/>
+            <w:szCs w:val="24"/>
+          </w:rPr>
+          <w:delText xml:space="preserve">the </w:delText>
+        </w:r>
+        <w:r>
+          <w:rPr>
+            <w:rFonts w:ascii="Times New Roman" w:hAnsi="Times New Roman" w:cs="Times New Roman"/>
+            <w:sz w:val="24"/>
+            <w:szCs w:val="24"/>
+          </w:rPr>
+          <w:delText xml:space="preserve">negative effects </w:delText>
+        </w:r>
+        <w:r>
+          <w:rPr>
+            <w:rFonts w:ascii="Times New Roman" w:hAnsi="Times New Roman" w:cs="Times New Roman"/>
+            <w:sz w:val="24"/>
+            <w:szCs w:val="24"/>
+          </w:rPr>
+          <w:delText>of high temperatures</w:delText>
+        </w:r>
+        <w:r>
+          <w:rPr>
+            <w:rFonts w:ascii="Times New Roman" w:hAnsi="Times New Roman" w:cs="Times New Roman"/>
+            <w:sz w:val="24"/>
+            <w:szCs w:val="24"/>
+          </w:rPr>
+          <w:delText xml:space="preserve">. </w:delText>
+        </w:r>
+        <w:r>
+          <w:rPr>
+            <w:rFonts w:ascii="Times New Roman" w:hAnsi="Times New Roman" w:cs="Times New Roman"/>
+            <w:sz w:val="24"/>
+            <w:szCs w:val="24"/>
+          </w:rPr>
+          <w:delText>This</w:delText>
+        </w:r>
+        <w:r>
+          <w:rPr>
+            <w:rFonts w:ascii="Times New Roman" w:hAnsi="Times New Roman" w:cs="Times New Roman"/>
+            <w:sz w:val="24"/>
+            <w:szCs w:val="24"/>
+          </w:rPr>
+          <w:delText xml:space="preserve"> study advances </w:delText>
+        </w:r>
+      </w:del>
+      <w:del w:id="6" w:author="Elvis F. Elli" w:date="2026-06-12T08:30:00Z" w16du:dateUtc="2026-06-12T13:30:00Z">
+        <w:r>
+          <w:rPr>
+            <w:rFonts w:ascii="Times New Roman" w:hAnsi="Times New Roman" w:cs="Times New Roman"/>
+            <w:sz w:val="24"/>
+            <w:szCs w:val="24"/>
+          </w:rPr>
+          <w:lastRenderedPageBreak/>
+          <w:delText xml:space="preserve">our </w:delText>
+        </w:r>
+      </w:del>
+      <w:del w:id="7" w:author="Elvis F. Elli" w:date="2026-06-12T08:33:00Z" w16du:dateUtc="2026-06-12T13:33:00Z">
+        <w:r>
+          <w:rPr>
+            <w:rFonts w:ascii="Times New Roman" w:hAnsi="Times New Roman" w:cs="Times New Roman"/>
+            <w:sz w:val="24"/>
+            <w:szCs w:val="24"/>
+          </w:rPr>
+          <w:delText xml:space="preserve">understanding of </w:delText>
+        </w:r>
+        <w:r>
+          <w:rPr>
+            <w:rFonts w:ascii="Times New Roman" w:hAnsi="Times New Roman" w:cs="Times New Roman"/>
+            <w:sz w:val="24"/>
+            <w:szCs w:val="24"/>
+          </w:rPr>
+          <w:delText xml:space="preserve">how </w:delText>
+        </w:r>
+        <w:r>
+          <w:rPr>
+            <w:rFonts w:ascii="Times New Roman" w:hAnsi="Times New Roman" w:cs="Times New Roman"/>
+            <w:sz w:val="24"/>
+            <w:szCs w:val="24"/>
+          </w:rPr>
+          <w:delText xml:space="preserve">stacked agronomic management </w:delText>
+        </w:r>
+        <w:r>
+          <w:rPr>
+            <w:rFonts w:ascii="Times New Roman" w:hAnsi="Times New Roman" w:cs="Times New Roman"/>
+            <w:sz w:val="24"/>
+            <w:szCs w:val="24"/>
+          </w:rPr>
+          <w:delText xml:space="preserve">strategies </w:delText>
+        </w:r>
+        <w:r>
+          <w:rPr>
+            <w:rFonts w:ascii="Times New Roman" w:hAnsi="Times New Roman" w:cs="Times New Roman"/>
+            <w:sz w:val="24"/>
+            <w:szCs w:val="24"/>
+          </w:rPr>
+          <w:delText xml:space="preserve">influence soybean yield under </w:delText>
+        </w:r>
+        <w:r>
+          <w:rPr>
+            <w:rFonts w:ascii="Times New Roman" w:hAnsi="Times New Roman" w:cs="Times New Roman"/>
+            <w:sz w:val="24"/>
+            <w:szCs w:val="24"/>
+          </w:rPr>
+          <w:delText>elevated temperature</w:delText>
+        </w:r>
+        <w:r>
+          <w:rPr>
+            <w:rFonts w:ascii="Times New Roman" w:hAnsi="Times New Roman" w:cs="Times New Roman"/>
+            <w:sz w:val="24"/>
+            <w:szCs w:val="24"/>
+          </w:rPr>
+          <w:delText xml:space="preserve"> </w:delText>
+        </w:r>
+        <w:r>
+          <w:rPr>
+            <w:rFonts w:ascii="Times New Roman" w:hAnsi="Times New Roman" w:cs="Times New Roman"/>
+            <w:sz w:val="24"/>
+            <w:szCs w:val="24"/>
+          </w:rPr>
+          <w:delText>in the</w:delText>
+        </w:r>
+        <w:r>
+          <w:rPr>
+            <w:rFonts w:ascii="Times New Roman" w:hAnsi="Times New Roman" w:cs="Times New Roman"/>
+            <w:sz w:val="24"/>
+            <w:szCs w:val="24"/>
+          </w:rPr>
+          <w:delText xml:space="preserve"> U.S. Midsouth, </w:delText>
+        </w:r>
+        <w:r>
+          <w:rPr>
+            <w:rFonts w:ascii="Times New Roman" w:hAnsi="Times New Roman" w:cs="Times New Roman"/>
+            <w:sz w:val="24"/>
+            <w:szCs w:val="24"/>
+          </w:rPr>
+          <w:delText xml:space="preserve">a </w:delText>
+        </w:r>
+        <w:r>
+          <w:rPr>
+            <w:rFonts w:ascii="Times New Roman" w:hAnsi="Times New Roman" w:cs="Times New Roman"/>
+            <w:sz w:val="24"/>
+            <w:szCs w:val="24"/>
+          </w:rPr>
+          <w:delText xml:space="preserve">region particularly </w:delText>
+        </w:r>
+        <w:r>
+          <w:rPr>
+            <w:rFonts w:ascii="Times New Roman" w:hAnsi="Times New Roman" w:cs="Times New Roman"/>
+            <w:sz w:val="24"/>
+            <w:szCs w:val="24"/>
+          </w:rPr>
+          <w:delText>vulnerable to global warming</w:delText>
+        </w:r>
+        <w:r>
+          <w:rPr>
+            <w:rFonts w:ascii="Times New Roman" w:hAnsi="Times New Roman" w:cs="Times New Roman"/>
+            <w:sz w:val="24"/>
+            <w:szCs w:val="24"/>
+          </w:rPr>
+          <w:delText>.</w:delText>
+        </w:r>
+      </w:del>
+      <w:ins w:id="8" w:author="Elvis F. Elli" w:date="2026-06-08T10:35:00Z" w16du:dateUtc="2026-06-08T15:35:00Z">
+        <w:r>
+          <w:rPr>
+            <w:rFonts w:ascii="Times New Roman" w:hAnsi="Times New Roman" w:cs="Times New Roman"/>
+            <w:sz w:val="24"/>
+            <w:szCs w:val="24"/>
+          </w:rPr>
+          <w:t xml:space="preserve">While </w:t>
         </w:r>
       </w:ins>
-      <w:ins w:id="5" w:author="Elvis F. Elli" w:date="2026-06-08T10:36:00Z" w16du:dateUtc="2026-06-08T15:36:00Z">
+      <w:ins w:id="9" w:author="Elvis F. Elli" w:date="2026-06-08T10:36:00Z" w16du:dateUtc="2026-06-08T15:36:00Z">
         <w:r>
           <w:rPr>
             <w:rFonts w:ascii="Times New Roman" w:hAnsi="Times New Roman" w:cs="Times New Roman"/>
@@ -1495,7 +1502,7 @@
           <w:t xml:space="preserve">projected </w:t>
         </w:r>
       </w:ins>
-      <w:ins w:id="6" w:author="Elvis F. Elli" w:date="2026-06-08T10:35:00Z" w16du:dateUtc="2026-06-08T15:35:00Z">
+      <w:ins w:id="10" w:author="Elvis F. Elli" w:date="2026-06-08T10:35:00Z" w16du:dateUtc="2026-06-08T15:35:00Z">
         <w:r>
           <w:rPr>
             <w:rFonts w:ascii="Times New Roman" w:hAnsi="Times New Roman" w:cs="Times New Roman"/>
@@ -1519,10 +1526,30 @@
             <w:sz w:val="24"/>
             <w:szCs w:val="24"/>
           </w:rPr>
-          <w:t>] can offset heat-induced yield losses (Ainsworth et al., 2002; Kothari et al., 2022), complementary agronomic adaptation</w:t>
+          <w:t xml:space="preserve">] can </w:t>
         </w:r>
       </w:ins>
-      <w:ins w:id="7" w:author="Elvis F. Elli" w:date="2026-06-08T10:37:00Z" w16du:dateUtc="2026-06-08T15:37:00Z">
+      <w:ins w:id="11" w:author="Elvis F. Elli" w:date="2026-06-12T08:18:00Z" w16du:dateUtc="2026-06-12T13:18:00Z">
+        <w:r>
+          <w:rPr>
+            <w:rFonts w:ascii="Times New Roman" w:hAnsi="Times New Roman" w:cs="Times New Roman"/>
+            <w:sz w:val="24"/>
+            <w:szCs w:val="24"/>
+          </w:rPr>
+          <w:t xml:space="preserve">partially </w:t>
+        </w:r>
+      </w:ins>
+      <w:ins w:id="12" w:author="Elvis F. Elli" w:date="2026-06-08T10:35:00Z" w16du:dateUtc="2026-06-08T15:35:00Z">
+        <w:r>
+          <w:rPr>
+            <w:rFonts w:ascii="Times New Roman" w:hAnsi="Times New Roman" w:cs="Times New Roman"/>
+            <w:sz w:val="24"/>
+            <w:szCs w:val="24"/>
+          </w:rPr>
+          <w:t>offset heat-induced yield losses (Ainsworth et al., 2002; Kothari et al., 2022), complementary agronomic adaptation</w:t>
+        </w:r>
+      </w:ins>
+      <w:ins w:id="13" w:author="Elvis F. Elli" w:date="2026-06-08T10:37:00Z" w16du:dateUtc="2026-06-08T15:37:00Z">
         <w:r>
           <w:rPr>
             <w:rFonts w:ascii="Times New Roman" w:hAnsi="Times New Roman" w:cs="Times New Roman"/>
@@ -1532,7 +1559,7 @@
           <w:t xml:space="preserve"> may be needed </w:t>
         </w:r>
       </w:ins>
-      <w:ins w:id="8" w:author="Elvis F. Elli" w:date="2026-06-08T10:38:00Z" w16du:dateUtc="2026-06-08T15:38:00Z">
+      <w:ins w:id="14" w:author="Elvis F. Elli" w:date="2026-06-08T10:38:00Z" w16du:dateUtc="2026-06-08T15:38:00Z">
         <w:r>
           <w:rPr>
             <w:rFonts w:ascii="Times New Roman" w:hAnsi="Times New Roman" w:cs="Times New Roman"/>
@@ -1542,7 +1569,7 @@
           <w:t xml:space="preserve">in some environments </w:t>
         </w:r>
       </w:ins>
-      <w:ins w:id="9" w:author="Elvis F. Elli" w:date="2026-06-08T10:37:00Z" w16du:dateUtc="2026-06-08T15:37:00Z">
+      <w:ins w:id="15" w:author="Elvis F. Elli" w:date="2026-06-08T10:37:00Z" w16du:dateUtc="2026-06-08T15:37:00Z">
         <w:r>
           <w:rPr>
             <w:rFonts w:ascii="Times New Roman" w:hAnsi="Times New Roman" w:cs="Times New Roman"/>
@@ -1552,7 +1579,7 @@
           <w:t xml:space="preserve">to fully </w:t>
         </w:r>
       </w:ins>
-      <w:ins w:id="10" w:author="Elvis F. Elli" w:date="2026-06-08T10:38:00Z" w16du:dateUtc="2026-06-08T15:38:00Z">
+      <w:ins w:id="16" w:author="Elvis F. Elli" w:date="2026-06-08T10:38:00Z" w16du:dateUtc="2026-06-08T15:38:00Z">
         <w:r>
           <w:rPr>
             <w:rFonts w:ascii="Times New Roman" w:hAnsi="Times New Roman" w:cs="Times New Roman"/>
@@ -1562,7 +1589,7 @@
           <w:t>compensate for the</w:t>
         </w:r>
       </w:ins>
-      <w:ins w:id="11" w:author="Elvis F. Elli" w:date="2026-06-08T10:37:00Z" w16du:dateUtc="2026-06-08T15:37:00Z">
+      <w:ins w:id="17" w:author="Elvis F. Elli" w:date="2026-06-08T10:37:00Z" w16du:dateUtc="2026-06-08T15:37:00Z">
         <w:r>
           <w:rPr>
             <w:rFonts w:ascii="Times New Roman" w:hAnsi="Times New Roman" w:cs="Times New Roman"/>
@@ -1572,7 +1599,7 @@
           <w:t xml:space="preserve"> </w:t>
         </w:r>
       </w:ins>
-      <w:ins w:id="12" w:author="Elvis F. Elli" w:date="2026-06-08T10:38:00Z" w16du:dateUtc="2026-06-08T15:38:00Z">
+      <w:ins w:id="18" w:author="Elvis F. Elli" w:date="2026-06-08T10:38:00Z" w16du:dateUtc="2026-06-08T15:38:00Z">
         <w:r>
           <w:rPr>
             <w:rFonts w:ascii="Times New Roman" w:hAnsi="Times New Roman" w:cs="Times New Roman"/>
@@ -1582,7 +1609,7 @@
           <w:t>yield penalty</w:t>
         </w:r>
       </w:ins>
-      <w:ins w:id="13" w:author="Elvis F. Elli" w:date="2026-06-08T11:40:00Z" w16du:dateUtc="2026-06-08T16:40:00Z">
+      <w:ins w:id="19" w:author="Elvis F. Elli" w:date="2026-06-08T11:40:00Z" w16du:dateUtc="2026-06-08T16:40:00Z">
         <w:r>
           <w:rPr>
             <w:rFonts w:ascii="Times New Roman" w:hAnsi="Times New Roman" w:cs="Times New Roman"/>
@@ -1618,7 +1645,7 @@
           </w:r>
         </w:sdtContent>
       </w:sdt>
-      <w:ins w:id="14" w:author="Elvis F. Elli" w:date="2026-06-08T10:35:00Z" w16du:dateUtc="2026-06-08T15:35:00Z">
+      <w:ins w:id="20" w:author="Elvis F. Elli" w:date="2026-06-08T10:35:00Z" w16du:dateUtc="2026-06-08T15:35:00Z">
         <w:r>
           <w:rPr>
             <w:rFonts w:ascii="Times New Roman" w:hAnsi="Times New Roman" w:cs="Times New Roman"/>
@@ -1639,6 +1666,16 @@
           <w:szCs w:val="24"/>
         </w:rPr>
       </w:pPr>
+      <w:ins w:id="21" w:author="Elvis F. Elli" w:date="2026-06-12T08:33:00Z" w16du:dateUtc="2026-06-12T13:33:00Z">
+        <w:r>
+          <w:rPr>
+            <w:rFonts w:ascii="Times New Roman" w:hAnsi="Times New Roman" w:cs="Times New Roman"/>
+            <w:sz w:val="24"/>
+            <w:szCs w:val="24"/>
+          </w:rPr>
+          <w:t xml:space="preserve"> </w:t>
+        </w:r>
+      </w:ins>
       <w:r>
         <w:rPr>
           <w:rFonts w:ascii="Times New Roman" w:hAnsi="Times New Roman" w:cs="Times New Roman"/>
@@ -1882,39 +1919,67 @@
           <w:sz w:val="24"/>
           <w:szCs w:val="24"/>
         </w:rPr>
-        <w:t xml:space="preserve">the duration of the growing season and </w:t>
-      </w:r>
-      <w:r>
-        <w:rPr>
-          <w:rFonts w:ascii="Times New Roman" w:hAnsi="Times New Roman" w:cs="Times New Roman"/>
-          <w:sz w:val="24"/>
-          <w:szCs w:val="24"/>
-        </w:rPr>
-        <w:t xml:space="preserve">shifts </w:t>
-      </w:r>
-      <w:r>
-        <w:rPr>
-          <w:rFonts w:ascii="Times New Roman" w:hAnsi="Times New Roman" w:cs="Times New Roman"/>
-          <w:sz w:val="24"/>
-          <w:szCs w:val="24"/>
-        </w:rPr>
         <w:t xml:space="preserve">the </w:t>
       </w:r>
-      <w:r>
-        <w:rPr>
-          <w:rFonts w:ascii="Times New Roman" w:hAnsi="Times New Roman" w:cs="Times New Roman"/>
-          <w:sz w:val="24"/>
-          <w:szCs w:val="24"/>
-        </w:rPr>
-        <w:t>crop cycle</w:t>
-      </w:r>
-      <w:r>
-        <w:rPr>
-          <w:rFonts w:ascii="Times New Roman" w:hAnsi="Times New Roman" w:cs="Times New Roman"/>
-          <w:sz w:val="24"/>
-          <w:szCs w:val="24"/>
-        </w:rPr>
-        <w:t xml:space="preserve"> to cooler periods</w:t>
+      <w:del w:id="22" w:author="Elvis F. Elli" w:date="2026-06-12T08:34:00Z" w16du:dateUtc="2026-06-12T13:34:00Z">
+        <w:r>
+          <w:rPr>
+            <w:rFonts w:ascii="Times New Roman" w:hAnsi="Times New Roman" w:cs="Times New Roman"/>
+            <w:sz w:val="24"/>
+            <w:szCs w:val="24"/>
+          </w:rPr>
+          <w:delText xml:space="preserve">duration of the growing season and </w:delText>
+        </w:r>
+        <w:r>
+          <w:rPr>
+            <w:rFonts w:ascii="Times New Roman" w:hAnsi="Times New Roman" w:cs="Times New Roman"/>
+            <w:sz w:val="24"/>
+            <w:szCs w:val="24"/>
+          </w:rPr>
+          <w:delText xml:space="preserve">shifts </w:delText>
+        </w:r>
+        <w:r>
+          <w:rPr>
+            <w:rFonts w:ascii="Times New Roman" w:hAnsi="Times New Roman" w:cs="Times New Roman"/>
+            <w:sz w:val="24"/>
+            <w:szCs w:val="24"/>
+          </w:rPr>
+          <w:delText xml:space="preserve">the </w:delText>
+        </w:r>
+        <w:r>
+          <w:rPr>
+            <w:rFonts w:ascii="Times New Roman" w:hAnsi="Times New Roman" w:cs="Times New Roman"/>
+            <w:sz w:val="24"/>
+            <w:szCs w:val="24"/>
+          </w:rPr>
+          <w:delText>crop cycle</w:delText>
+        </w:r>
+        <w:r>
+          <w:rPr>
+            <w:rFonts w:ascii="Times New Roman" w:hAnsi="Times New Roman" w:cs="Times New Roman"/>
+            <w:sz w:val="24"/>
+            <w:szCs w:val="24"/>
+          </w:rPr>
+          <w:delText xml:space="preserve"> to</w:delText>
+        </w:r>
+      </w:del>
+      <w:ins w:id="23" w:author="Elvis F. Elli" w:date="2026-06-12T08:34:00Z" w16du:dateUtc="2026-06-12T13:34:00Z">
+        <w:r>
+          <w:rPr>
+            <w:rFonts w:ascii="Times New Roman" w:hAnsi="Times New Roman" w:cs="Times New Roman"/>
+            <w:sz w:val="24"/>
+            <w:szCs w:val="24"/>
+          </w:rPr>
+          <w:t>growing season and shifts the crop cycle into</w:t>
+        </w:r>
+      </w:ins>
+      <w:r>
+        <w:rPr>
+          <w:rFonts w:ascii="Times New Roman" w:hAnsi="Times New Roman" w:cs="Times New Roman"/>
+          <w:sz w:val="24"/>
+          <w:szCs w:val="24"/>
+        </w:rPr>
+        <w:t xml:space="preserve"> cooler periods</w:t>
       </w:r>
       <w:r>
         <w:rPr>
@@ -2171,7 +2236,7 @@
         </w:rPr>
         <w:t>recommendations.</w:t>
       </w:r>
-      <w:ins w:id="15" w:author="Elvis F. Elli" w:date="2026-06-09T10:58:00Z" w16du:dateUtc="2026-06-09T15:58:00Z">
+      <w:ins w:id="24" w:author="Elvis F. Elli" w:date="2026-06-09T10:58:00Z" w16du:dateUtc="2026-06-09T15:58:00Z">
         <w:r>
           <w:rPr>
             <w:rFonts w:ascii="Times New Roman" w:hAnsi="Times New Roman" w:cs="Times New Roman"/>
@@ -2187,13 +2252,13 @@
       <w:pPr>
         <w:spacing w:before="120" w:after="0" w:line="480" w:lineRule="auto"/>
         <w:rPr>
-          <w:ins w:id="16" w:author="Elvis F. Elli" w:date="2026-06-08T12:13:00Z" w16du:dateUtc="2026-06-08T17:13:00Z"/>
+          <w:ins w:id="25" w:author="Elvis F. Elli" w:date="2026-06-08T12:13:00Z" w16du:dateUtc="2026-06-08T17:13:00Z"/>
           <w:rFonts w:ascii="Times New Roman" w:hAnsi="Times New Roman" w:cs="Times New Roman"/>
           <w:sz w:val="24"/>
           <w:szCs w:val="24"/>
         </w:rPr>
       </w:pPr>
-      <w:ins w:id="17" w:author="Elvis F. Elli" w:date="2026-06-08T12:13:00Z" w16du:dateUtc="2026-06-08T17:13:00Z">
+      <w:ins w:id="26" w:author="Elvis F. Elli" w:date="2026-06-08T12:13:00Z" w16du:dateUtc="2026-06-08T17:13:00Z">
         <w:r>
           <w:rPr>
             <w:rFonts w:ascii="Times New Roman" w:hAnsi="Times New Roman" w:cs="Times New Roman"/>
@@ -2219,7 +2284,29 @@
             <w:sz w:val="24"/>
             <w:szCs w:val="24"/>
           </w:rPr>
-          <w:t xml:space="preserve">and selecting maturity groups well adapted to a region, the interactive effect of early planting and late-maturing under a warming scenario has not been quantified in the U.S. Mid-South.  </w:t>
+          <w:t xml:space="preserve">and maturity groups </w:t>
+        </w:r>
+      </w:ins>
+      <w:ins w:id="27" w:author="Elvis F. Elli" w:date="2026-06-12T08:34:00Z" w16du:dateUtc="2026-06-12T13:34:00Z">
+        <w:r>
+          <w:rPr>
+            <w:rFonts w:ascii="Times New Roman" w:hAnsi="Times New Roman" w:cs="Times New Roman"/>
+            <w:color w:val="000000"/>
+            <w:sz w:val="24"/>
+            <w:szCs w:val="24"/>
+          </w:rPr>
+          <w:t>well-adapted to a region, the interactive effects of these shifts under a warming scenario have not been quantified in the U.S. Mid-South, and this knowledge gap needs to be addressed</w:t>
+        </w:r>
+      </w:ins>
+      <w:ins w:id="28" w:author="Elvis F. Elli" w:date="2026-06-08T12:13:00Z" w16du:dateUtc="2026-06-08T17:13:00Z">
+        <w:r>
+          <w:rPr>
+            <w:rFonts w:ascii="Times New Roman" w:hAnsi="Times New Roman" w:cs="Times New Roman"/>
+            <w:color w:val="000000"/>
+            <w:sz w:val="24"/>
+            <w:szCs w:val="24"/>
+          </w:rPr>
+          <w:t xml:space="preserve">.  </w:t>
         </w:r>
         <w:r>
           <w:rPr>
@@ -2278,7 +2365,7 @@
           <w:t xml:space="preserve"> area </w:t>
         </w:r>
       </w:ins>
-      <w:customXmlInsRangeStart w:id="18" w:author="Elvis F. Elli" w:date="2026-06-08T12:13:00Z"/>
+      <w:customXmlInsRangeStart w:id="29" w:author="Elvis F. Elli" w:date="2026-06-08T12:13:00Z"/>
       <w:sdt>
         <w:sdtPr>
           <w:rPr>
@@ -2294,7 +2381,7 @@
           </w:placeholder>
         </w:sdtPr>
         <w:sdtContent>
-          <w:customXmlInsRangeEnd w:id="18"/>
+          <w:customXmlInsRangeEnd w:id="29"/>
           <w:r>
             <w:rPr>
               <w:rFonts w:ascii="Times New Roman" w:hAnsi="Times New Roman" w:cs="Times New Roman"/>
@@ -2304,11 +2391,11 @@
             </w:rPr>
             <w:t>(NASS, 2023)</w:t>
           </w:r>
-          <w:customXmlInsRangeStart w:id="19" w:author="Elvis F. Elli" w:date="2026-06-08T12:13:00Z"/>
+          <w:customXmlInsRangeStart w:id="30" w:author="Elvis F. Elli" w:date="2026-06-08T12:13:00Z"/>
         </w:sdtContent>
       </w:sdt>
-      <w:customXmlInsRangeEnd w:id="19"/>
-      <w:ins w:id="20" w:author="Elvis F. Elli" w:date="2026-06-08T12:13:00Z" w16du:dateUtc="2026-06-08T17:13:00Z">
+      <w:customXmlInsRangeEnd w:id="30"/>
+      <w:ins w:id="31" w:author="Elvis F. Elli" w:date="2026-06-08T12:13:00Z" w16du:dateUtc="2026-06-08T17:13:00Z">
         <w:r>
           <w:rPr>
             <w:rFonts w:ascii="Times New Roman" w:hAnsi="Times New Roman" w:cs="Times New Roman"/>
@@ -2324,24 +2411,20 @@
             <w:sz w:val="24"/>
             <w:szCs w:val="24"/>
           </w:rPr>
-          <w:t xml:space="preserve"> We conducted a </w:t>
-        </w:r>
-        <w:r>
-          <w:rPr>
-            <w:rFonts w:ascii="Times New Roman" w:hAnsi="Times New Roman" w:cs="Times New Roman"/>
-            <w:sz w:val="24"/>
-            <w:szCs w:val="24"/>
-          </w:rPr>
-          <w:t>simulation at a fine spatial resolution</w:t>
-        </w:r>
-        <w:r>
-          <w:rPr>
-            <w:rFonts w:ascii="Times New Roman" w:hAnsi="Times New Roman" w:cs="Times New Roman"/>
-            <w:sz w:val="24"/>
-            <w:szCs w:val="24"/>
-          </w:rPr>
-          <w:t xml:space="preserve"> (~0.025°)</w:t>
-        </w:r>
+          <w:t xml:space="preserve"> We conducted a</w:t>
+        </w:r>
+      </w:ins>
+      <w:ins w:id="32" w:author="Elvis F. Elli" w:date="2026-06-12T08:36:00Z" w16du:dateUtc="2026-06-12T13:36:00Z">
+        <w:r>
+          <w:rPr>
+            <w:rFonts w:ascii="Times New Roman" w:hAnsi="Times New Roman" w:cs="Times New Roman"/>
+            <w:sz w:val="24"/>
+            <w:szCs w:val="24"/>
+          </w:rPr>
+          <w:t xml:space="preserve"> comprehensive</w:t>
+        </w:r>
+      </w:ins>
+      <w:ins w:id="33" w:author="Elvis F. Elli" w:date="2026-06-08T12:13:00Z" w16du:dateUtc="2026-06-08T17:13:00Z">
         <w:r>
           <w:rPr>
             <w:rFonts w:ascii="Times New Roman" w:hAnsi="Times New Roman" w:cs="Times New Roman"/>
@@ -2356,6 +2439,34 @@
             <w:sz w:val="24"/>
             <w:szCs w:val="24"/>
           </w:rPr>
+          <w:t>simulation</w:t>
+        </w:r>
+      </w:ins>
+      <w:ins w:id="34" w:author="Elvis F. Elli" w:date="2026-06-12T08:36:00Z" w16du:dateUtc="2026-06-12T13:36:00Z">
+        <w:r>
+          <w:rPr>
+            <w:rFonts w:ascii="Times New Roman" w:hAnsi="Times New Roman" w:cs="Times New Roman"/>
+            <w:sz w:val="24"/>
+            <w:szCs w:val="24"/>
+          </w:rPr>
+          <w:t xml:space="preserve"> exercise</w:t>
+        </w:r>
+      </w:ins>
+      <w:ins w:id="35" w:author="Elvis F. Elli" w:date="2026-06-08T12:13:00Z" w16du:dateUtc="2026-06-08T17:13:00Z">
+        <w:r>
+          <w:rPr>
+            <w:rFonts w:ascii="Times New Roman" w:hAnsi="Times New Roman" w:cs="Times New Roman"/>
+            <w:sz w:val="24"/>
+            <w:szCs w:val="24"/>
+          </w:rPr>
+          <w:t xml:space="preserve"> </w:t>
+        </w:r>
+        <w:r>
+          <w:rPr>
+            <w:rFonts w:ascii="Times New Roman" w:hAnsi="Times New Roman" w:cs="Times New Roman"/>
+            <w:sz w:val="24"/>
+            <w:szCs w:val="24"/>
+          </w:rPr>
           <w:t xml:space="preserve">across 4,651 fields and </w:t>
         </w:r>
         <w:r>
@@ -2396,16 +2507,8 @@
             <w:sz w:val="24"/>
             <w:szCs w:val="24"/>
           </w:rPr>
-          <w:t xml:space="preserve">version </w:t>
-        </w:r>
-        <w:r>
-          <w:rPr>
-            <w:rFonts w:ascii="Times New Roman" w:hAnsi="Times New Roman" w:cs="Times New Roman"/>
-            <w:sz w:val="24"/>
-            <w:szCs w:val="24"/>
-          </w:rPr>
           <w:lastRenderedPageBreak/>
-          <w:t>of the APSIM (Agricultural Production Systems Simulator) framework. We hypothesize that</w:t>
+          <w:t>version of the APSIM (Agricultural Production Systems Simulator) framework. We hypothesize that</w:t>
         </w:r>
         <w:r>
           <w:rPr>
@@ -2453,7 +2556,27 @@
             <w:sz w:val="24"/>
             <w:szCs w:val="24"/>
           </w:rPr>
-          <w:t xml:space="preserve"> will offset the negative impacts of accelerated developmental rates on </w:t>
+          <w:t xml:space="preserve"> will offset the negative impacts of </w:t>
+        </w:r>
+      </w:ins>
+      <w:ins w:id="36" w:author="Elvis F. Elli" w:date="2026-06-12T08:37:00Z" w16du:dateUtc="2026-06-12T13:37:00Z">
+        <w:r>
+          <w:rPr>
+            <w:rFonts w:ascii="Times New Roman" w:hAnsi="Times New Roman" w:cs="Times New Roman"/>
+            <w:sz w:val="24"/>
+            <w:szCs w:val="24"/>
+          </w:rPr>
+          <w:t>warming</w:t>
+        </w:r>
+      </w:ins>
+      <w:ins w:id="37" w:author="Elvis F. Elli" w:date="2026-06-08T12:13:00Z" w16du:dateUtc="2026-06-08T17:13:00Z">
+        <w:r>
+          <w:rPr>
+            <w:rFonts w:ascii="Times New Roman" w:hAnsi="Times New Roman" w:cs="Times New Roman"/>
+            <w:sz w:val="24"/>
+            <w:szCs w:val="24"/>
+          </w:rPr>
+          <w:t xml:space="preserve"> on </w:t>
         </w:r>
         <w:r>
           <w:rPr>
@@ -2503,6 +2626,18 @@
           </w:rPr>
           <w:t xml:space="preserve"> the </w:t>
         </w:r>
+      </w:ins>
+      <w:ins w:id="38" w:author="Elvis F. Elli" w:date="2026-06-12T08:37:00Z" w16du:dateUtc="2026-06-12T13:37:00Z">
+        <w:r>
+          <w:rPr>
+            <w:rFonts w:ascii="Times New Roman" w:hAnsi="Times New Roman" w:cs="Times New Roman"/>
+            <w:sz w:val="24"/>
+            <w:szCs w:val="24"/>
+          </w:rPr>
+          <w:t xml:space="preserve">individual and synergistic </w:t>
+        </w:r>
+      </w:ins>
+      <w:ins w:id="39" w:author="Elvis F. Elli" w:date="2026-06-08T12:13:00Z" w16du:dateUtc="2026-06-08T17:13:00Z">
         <w:r>
           <w:rPr>
             <w:rFonts w:ascii="Times New Roman" w:hAnsi="Times New Roman" w:cs="Times New Roman"/>
@@ -3804,7 +3939,7 @@
         </w:rPr>
         <w:t xml:space="preserve"> to </w:t>
       </w:r>
-      <w:ins w:id="21" w:author="Elvis F. Elli" w:date="2026-06-09T11:07:00Z" w16du:dateUtc="2026-06-09T16:07:00Z">
+      <w:ins w:id="40" w:author="Elvis F. Elli" w:date="2026-06-09T11:07:00Z" w16du:dateUtc="2026-06-09T16:07:00Z">
         <w:r>
           <w:rPr>
             <w:rFonts w:ascii="Times New Roman" w:hAnsi="Times New Roman" w:cs="Times New Roman"/>
@@ -3814,7 +3949,7 @@
           <w:t>identify soybean-cropped pixels and define the spatial extent of the simulation fields</w:t>
         </w:r>
       </w:ins>
-      <w:del w:id="22" w:author="Elvis F. Elli" w:date="2026-06-09T11:07:00Z" w16du:dateUtc="2026-06-09T16:07:00Z">
+      <w:del w:id="41" w:author="Elvis F. Elli" w:date="2026-06-09T11:07:00Z" w16du:dateUtc="2026-06-09T16:07:00Z">
         <w:r>
           <w:rPr>
             <w:rFonts w:ascii="Times New Roman" w:hAnsi="Times New Roman" w:cs="Times New Roman"/>
@@ -3848,7 +3983,7 @@
         </w:rPr>
         <w:t xml:space="preserve">state boundary. </w:t>
       </w:r>
-      <w:ins w:id="23" w:author="Elvis F. Elli" w:date="2026-06-09T11:08:00Z" w16du:dateUtc="2026-06-09T16:08:00Z">
+      <w:ins w:id="42" w:author="Elvis F. Elli" w:date="2026-06-09T11:08:00Z" w16du:dateUtc="2026-06-09T16:08:00Z">
         <w:r>
           <w:rPr>
             <w:rFonts w:ascii="Times New Roman" w:hAnsi="Times New Roman" w:cs="Times New Roman"/>
@@ -4373,7 +4508,25 @@
           <w:sz w:val="24"/>
           <w:szCs w:val="24"/>
         </w:rPr>
-        <w:t>he sowing date was May 15, an average value for the studied region based on USDA-NASS 50% sowing progress</w:t>
+        <w:t>he sowing date was May 15, an average value for the studied region based on USDA-</w:t>
+      </w:r>
+      <w:proofErr w:type="gramStart"/>
+      <w:r>
+        <w:rPr>
+          <w:rFonts w:ascii="Times New Roman" w:hAnsi="Times New Roman" w:cs="Times New Roman"/>
+          <w:sz w:val="24"/>
+          <w:szCs w:val="24"/>
+        </w:rPr>
+        <w:t>NASS</w:t>
+      </w:r>
+      <w:proofErr w:type="gramEnd"/>
+      <w:r>
+        <w:rPr>
+          <w:rFonts w:ascii="Times New Roman" w:hAnsi="Times New Roman" w:cs="Times New Roman"/>
+          <w:sz w:val="24"/>
+          <w:szCs w:val="24"/>
+        </w:rPr>
+        <w:t xml:space="preserve"> 50% sowing progress</w:t>
       </w:r>
       <w:r>
         <w:rPr>
@@ -5060,7 +5213,7 @@
         </w:rPr>
         <w:t xml:space="preserve"> </w:t>
       </w:r>
-      <w:del w:id="24" w:author="Elvis F. Elli" w:date="2026-06-09T11:05:00Z" w16du:dateUtc="2026-06-09T16:05:00Z">
+      <w:del w:id="43" w:author="Elvis F. Elli" w:date="2026-06-09T11:05:00Z" w16du:dateUtc="2026-06-09T16:05:00Z">
         <w:r>
           <w:rPr>
             <w:rFonts w:ascii="Times New Roman" w:hAnsi="Times New Roman" w:cs="Times New Roman"/>
@@ -5071,7 +5224,7 @@
           <w:delText xml:space="preserve">advancing </w:delText>
         </w:r>
       </w:del>
-      <w:ins w:id="25" w:author="Elvis F. Elli" w:date="2026-06-09T11:05:00Z" w16du:dateUtc="2026-06-09T16:05:00Z">
+      <w:ins w:id="44" w:author="Elvis F. Elli" w:date="2026-06-09T11:05:00Z" w16du:dateUtc="2026-06-09T16:05:00Z">
         <w:r>
           <w:rPr>
             <w:rFonts w:ascii="Times New Roman" w:hAnsi="Times New Roman" w:cs="Times New Roman"/>
@@ -5082,7 +5235,7 @@
           <w:t>ear</w:t>
         </w:r>
       </w:ins>
-      <w:ins w:id="26" w:author="Elvis F. Elli" w:date="2026-06-09T11:06:00Z" w16du:dateUtc="2026-06-09T16:06:00Z">
+      <w:ins w:id="45" w:author="Elvis F. Elli" w:date="2026-06-09T11:06:00Z" w16du:dateUtc="2026-06-09T16:06:00Z">
         <w:r>
           <w:rPr>
             <w:rFonts w:ascii="Times New Roman" w:hAnsi="Times New Roman" w:cs="Times New Roman"/>
@@ -5093,7 +5246,7 @@
           <w:t>ly</w:t>
         </w:r>
       </w:ins>
-      <w:ins w:id="27" w:author="Elvis F. Elli" w:date="2026-06-09T11:05:00Z" w16du:dateUtc="2026-06-09T16:05:00Z">
+      <w:ins w:id="46" w:author="Elvis F. Elli" w:date="2026-06-09T11:05:00Z" w16du:dateUtc="2026-06-09T16:05:00Z">
         <w:r>
           <w:rPr>
             <w:rFonts w:ascii="Times New Roman" w:hAnsi="Times New Roman" w:cs="Times New Roman"/>
@@ -5529,7 +5682,7 @@
       <w:pPr>
         <w:spacing w:before="120" w:after="0" w:line="480" w:lineRule="auto"/>
         <w:rPr>
-          <w:del w:id="28" w:author="Elvis F. Elli" w:date="2026-06-11T11:25:00Z" w16du:dateUtc="2026-06-11T16:25:00Z"/>
+          <w:del w:id="47" w:author="Elvis F. Elli" w:date="2026-06-11T11:25:00Z" w16du:dateUtc="2026-06-11T16:25:00Z"/>
           <w:rFonts w:ascii="Times New Roman" w:hAnsi="Times New Roman" w:cs="Times New Roman"/>
           <w:sz w:val="24"/>
           <w:szCs w:val="24"/>
@@ -5541,7 +5694,25 @@
           <w:sz w:val="24"/>
           <w:szCs w:val="24"/>
         </w:rPr>
-        <w:t xml:space="preserve">The 2°C temperature increase </w:t>
+        <w:t xml:space="preserve">The </w:t>
+      </w:r>
+      <w:ins w:id="48" w:author="Elvis F. Elli" w:date="2026-06-12T08:51:00Z" w16du:dateUtc="2026-06-12T13:51:00Z">
+        <w:r>
+          <w:rPr>
+            <w:rFonts w:ascii="Times New Roman" w:hAnsi="Times New Roman" w:cs="Times New Roman"/>
+            <w:sz w:val="24"/>
+            <w:szCs w:val="24"/>
+          </w:rPr>
+          <w:t>+</w:t>
+        </w:r>
+      </w:ins>
+      <w:r>
+        <w:rPr>
+          <w:rFonts w:ascii="Times New Roman" w:hAnsi="Times New Roman" w:cs="Times New Roman"/>
+          <w:sz w:val="24"/>
+          <w:szCs w:val="24"/>
+        </w:rPr>
+        <w:t xml:space="preserve">2°C temperature increase </w:t>
       </w:r>
       <w:r>
         <w:rPr>
@@ -5865,14 +6036,34 @@
         </w:rPr>
         <w:t xml:space="preserve">Under the </w:t>
       </w:r>
-      <w:r>
-        <w:rPr>
-          <w:rFonts w:ascii="Times New Roman" w:hAnsi="Times New Roman" w:cs="Times New Roman"/>
-          <w:sz w:val="24"/>
-          <w:szCs w:val="24"/>
-        </w:rPr>
-        <w:t xml:space="preserve">2°C temperature increase </w:t>
-      </w:r>
+      <w:ins w:id="49" w:author="Elvis F. Elli" w:date="2026-06-12T08:51:00Z" w16du:dateUtc="2026-06-12T13:51:00Z">
+        <w:r>
+          <w:rPr>
+            <w:rFonts w:ascii="Times New Roman" w:hAnsi="Times New Roman" w:cs="Times New Roman"/>
+            <w:sz w:val="24"/>
+            <w:szCs w:val="24"/>
+          </w:rPr>
+          <w:t>+</w:t>
+        </w:r>
+      </w:ins>
+      <w:r>
+        <w:rPr>
+          <w:rFonts w:ascii="Times New Roman" w:hAnsi="Times New Roman" w:cs="Times New Roman"/>
+          <w:sz w:val="24"/>
+          <w:szCs w:val="24"/>
+        </w:rPr>
+        <w:t xml:space="preserve">2°C temperature </w:t>
+      </w:r>
+      <w:del w:id="50" w:author="Elvis F. Elli" w:date="2026-06-12T08:51:00Z" w16du:dateUtc="2026-06-12T13:51:00Z">
+        <w:r>
+          <w:rPr>
+            <w:rFonts w:ascii="Times New Roman" w:hAnsi="Times New Roman" w:cs="Times New Roman"/>
+            <w:sz w:val="24"/>
+            <w:szCs w:val="24"/>
+          </w:rPr>
+          <w:delText xml:space="preserve">increase </w:delText>
+        </w:r>
+      </w:del>
       <w:r>
         <w:rPr>
           <w:rFonts w:ascii="Times New Roman" w:hAnsi="Times New Roman" w:cs="Times New Roman"/>
@@ -5963,7 +6154,7 @@
         </w:rPr>
         <w:t xml:space="preserve">Figure </w:t>
       </w:r>
-      <w:ins w:id="29" w:author="Elvis F. Elli" w:date="2026-06-11T10:31:00Z" w16du:dateUtc="2026-06-11T15:31:00Z">
+      <w:ins w:id="51" w:author="Elvis F. Elli" w:date="2026-06-11T10:31:00Z" w16du:dateUtc="2026-06-11T15:31:00Z">
         <w:r>
           <w:rPr>
             <w:rFonts w:ascii="Times New Roman" w:hAnsi="Times New Roman" w:cs="Times New Roman"/>
@@ -5973,7 +6164,7 @@
           <w:t>S5</w:t>
         </w:r>
       </w:ins>
-      <w:del w:id="30" w:author="Elvis F. Elli" w:date="2026-06-11T10:31:00Z" w16du:dateUtc="2026-06-11T15:31:00Z">
+      <w:del w:id="52" w:author="Elvis F. Elli" w:date="2026-06-11T10:31:00Z" w16du:dateUtc="2026-06-11T15:31:00Z">
         <w:r>
           <w:rPr>
             <w:rFonts w:ascii="Times New Roman" w:hAnsi="Times New Roman" w:cs="Times New Roman"/>
@@ -6097,7 +6288,7 @@
         </w:rPr>
         <w:t>conditions</w:t>
       </w:r>
-      <w:del w:id="31" w:author="Elvis F. Elli" w:date="2026-06-11T10:32:00Z" w16du:dateUtc="2026-06-11T15:32:00Z">
+      <w:del w:id="53" w:author="Elvis F. Elli" w:date="2026-06-11T10:32:00Z" w16du:dateUtc="2026-06-11T15:32:00Z">
         <w:r>
           <w:rPr>
             <w:rFonts w:ascii="Times New Roman" w:hAnsi="Times New Roman" w:cs="Times New Roman"/>
@@ -6478,7 +6669,7 @@
         </w:rPr>
         <w:t>.</w:t>
       </w:r>
-      <w:ins w:id="32" w:author="Elvis F. Elli" w:date="2026-06-11T10:32:00Z" w16du:dateUtc="2026-06-11T15:32:00Z">
+      <w:ins w:id="54" w:author="Elvis F. Elli" w:date="2026-06-11T10:32:00Z" w16du:dateUtc="2026-06-11T15:32:00Z">
         <w:r>
           <w:rPr>
             <w:rFonts w:ascii="Times New Roman" w:hAnsi="Times New Roman" w:cs="Times New Roman"/>
@@ -6488,33 +6679,17 @@
           <w:t xml:space="preserve"> </w:t>
         </w:r>
       </w:ins>
-      <w:ins w:id="33" w:author="Elvis F. Elli" w:date="2026-06-11T11:24:00Z" w16du:dateUtc="2026-06-11T16:24:00Z">
-        <w:r>
-          <w:rPr>
-            <w:rFonts w:ascii="Times New Roman" w:hAnsi="Times New Roman" w:cs="Times New Roman"/>
-            <w:sz w:val="24"/>
-            <w:szCs w:val="24"/>
-          </w:rPr>
-          <w:t xml:space="preserve">A shortening of the </w:t>
-        </w:r>
-        <w:r>
-          <w:rPr>
-            <w:rFonts w:ascii="Times New Roman" w:hAnsi="Times New Roman" w:cs="Times New Roman"/>
-            <w:sz w:val="24"/>
-            <w:szCs w:val="24"/>
-          </w:rPr>
-          <w:t xml:space="preserve">total </w:t>
-        </w:r>
-        <w:r>
-          <w:rPr>
-            <w:rFonts w:ascii="Times New Roman" w:hAnsi="Times New Roman" w:cs="Times New Roman"/>
-            <w:sz w:val="24"/>
-            <w:szCs w:val="24"/>
-          </w:rPr>
-          <w:t xml:space="preserve">crop cycle was observed in </w:t>
+      <w:ins w:id="55" w:author="Elvis F. Elli" w:date="2026-06-11T11:24:00Z" w16du:dateUtc="2026-06-11T16:24:00Z">
+        <w:r>
+          <w:rPr>
+            <w:rFonts w:ascii="Times New Roman" w:hAnsi="Times New Roman" w:cs="Times New Roman"/>
+            <w:sz w:val="24"/>
+            <w:szCs w:val="24"/>
+          </w:rPr>
+          <w:t xml:space="preserve">A shortening of the total crop cycle was observed in </w:t>
         </w:r>
       </w:ins>
-      <w:ins w:id="34" w:author="Elvis F. Elli" w:date="2026-06-11T11:32:00Z" w16du:dateUtc="2026-06-11T16:32:00Z">
+      <w:ins w:id="56" w:author="Elvis F. Elli" w:date="2026-06-11T11:32:00Z" w16du:dateUtc="2026-06-11T16:32:00Z">
         <w:r>
           <w:rPr>
             <w:rFonts w:ascii="Times New Roman" w:hAnsi="Times New Roman" w:cs="Times New Roman"/>
@@ -6524,43 +6699,27 @@
           <w:t>70%</w:t>
         </w:r>
       </w:ins>
-      <w:ins w:id="35" w:author="Elvis F. Elli" w:date="2026-06-11T11:24:00Z" w16du:dateUtc="2026-06-11T16:24:00Z">
-        <w:r>
-          <w:rPr>
-            <w:rFonts w:ascii="Times New Roman" w:hAnsi="Times New Roman" w:cs="Times New Roman"/>
-            <w:sz w:val="24"/>
-            <w:szCs w:val="24"/>
-          </w:rPr>
-          <w:t xml:space="preserve"> of the 4,651 fields</w:t>
-        </w:r>
-        <w:r>
-          <w:rPr>
-            <w:rFonts w:ascii="Times New Roman" w:hAnsi="Times New Roman" w:cs="Times New Roman"/>
-            <w:sz w:val="24"/>
-            <w:szCs w:val="24"/>
-          </w:rPr>
-          <w:t xml:space="preserve"> (Figure 2A)</w:t>
+      <w:ins w:id="57" w:author="Elvis F. Elli" w:date="2026-06-11T11:24:00Z" w16du:dateUtc="2026-06-11T16:24:00Z">
+        <w:r>
+          <w:rPr>
+            <w:rFonts w:ascii="Times New Roman" w:hAnsi="Times New Roman" w:cs="Times New Roman"/>
+            <w:sz w:val="24"/>
+            <w:szCs w:val="24"/>
+          </w:rPr>
+          <w:t xml:space="preserve"> of the 4,651 fields (Figure 2A)</w:t>
         </w:r>
       </w:ins>
-      <w:ins w:id="36" w:author="Elvis F. Elli" w:date="2026-06-11T11:26:00Z" w16du:dateUtc="2026-06-11T16:26:00Z">
-        <w:r>
-          <w:rPr>
-            <w:rFonts w:ascii="Times New Roman" w:hAnsi="Times New Roman" w:cs="Times New Roman"/>
-            <w:sz w:val="24"/>
-            <w:szCs w:val="24"/>
-          </w:rPr>
-          <w:t xml:space="preserve">. </w:t>
-        </w:r>
-        <w:r>
-          <w:rPr>
-            <w:rFonts w:ascii="Times New Roman" w:hAnsi="Times New Roman" w:cs="Times New Roman"/>
-            <w:sz w:val="24"/>
-            <w:szCs w:val="24"/>
-          </w:rPr>
-          <w:t xml:space="preserve">The total crop cycle length decreased by up to </w:t>
+      <w:ins w:id="58" w:author="Elvis F. Elli" w:date="2026-06-11T11:26:00Z" w16du:dateUtc="2026-06-11T16:26:00Z">
+        <w:r>
+          <w:rPr>
+            <w:rFonts w:ascii="Times New Roman" w:hAnsi="Times New Roman" w:cs="Times New Roman"/>
+            <w:sz w:val="24"/>
+            <w:szCs w:val="24"/>
+          </w:rPr>
+          <w:t xml:space="preserve">. The total crop cycle length decreased by up to </w:t>
         </w:r>
       </w:ins>
-      <w:ins w:id="37" w:author="Elvis F. Elli" w:date="2026-06-11T11:32:00Z" w16du:dateUtc="2026-06-11T16:32:00Z">
+      <w:ins w:id="59" w:author="Elvis F. Elli" w:date="2026-06-11T11:32:00Z" w16du:dateUtc="2026-06-11T16:32:00Z">
         <w:r>
           <w:rPr>
             <w:rFonts w:ascii="Times New Roman" w:hAnsi="Times New Roman" w:cs="Times New Roman"/>
@@ -6570,25 +6729,17 @@
           <w:t>2</w:t>
         </w:r>
       </w:ins>
-      <w:ins w:id="38" w:author="Elvis F. Elli" w:date="2026-06-11T11:26:00Z" w16du:dateUtc="2026-06-11T16:26:00Z">
-        <w:r>
-          <w:rPr>
-            <w:rFonts w:ascii="Times New Roman" w:hAnsi="Times New Roman" w:cs="Times New Roman"/>
-            <w:sz w:val="24"/>
-            <w:szCs w:val="24"/>
-          </w:rPr>
-          <w:t xml:space="preserve"> weeks across all site-years.</w:t>
-        </w:r>
-        <w:r>
-          <w:rPr>
-            <w:rFonts w:ascii="Times New Roman" w:hAnsi="Times New Roman" w:cs="Times New Roman"/>
-            <w:sz w:val="24"/>
-            <w:szCs w:val="24"/>
-          </w:rPr>
-          <w:t xml:space="preserve"> The</w:t>
+      <w:ins w:id="60" w:author="Elvis F. Elli" w:date="2026-06-11T11:26:00Z" w16du:dateUtc="2026-06-11T16:26:00Z">
+        <w:r>
+          <w:rPr>
+            <w:rFonts w:ascii="Times New Roman" w:hAnsi="Times New Roman" w:cs="Times New Roman"/>
+            <w:sz w:val="24"/>
+            <w:szCs w:val="24"/>
+          </w:rPr>
+          <w:t xml:space="preserve"> weeks across all site-years. The</w:t>
         </w:r>
       </w:ins>
-      <w:ins w:id="39" w:author="Elvis F. Elli" w:date="2026-06-11T11:24:00Z" w16du:dateUtc="2026-06-11T16:24:00Z">
+      <w:ins w:id="61" w:author="Elvis F. Elli" w:date="2026-06-11T11:24:00Z" w16du:dateUtc="2026-06-11T16:24:00Z">
         <w:r>
           <w:rPr>
             <w:rFonts w:ascii="Times New Roman" w:hAnsi="Times New Roman" w:cs="Times New Roman"/>
@@ -6598,7 +6749,7 @@
           <w:t xml:space="preserve"> seed </w:t>
         </w:r>
       </w:ins>
-      <w:ins w:id="40" w:author="Elvis F. Elli" w:date="2026-06-11T11:25:00Z" w16du:dateUtc="2026-06-11T16:25:00Z">
+      <w:ins w:id="62" w:author="Elvis F. Elli" w:date="2026-06-11T11:25:00Z" w16du:dateUtc="2026-06-11T16:25:00Z">
         <w:r>
           <w:rPr>
             <w:rFonts w:ascii="Times New Roman" w:hAnsi="Times New Roman" w:cs="Times New Roman"/>
@@ -6608,7 +6759,7 @@
           <w:t>filling</w:t>
         </w:r>
       </w:ins>
-      <w:ins w:id="41" w:author="Elvis F. Elli" w:date="2026-06-11T11:24:00Z" w16du:dateUtc="2026-06-11T16:24:00Z">
+      <w:ins w:id="63" w:author="Elvis F. Elli" w:date="2026-06-11T11:24:00Z" w16du:dateUtc="2026-06-11T16:24:00Z">
         <w:r>
           <w:rPr>
             <w:rFonts w:ascii="Times New Roman" w:hAnsi="Times New Roman" w:cs="Times New Roman"/>
@@ -6618,7 +6769,7 @@
           <w:t xml:space="preserve"> </w:t>
         </w:r>
       </w:ins>
-      <w:ins w:id="42" w:author="Elvis F. Elli" w:date="2026-06-11T11:25:00Z" w16du:dateUtc="2026-06-11T16:25:00Z">
+      <w:ins w:id="64" w:author="Elvis F. Elli" w:date="2026-06-11T11:25:00Z" w16du:dateUtc="2026-06-11T16:25:00Z">
         <w:r>
           <w:rPr>
             <w:rFonts w:ascii="Times New Roman" w:hAnsi="Times New Roman" w:cs="Times New Roman"/>
@@ -6628,7 +6779,7 @@
           <w:t xml:space="preserve">period </w:t>
         </w:r>
       </w:ins>
-      <w:ins w:id="43" w:author="Elvis F. Elli" w:date="2026-06-11T11:24:00Z" w16du:dateUtc="2026-06-11T16:24:00Z">
+      <w:ins w:id="65" w:author="Elvis F. Elli" w:date="2026-06-11T11:24:00Z" w16du:dateUtc="2026-06-11T16:24:00Z">
         <w:r>
           <w:rPr>
             <w:rFonts w:ascii="Times New Roman" w:hAnsi="Times New Roman" w:cs="Times New Roman"/>
@@ -6638,17 +6789,17 @@
           <w:t xml:space="preserve">was shortened only </w:t>
         </w:r>
       </w:ins>
-      <w:ins w:id="44" w:author="Elvis F. Elli" w:date="2026-06-11T11:25:00Z" w16du:dateUtc="2026-06-11T16:25:00Z">
-        <w:r>
-          <w:rPr>
-            <w:rFonts w:ascii="Times New Roman" w:hAnsi="Times New Roman" w:cs="Times New Roman"/>
-            <w:sz w:val="24"/>
-            <w:szCs w:val="24"/>
-          </w:rPr>
-          <w:t>in northern environments, where baseline temperatures are lower</w:t>
+      <w:ins w:id="66" w:author="Elvis F. Elli" w:date="2026-06-11T11:25:00Z" w16du:dateUtc="2026-06-11T16:25:00Z">
+        <w:r>
+          <w:rPr>
+            <w:rFonts w:ascii="Times New Roman" w:hAnsi="Times New Roman" w:cs="Times New Roman"/>
+            <w:sz w:val="24"/>
+            <w:szCs w:val="24"/>
+          </w:rPr>
+          <w:t>in northern environments</w:t>
         </w:r>
       </w:ins>
-      <w:ins w:id="45" w:author="Elvis F. Elli" w:date="2026-06-11T11:33:00Z" w16du:dateUtc="2026-06-11T16:33:00Z">
+      <w:ins w:id="67" w:author="Elvis F. Elli" w:date="2026-06-12T08:21:00Z" w16du:dateUtc="2026-06-12T13:21:00Z">
         <w:r>
           <w:rPr>
             <w:rFonts w:ascii="Times New Roman" w:hAnsi="Times New Roman" w:cs="Times New Roman"/>
@@ -6663,33 +6814,27 @@
             <w:sz w:val="24"/>
             <w:szCs w:val="24"/>
           </w:rPr>
-          <w:t>(Figure 2</w:t>
-        </w:r>
-        <w:r>
-          <w:rPr>
-            <w:rFonts w:ascii="Times New Roman" w:hAnsi="Times New Roman" w:cs="Times New Roman"/>
-            <w:sz w:val="24"/>
-            <w:szCs w:val="24"/>
-          </w:rPr>
-          <w:t>B</w:t>
-        </w:r>
-        <w:r>
-          <w:rPr>
-            <w:rFonts w:ascii="Times New Roman" w:hAnsi="Times New Roman" w:cs="Times New Roman"/>
-            <w:sz w:val="24"/>
-            <w:szCs w:val="24"/>
-          </w:rPr>
-          <w:t>).</w:t>
+          <w:t>(Figure 2B)</w:t>
         </w:r>
       </w:ins>
-      <w:ins w:id="46" w:author="Elvis F. Elli" w:date="2026-06-11T11:25:00Z" w16du:dateUtc="2026-06-11T16:25:00Z">
-        <w:r>
-          <w:rPr>
-            <w:rFonts w:ascii="Times New Roman" w:hAnsi="Times New Roman" w:cs="Times New Roman"/>
-            <w:sz w:val="24"/>
-            <w:szCs w:val="24"/>
-          </w:rPr>
-          <w:t xml:space="preserve"> In central and southern locations, no substantial changes in the seed filling period were observed under the high-temperature scenario.</w:t>
+      <w:ins w:id="68" w:author="Elvis F. Elli" w:date="2026-06-11T11:25:00Z" w16du:dateUtc="2026-06-11T16:25:00Z">
+        <w:r>
+          <w:rPr>
+            <w:rFonts w:ascii="Times New Roman" w:hAnsi="Times New Roman" w:cs="Times New Roman"/>
+            <w:sz w:val="24"/>
+            <w:szCs w:val="24"/>
+          </w:rPr>
+          <w:t>, where baseline temperatures are lower</w:t>
+        </w:r>
+      </w:ins>
+      <w:ins w:id="69" w:author="Elvis F. Elli" w:date="2026-06-12T08:21:00Z" w16du:dateUtc="2026-06-12T13:21:00Z">
+        <w:r>
+          <w:rPr>
+            <w:rFonts w:ascii="Times New Roman" w:hAnsi="Times New Roman" w:cs="Times New Roman"/>
+            <w:sz w:val="24"/>
+            <w:szCs w:val="24"/>
+          </w:rPr>
+          <w:t>.</w:t>
         </w:r>
       </w:ins>
     </w:p>
@@ -6761,7 +6906,7 @@
       <w:pPr>
         <w:spacing w:before="120" w:after="0" w:line="480" w:lineRule="auto"/>
         <w:rPr>
-          <w:ins w:id="47" w:author="Elvis F. Elli" w:date="2026-06-11T10:33:00Z" w16du:dateUtc="2026-06-11T15:33:00Z"/>
+          <w:ins w:id="70" w:author="Elvis F. Elli" w:date="2026-06-11T10:33:00Z" w16du:dateUtc="2026-06-11T15:33:00Z"/>
           <w:rFonts w:ascii="Times New Roman" w:hAnsi="Times New Roman" w:cs="Times New Roman"/>
           <w:sz w:val="24"/>
           <w:szCs w:val="24"/>
@@ -6885,7 +7030,7 @@
         </w:rPr>
         <w:t>in the US Mid-South</w:t>
       </w:r>
-      <w:ins w:id="48" w:author="Elvis F. Elli" w:date="2026-06-09T11:01:00Z" w16du:dateUtc="2026-06-09T16:01:00Z">
+      <w:ins w:id="71" w:author="Elvis F. Elli" w:date="2026-06-09T11:01:00Z" w16du:dateUtc="2026-06-09T16:01:00Z">
         <w:r>
           <w:rPr>
             <w:rFonts w:ascii="Times New Roman" w:hAnsi="Times New Roman" w:cs="Times New Roman"/>
@@ -6925,7 +7070,7 @@
           <w:t xml:space="preserve"> LM &amp; ES represent the combined effect of a late-maturing variety and early sowing.</w:t>
         </w:r>
       </w:ins>
-      <w:del w:id="49" w:author="Elvis F. Elli" w:date="2026-06-09T11:01:00Z" w16du:dateUtc="2026-06-09T16:01:00Z">
+      <w:del w:id="72" w:author="Elvis F. Elli" w:date="2026-06-09T11:01:00Z" w16du:dateUtc="2026-06-09T16:01:00Z">
         <w:r>
           <w:rPr>
             <w:rFonts w:ascii="Times New Roman" w:hAnsi="Times New Roman" w:cs="Times New Roman"/>
@@ -6951,13 +7096,13 @@
         <w:spacing w:before="120" w:after="0" w:line="480" w:lineRule="auto"/>
         <w:jc w:val="center"/>
         <w:rPr>
-          <w:ins w:id="50" w:author="Elvis F. Elli" w:date="2026-06-11T10:26:00Z" w16du:dateUtc="2026-06-11T15:26:00Z"/>
+          <w:ins w:id="73" w:author="Elvis F. Elli" w:date="2026-06-11T10:26:00Z" w16du:dateUtc="2026-06-11T15:26:00Z"/>
           <w:rFonts w:ascii="Times New Roman" w:hAnsi="Times New Roman" w:cs="Times New Roman"/>
           <w:sz w:val="24"/>
           <w:szCs w:val="24"/>
         </w:rPr>
       </w:pPr>
-      <w:ins w:id="51" w:author="Elvis F. Elli" w:date="2026-06-11T10:26:00Z" w16du:dateUtc="2026-06-11T15:26:00Z">
+      <w:ins w:id="74" w:author="Elvis F. Elli" w:date="2026-06-11T10:26:00Z" w16du:dateUtc="2026-06-11T15:26:00Z">
         <w:r>
           <w:rPr>
             <w:noProof/>
@@ -7018,13 +7163,13 @@
       <w:pPr>
         <w:spacing w:before="120" w:after="0" w:line="480" w:lineRule="auto"/>
         <w:rPr>
-          <w:ins w:id="52" w:author="Elvis F. Elli" w:date="2026-06-11T10:26:00Z" w16du:dateUtc="2026-06-11T15:26:00Z"/>
+          <w:ins w:id="75" w:author="Elvis F. Elli" w:date="2026-06-11T10:26:00Z" w16du:dateUtc="2026-06-11T15:26:00Z"/>
           <w:rFonts w:ascii="Times New Roman" w:hAnsi="Times New Roman" w:cs="Times New Roman"/>
           <w:sz w:val="24"/>
           <w:szCs w:val="24"/>
         </w:rPr>
       </w:pPr>
-      <w:ins w:id="53" w:author="Elvis F. Elli" w:date="2026-06-11T10:26:00Z" w16du:dateUtc="2026-06-11T15:26:00Z">
+      <w:ins w:id="76" w:author="Elvis F. Elli" w:date="2026-06-11T10:26:00Z" w16du:dateUtc="2026-06-11T15:26:00Z">
         <w:r>
           <w:rPr>
             <w:rFonts w:ascii="Times New Roman" w:hAnsi="Times New Roman" w:cs="Times New Roman"/>
@@ -7079,15 +7224,15 @@
           <w:rPr>
             <w:rFonts w:ascii="Times New Roman" w:hAnsi="Times New Roman" w:cs="Times New Roman"/>
           </w:rPr>
-          <w:t>of the o</w:t>
-        </w:r>
-        <w:r>
-          <w:rPr>
-            <w:rFonts w:ascii="Times New Roman" w:hAnsi="Times New Roman" w:cs="Times New Roman"/>
-            <w:sz w:val="24"/>
-            <w:szCs w:val="24"/>
-          </w:rPr>
-          <w:t>verall r</w:t>
+          <w:t>of the</w:t>
+        </w:r>
+        <w:r>
+          <w:rPr>
+            <w:rFonts w:ascii="Times New Roman" w:hAnsi="Times New Roman" w:cs="Times New Roman"/>
+            <w:sz w:val="24"/>
+            <w:szCs w:val="24"/>
+          </w:rPr>
+          <w:t xml:space="preserve"> r</w:t>
         </w:r>
         <w:r>
           <w:rPr>
@@ -7111,15 +7256,35 @@
             <w:sz w:val="24"/>
             <w:szCs w:val="24"/>
           </w:rPr>
-          <w:t xml:space="preserve">on soybean </w:t>
-        </w:r>
-        <w:r>
-          <w:rPr>
-            <w:rFonts w:ascii="Times New Roman" w:hAnsi="Times New Roman" w:cs="Times New Roman"/>
-            <w:sz w:val="24"/>
-            <w:szCs w:val="24"/>
-          </w:rPr>
-          <w:t xml:space="preserve">total crop cycle and seed-filling period changes across 4,651 soybean fields and 40 weather years </w:t>
+          <w:t xml:space="preserve">on </w:t>
+        </w:r>
+      </w:ins>
+      <w:ins w:id="77" w:author="Elvis F. Elli" w:date="2026-06-12T08:28:00Z" w16du:dateUtc="2026-06-12T13:28:00Z">
+        <w:r>
+          <w:rPr>
+            <w:rFonts w:ascii="Times New Roman" w:hAnsi="Times New Roman" w:cs="Times New Roman"/>
+            <w:sz w:val="24"/>
+            <w:szCs w:val="24"/>
+          </w:rPr>
+          <w:t xml:space="preserve">changes in </w:t>
+        </w:r>
+      </w:ins>
+      <w:ins w:id="78" w:author="Elvis F. Elli" w:date="2026-06-11T10:26:00Z" w16du:dateUtc="2026-06-11T15:26:00Z">
+        <w:r>
+          <w:rPr>
+            <w:rFonts w:ascii="Times New Roman" w:hAnsi="Times New Roman" w:cs="Times New Roman"/>
+            <w:sz w:val="24"/>
+            <w:szCs w:val="24"/>
+          </w:rPr>
+          <w:t xml:space="preserve">soybean </w:t>
+        </w:r>
+        <w:r>
+          <w:rPr>
+            <w:rFonts w:ascii="Times New Roman" w:hAnsi="Times New Roman" w:cs="Times New Roman"/>
+            <w:sz w:val="24"/>
+            <w:szCs w:val="24"/>
+          </w:rPr>
+          <w:t xml:space="preserve">total crop cycle and seed-filling period across 4,651 soybean fields </w:t>
         </w:r>
         <w:r>
           <w:rPr>
@@ -7141,7 +7306,7 @@
           <w:rPr>
             <w:rFonts w:ascii="Times New Roman" w:hAnsi="Times New Roman" w:cs="Times New Roman"/>
           </w:rPr>
-          <w:t>Values per pixel in panel B are averages across 40 weather years.</w:t>
+          <w:t>Values per pixel are averages across 40 weather years.</w:t>
         </w:r>
         <w:r>
           <w:rPr>
@@ -7286,6 +7451,44 @@
         </w:rPr>
         <w:t xml:space="preserve"> </w:t>
       </w:r>
+      <w:ins w:id="79" w:author="Elvis F. Elli" w:date="2026-06-12T08:52:00Z" w16du:dateUtc="2026-06-12T13:52:00Z">
+        <w:r>
+          <w:rPr>
+            <w:rFonts w:ascii="Times New Roman" w:hAnsi="Times New Roman" w:cs="Times New Roman"/>
+            <w:color w:val="000000" w:themeColor="text1"/>
+            <w:sz w:val="24"/>
+            <w:szCs w:val="24"/>
+          </w:rPr>
+          <w:t>+2</w:t>
+        </w:r>
+        <w:r>
+          <w:rPr>
+            <w:rFonts w:ascii="Times New Roman" w:hAnsi="Times New Roman" w:cs="Times New Roman"/>
+            <w:sz w:val="24"/>
+            <w:szCs w:val="24"/>
+          </w:rPr>
+          <w:t>°C</w:t>
+        </w:r>
+        <w:r>
+          <w:rPr>
+            <w:rFonts w:ascii="Times New Roman" w:hAnsi="Times New Roman" w:cs="Times New Roman"/>
+            <w:sz w:val="24"/>
+            <w:szCs w:val="24"/>
+          </w:rPr>
+          <w:t xml:space="preserve"> </w:t>
+        </w:r>
+      </w:ins>
+      <w:del w:id="80" w:author="Elvis F. Elli" w:date="2026-06-12T08:52:00Z" w16du:dateUtc="2026-06-12T13:52:00Z">
+        <w:r>
+          <w:rPr>
+            <w:rFonts w:ascii="Times New Roman" w:hAnsi="Times New Roman" w:cs="Times New Roman"/>
+            <w:color w:val="000000" w:themeColor="text1"/>
+            <w:sz w:val="24"/>
+            <w:szCs w:val="24"/>
+          </w:rPr>
+          <w:delText>high-</w:delText>
+        </w:r>
+      </w:del>
       <w:r>
         <w:rPr>
           <w:rFonts w:ascii="Times New Roman" w:hAnsi="Times New Roman" w:cs="Times New Roman"/>
@@ -7293,7 +7496,7 @@
           <w:sz w:val="24"/>
           <w:szCs w:val="24"/>
         </w:rPr>
-        <w:t xml:space="preserve">high-temperature </w:t>
+        <w:t xml:space="preserve">temperature </w:t>
       </w:r>
       <w:r>
         <w:rPr>
@@ -7385,7 +7588,43 @@
           <w:sz w:val="24"/>
           <w:szCs w:val="24"/>
         </w:rPr>
-        <w:t>in combination with early sowing increased soybean seed yield by 9% under the 2°C temperature increase scenario,</w:t>
+        <w:t xml:space="preserve">in combination with early sowing increased soybean seed yield by 9% under the </w:t>
+      </w:r>
+      <w:ins w:id="81" w:author="Elvis F. Elli" w:date="2026-06-12T08:52:00Z" w16du:dateUtc="2026-06-12T13:52:00Z">
+        <w:r>
+          <w:rPr>
+            <w:rFonts w:ascii="Times New Roman" w:hAnsi="Times New Roman" w:cs="Times New Roman"/>
+            <w:sz w:val="24"/>
+            <w:szCs w:val="24"/>
+          </w:rPr>
+          <w:t>+</w:t>
+        </w:r>
+      </w:ins>
+      <w:r>
+        <w:rPr>
+          <w:rFonts w:ascii="Times New Roman" w:hAnsi="Times New Roman" w:cs="Times New Roman"/>
+          <w:sz w:val="24"/>
+          <w:szCs w:val="24"/>
+        </w:rPr>
+        <w:t xml:space="preserve">2°C temperature </w:t>
+      </w:r>
+      <w:del w:id="82" w:author="Elvis F. Elli" w:date="2026-06-12T08:52:00Z" w16du:dateUtc="2026-06-12T13:52:00Z">
+        <w:r>
+          <w:rPr>
+            <w:rFonts w:ascii="Times New Roman" w:hAnsi="Times New Roman" w:cs="Times New Roman"/>
+            <w:sz w:val="24"/>
+            <w:szCs w:val="24"/>
+          </w:rPr>
+          <w:delText xml:space="preserve">increase </w:delText>
+        </w:r>
+      </w:del>
+      <w:r>
+        <w:rPr>
+          <w:rFonts w:ascii="Times New Roman" w:hAnsi="Times New Roman" w:cs="Times New Roman"/>
+          <w:sz w:val="24"/>
+          <w:szCs w:val="24"/>
+        </w:rPr>
+        <w:t>scenario,</w:t>
       </w:r>
       <w:r>
         <w:rPr>
@@ -7428,17 +7667,37 @@
         </w:rPr>
         <w:t xml:space="preserve">. </w:t>
       </w:r>
-      <w:ins w:id="54" w:author="Elvis F. Elli" w:date="2026-06-11T12:06:00Z" w16du:dateUtc="2026-06-11T17:06:00Z">
-        <w:r>
-          <w:rPr>
-            <w:rFonts w:ascii="Times New Roman" w:hAnsi="Times New Roman" w:cs="Times New Roman"/>
-            <w:sz w:val="24"/>
-            <w:szCs w:val="24"/>
-          </w:rPr>
-          <w:t xml:space="preserve">The combined adaptive scenario extended seed-filling period on average by 12 </w:t>
+      <w:ins w:id="83" w:author="Elvis F. Elli" w:date="2026-06-11T12:06:00Z" w16du:dateUtc="2026-06-11T17:06:00Z">
+        <w:r>
+          <w:rPr>
+            <w:rFonts w:ascii="Times New Roman" w:hAnsi="Times New Roman" w:cs="Times New Roman"/>
+            <w:sz w:val="24"/>
+            <w:szCs w:val="24"/>
+          </w:rPr>
+          <w:t xml:space="preserve">The combined adaptive scenario extended </w:t>
         </w:r>
       </w:ins>
-      <w:ins w:id="55" w:author="Elvis F. Elli" w:date="2026-06-11T12:07:00Z" w16du:dateUtc="2026-06-11T17:07:00Z">
+      <w:ins w:id="84" w:author="Elvis F. Elli" w:date="2026-06-12T08:29:00Z" w16du:dateUtc="2026-06-12T13:29:00Z">
+        <w:r>
+          <w:rPr>
+            <w:rFonts w:ascii="Times New Roman" w:hAnsi="Times New Roman" w:cs="Times New Roman"/>
+            <w:sz w:val="24"/>
+            <w:szCs w:val="24"/>
+          </w:rPr>
+          <w:t xml:space="preserve">the </w:t>
+        </w:r>
+      </w:ins>
+      <w:ins w:id="85" w:author="Elvis F. Elli" w:date="2026-06-11T12:06:00Z" w16du:dateUtc="2026-06-11T17:06:00Z">
+        <w:r>
+          <w:rPr>
+            <w:rFonts w:ascii="Times New Roman" w:hAnsi="Times New Roman" w:cs="Times New Roman"/>
+            <w:sz w:val="24"/>
+            <w:szCs w:val="24"/>
+          </w:rPr>
+          <w:t xml:space="preserve">seed-filling period on average by 12 </w:t>
+        </w:r>
+      </w:ins>
+      <w:ins w:id="86" w:author="Elvis F. Elli" w:date="2026-06-11T12:07:00Z" w16du:dateUtc="2026-06-11T17:07:00Z">
         <w:r>
           <w:rPr>
             <w:rFonts w:ascii="Times New Roman" w:hAnsi="Times New Roman" w:cs="Times New Roman"/>
@@ -7592,7 +7851,7 @@
         </w:rPr>
         <w:t xml:space="preserve">, particularly those located in the central-north region (Figure </w:t>
       </w:r>
-      <w:del w:id="56" w:author="Elvis F. Elli" w:date="2026-06-09T11:02:00Z" w16du:dateUtc="2026-06-09T16:02:00Z">
+      <w:del w:id="87" w:author="Elvis F. Elli" w:date="2026-06-09T11:02:00Z" w16du:dateUtc="2026-06-09T16:02:00Z">
         <w:r>
           <w:rPr>
             <w:rFonts w:ascii="Times New Roman" w:hAnsi="Times New Roman" w:cs="Times New Roman"/>
@@ -7610,7 +7869,7 @@
           <w:delText>5</w:delText>
         </w:r>
       </w:del>
-      <w:ins w:id="57" w:author="Elvis F. Elli" w:date="2026-06-09T11:02:00Z" w16du:dateUtc="2026-06-09T16:02:00Z">
+      <w:ins w:id="88" w:author="Elvis F. Elli" w:date="2026-06-09T11:02:00Z" w16du:dateUtc="2026-06-09T16:02:00Z">
         <w:r>
           <w:rPr>
             <w:rFonts w:ascii="Times New Roman" w:hAnsi="Times New Roman" w:cs="Times New Roman"/>
@@ -7692,14 +7951,34 @@
         </w:rPr>
         <w:t xml:space="preserve">compared to the </w:t>
       </w:r>
-      <w:r>
-        <w:rPr>
-          <w:rFonts w:ascii="Times New Roman" w:hAnsi="Times New Roman" w:cs="Times New Roman"/>
-          <w:sz w:val="24"/>
-          <w:szCs w:val="24"/>
-        </w:rPr>
-        <w:t xml:space="preserve">2°C temperature increase </w:t>
-      </w:r>
+      <w:ins w:id="89" w:author="Elvis F. Elli" w:date="2026-06-12T08:52:00Z" w16du:dateUtc="2026-06-12T13:52:00Z">
+        <w:r>
+          <w:rPr>
+            <w:rFonts w:ascii="Times New Roman" w:hAnsi="Times New Roman" w:cs="Times New Roman"/>
+            <w:sz w:val="24"/>
+            <w:szCs w:val="24"/>
+          </w:rPr>
+          <w:t>+</w:t>
+        </w:r>
+      </w:ins>
+      <w:r>
+        <w:rPr>
+          <w:rFonts w:ascii="Times New Roman" w:hAnsi="Times New Roman" w:cs="Times New Roman"/>
+          <w:sz w:val="24"/>
+          <w:szCs w:val="24"/>
+        </w:rPr>
+        <w:t xml:space="preserve">2°C temperature </w:t>
+      </w:r>
+      <w:del w:id="90" w:author="Elvis F. Elli" w:date="2026-06-12T08:52:00Z" w16du:dateUtc="2026-06-12T13:52:00Z">
+        <w:r>
+          <w:rPr>
+            <w:rFonts w:ascii="Times New Roman" w:hAnsi="Times New Roman" w:cs="Times New Roman"/>
+            <w:sz w:val="24"/>
+            <w:szCs w:val="24"/>
+          </w:rPr>
+          <w:delText xml:space="preserve">increase </w:delText>
+        </w:r>
+      </w:del>
       <w:r>
         <w:rPr>
           <w:rFonts w:ascii="Times New Roman" w:hAnsi="Times New Roman" w:cs="Times New Roman"/>
@@ -8240,7 +8519,25 @@
           <w:sz w:val="24"/>
           <w:szCs w:val="24"/>
         </w:rPr>
-        <w:t>a 2</w:t>
+        <w:t xml:space="preserve">a </w:t>
+      </w:r>
+      <w:ins w:id="91" w:author="Elvis F. Elli" w:date="2026-06-12T08:52:00Z" w16du:dateUtc="2026-06-12T13:52:00Z">
+        <w:r>
+          <w:rPr>
+            <w:rFonts w:ascii="Times New Roman" w:hAnsi="Times New Roman" w:cs="Times New Roman"/>
+            <w:sz w:val="24"/>
+            <w:szCs w:val="24"/>
+          </w:rPr>
+          <w:t>+</w:t>
+        </w:r>
+      </w:ins>
+      <w:r>
+        <w:rPr>
+          <w:rFonts w:ascii="Times New Roman" w:hAnsi="Times New Roman" w:cs="Times New Roman"/>
+          <w:sz w:val="24"/>
+          <w:szCs w:val="24"/>
+        </w:rPr>
+        <w:t>2</w:t>
       </w:r>
       <w:r>
         <w:rPr>
@@ -8274,7 +8571,7 @@
         </w:rPr>
         <w:t xml:space="preserve">. </w:t>
       </w:r>
-      <w:ins w:id="58" w:author="Elvis F. Elli" w:date="2026-06-08T12:30:00Z" w16du:dateUtc="2026-06-08T17:30:00Z">
+      <w:ins w:id="92" w:author="Elvis F. Elli" w:date="2026-06-08T12:30:00Z" w16du:dateUtc="2026-06-08T17:30:00Z">
         <w:r>
           <w:rPr>
             <w:rFonts w:ascii="Times New Roman" w:hAnsi="Times New Roman" w:cs="Times New Roman"/>
@@ -8308,7 +8605,7 @@
           <w:t xml:space="preserve"> </w:t>
         </w:r>
       </w:ins>
-      <w:customXmlInsRangeStart w:id="59" w:author="Elvis F. Elli" w:date="2026-06-08T12:30:00Z"/>
+      <w:customXmlInsRangeStart w:id="93" w:author="Elvis F. Elli" w:date="2026-06-08T12:30:00Z"/>
       <w:sdt>
         <w:sdtPr>
           <w:rPr>
@@ -8324,7 +8621,7 @@
           </w:placeholder>
         </w:sdtPr>
         <w:sdtContent>
-          <w:customXmlInsRangeEnd w:id="59"/>
+          <w:customXmlInsRangeEnd w:id="93"/>
           <w:r>
             <w:rPr>
               <w:rFonts w:ascii="Times New Roman" w:hAnsi="Times New Roman" w:cs="Times New Roman"/>
@@ -8334,11 +8631,11 @@
             </w:rPr>
             <w:t>(Elli et al., 2022; Nendel et al., 2023)</w:t>
           </w:r>
-          <w:customXmlInsRangeStart w:id="60" w:author="Elvis F. Elli" w:date="2026-06-08T12:30:00Z"/>
+          <w:customXmlInsRangeStart w:id="94" w:author="Elvis F. Elli" w:date="2026-06-08T12:30:00Z"/>
         </w:sdtContent>
       </w:sdt>
-      <w:customXmlInsRangeEnd w:id="60"/>
-      <w:ins w:id="61" w:author="Elvis F. Elli" w:date="2026-06-08T12:30:00Z" w16du:dateUtc="2026-06-08T17:30:00Z">
+      <w:customXmlInsRangeEnd w:id="94"/>
+      <w:ins w:id="95" w:author="Elvis F. Elli" w:date="2026-06-08T12:30:00Z" w16du:dateUtc="2026-06-08T17:30:00Z">
         <w:r>
           <w:rPr>
             <w:rFonts w:ascii="Times New Roman" w:hAnsi="Times New Roman" w:cs="Times New Roman"/>
@@ -8683,7 +8980,43 @@
           <w:sz w:val="24"/>
           <w:szCs w:val="24"/>
         </w:rPr>
-        <w:t>under a 2°C temperature increase scenario</w:t>
+        <w:t xml:space="preserve">under a </w:t>
+      </w:r>
+      <w:ins w:id="96" w:author="Elvis F. Elli" w:date="2026-06-12T08:52:00Z" w16du:dateUtc="2026-06-12T13:52:00Z">
+        <w:r>
+          <w:rPr>
+            <w:rFonts w:ascii="Times New Roman" w:hAnsi="Times New Roman" w:cs="Times New Roman"/>
+            <w:sz w:val="24"/>
+            <w:szCs w:val="24"/>
+          </w:rPr>
+          <w:t>+</w:t>
+        </w:r>
+      </w:ins>
+      <w:r>
+        <w:rPr>
+          <w:rFonts w:ascii="Times New Roman" w:hAnsi="Times New Roman" w:cs="Times New Roman"/>
+          <w:sz w:val="24"/>
+          <w:szCs w:val="24"/>
+        </w:rPr>
+        <w:t xml:space="preserve">2°C temperature </w:t>
+      </w:r>
+      <w:del w:id="97" w:author="Elvis F. Elli" w:date="2026-06-12T09:04:00Z" w16du:dateUtc="2026-06-12T14:04:00Z">
+        <w:r>
+          <w:rPr>
+            <w:rFonts w:ascii="Times New Roman" w:hAnsi="Times New Roman" w:cs="Times New Roman"/>
+            <w:sz w:val="24"/>
+            <w:szCs w:val="24"/>
+          </w:rPr>
+          <w:delText xml:space="preserve">increase </w:delText>
+        </w:r>
+      </w:del>
+      <w:r>
+        <w:rPr>
+          <w:rFonts w:ascii="Times New Roman" w:hAnsi="Times New Roman" w:cs="Times New Roman"/>
+          <w:sz w:val="24"/>
+          <w:szCs w:val="24"/>
+        </w:rPr>
+        <w:t>scenario</w:t>
       </w:r>
       <w:r>
         <w:rPr>
@@ -8717,7 +9050,7 @@
         </w:rPr>
         <w:t xml:space="preserve">. </w:t>
       </w:r>
-      <w:ins w:id="62" w:author="Elvis F. Elli" w:date="2026-06-08T12:31:00Z" w16du:dateUtc="2026-06-08T17:31:00Z">
+      <w:ins w:id="98" w:author="Elvis F. Elli" w:date="2026-06-08T12:31:00Z" w16du:dateUtc="2026-06-08T17:31:00Z">
         <w:r>
           <w:rPr>
             <w:rFonts w:ascii="Times New Roman" w:hAnsi="Times New Roman" w:cs="Times New Roman"/>
@@ -8740,7 +9073,7 @@
             <w:sz w:val="24"/>
             <w:szCs w:val="24"/>
           </w:rPr>
-          <w:t xml:space="preserve"> strategy, when used standalone under current weather conditions, increased soybean seed yield by 4.7% across the 10 locations evaluated</w:t>
+          <w:t xml:space="preserve"> strategy, when used standalone under current weather conditions, increased soybean seed yield by 4.7% across the 10 locations</w:t>
         </w:r>
       </w:ins>
       <w:r>
@@ -8921,6 +9254,16 @@
         </w:rPr>
         <w:t>In our study</w:t>
       </w:r>
+      <w:ins w:id="99" w:author="Elvis F. Elli" w:date="2026-06-12T08:54:00Z" w16du:dateUtc="2026-06-12T13:54:00Z">
+        <w:r>
+          <w:rPr>
+            <w:rFonts w:ascii="Times New Roman" w:hAnsi="Times New Roman" w:cs="Times New Roman"/>
+            <w:sz w:val="24"/>
+            <w:szCs w:val="24"/>
+          </w:rPr>
+          <w:t>,</w:t>
+        </w:r>
+      </w:ins>
       <w:r>
         <w:rPr>
           <w:rFonts w:ascii="Times New Roman" w:hAnsi="Times New Roman" w:cs="Times New Roman"/>
@@ -9992,7 +10335,27 @@
           <w:sz w:val="24"/>
           <w:szCs w:val="24"/>
         </w:rPr>
-        <w:t>, as demonstrated in this study, further</w:t>
+        <w:t xml:space="preserve">, </w:t>
+      </w:r>
+      <w:del w:id="100" w:author="Elvis F. Elli" w:date="2026-06-12T09:01:00Z" w16du:dateUtc="2026-06-12T14:01:00Z">
+        <w:r>
+          <w:rPr>
+            <w:rFonts w:ascii="Times New Roman" w:hAnsi="Times New Roman" w:cs="Times New Roman"/>
+            <w:color w:val="000000"/>
+            <w:sz w:val="24"/>
+            <w:szCs w:val="24"/>
+          </w:rPr>
+          <w:delText xml:space="preserve">as demonstrated in this study, </w:delText>
+        </w:r>
+      </w:del>
+      <w:r>
+        <w:rPr>
+          <w:rFonts w:ascii="Times New Roman" w:hAnsi="Times New Roman" w:cs="Times New Roman"/>
+          <w:color w:val="000000"/>
+          <w:sz w:val="24"/>
+          <w:szCs w:val="24"/>
+        </w:rPr>
+        <w:t>further</w:t>
       </w:r>
       <w:r>
         <w:rPr>
@@ -10151,24 +10514,114 @@
         </w:rPr>
         <w:t>high temperature risks</w:t>
       </w:r>
-      <w:r>
-        <w:rPr>
-          <w:rFonts w:ascii="Times New Roman" w:eastAsia="Arial" w:hAnsi="Times New Roman" w:cs="Times New Roman"/>
-          <w:color w:val="000000" w:themeColor="text1"/>
-          <w:sz w:val="24"/>
-          <w:szCs w:val="24"/>
-        </w:rPr>
-        <w:t>.</w:t>
-      </w:r>
-      <w:r>
-        <w:rPr>
-          <w:rFonts w:eastAsia="Arial"/>
-          <w:color w:val="000000" w:themeColor="text1"/>
-          <w:sz w:val="24"/>
-          <w:szCs w:val="24"/>
-        </w:rPr>
-        <w:t xml:space="preserve"> </w:t>
-      </w:r>
+      <w:ins w:id="101" w:author="Elvis F. Elli" w:date="2026-06-12T09:16:00Z" w16du:dateUtc="2026-06-12T14:16:00Z">
+        <w:r>
+          <w:rPr>
+            <w:rFonts w:ascii="Times New Roman" w:hAnsi="Times New Roman" w:cs="Times New Roman"/>
+            <w:color w:val="000000" w:themeColor="text1"/>
+            <w:sz w:val="24"/>
+            <w:szCs w:val="24"/>
+          </w:rPr>
+          <w:t>. While exploring optimum planting date window</w:t>
+        </w:r>
+      </w:ins>
+      <w:ins w:id="102" w:author="Elvis F. Elli" w:date="2026-06-12T09:19:00Z" w16du:dateUtc="2026-06-12T14:19:00Z">
+        <w:r>
+          <w:rPr>
+            <w:rFonts w:ascii="Times New Roman" w:hAnsi="Times New Roman" w:cs="Times New Roman"/>
+            <w:color w:val="000000" w:themeColor="text1"/>
+            <w:sz w:val="24"/>
+            <w:szCs w:val="24"/>
+          </w:rPr>
+          <w:t>s</w:t>
+        </w:r>
+      </w:ins>
+      <w:ins w:id="103" w:author="Elvis F. Elli" w:date="2026-06-12T09:16:00Z" w16du:dateUtc="2026-06-12T14:16:00Z">
+        <w:r>
+          <w:rPr>
+            <w:rFonts w:ascii="Times New Roman" w:hAnsi="Times New Roman" w:cs="Times New Roman"/>
+            <w:color w:val="000000" w:themeColor="text1"/>
+            <w:sz w:val="24"/>
+            <w:szCs w:val="24"/>
+          </w:rPr>
+          <w:t xml:space="preserve"> for target environment</w:t>
+        </w:r>
+      </w:ins>
+      <w:ins w:id="104" w:author="Elvis F. Elli" w:date="2026-06-12T09:17:00Z" w16du:dateUtc="2026-06-12T14:17:00Z">
+        <w:r>
+          <w:rPr>
+            <w:rFonts w:ascii="Times New Roman" w:hAnsi="Times New Roman" w:cs="Times New Roman"/>
+            <w:color w:val="000000" w:themeColor="text1"/>
+            <w:sz w:val="24"/>
+            <w:szCs w:val="24"/>
+          </w:rPr>
+          <w:t xml:space="preserve">s was not the focus of this study, future research could </w:t>
+        </w:r>
+      </w:ins>
+      <w:ins w:id="105" w:author="Elvis F. Elli" w:date="2026-06-12T09:19:00Z" w16du:dateUtc="2026-06-12T14:19:00Z">
+        <w:r>
+          <w:rPr>
+            <w:rFonts w:ascii="Times New Roman" w:hAnsi="Times New Roman" w:cs="Times New Roman"/>
+            <w:color w:val="000000" w:themeColor="text1"/>
+            <w:sz w:val="24"/>
+            <w:szCs w:val="24"/>
+          </w:rPr>
+          <w:t>investigate more extreme scenarios</w:t>
+        </w:r>
+      </w:ins>
+      <w:ins w:id="106" w:author="Elvis F. Elli" w:date="2026-06-12T09:20:00Z" w16du:dateUtc="2026-06-12T14:20:00Z">
+        <w:r>
+          <w:rPr>
+            <w:rFonts w:ascii="Times New Roman" w:hAnsi="Times New Roman" w:cs="Times New Roman"/>
+            <w:color w:val="000000" w:themeColor="text1"/>
+            <w:sz w:val="24"/>
+            <w:szCs w:val="24"/>
+          </w:rPr>
+          <w:t xml:space="preserve"> to enhance mechanistic</w:t>
+        </w:r>
+      </w:ins>
+      <w:ins w:id="107" w:author="Elvis F. Elli" w:date="2026-06-12T09:21:00Z" w16du:dateUtc="2026-06-12T14:21:00Z">
+        <w:r>
+          <w:rPr>
+            <w:rFonts w:ascii="Times New Roman" w:hAnsi="Times New Roman" w:cs="Times New Roman"/>
+            <w:color w:val="000000" w:themeColor="text1"/>
+            <w:sz w:val="24"/>
+            <w:szCs w:val="24"/>
+          </w:rPr>
+          <w:t xml:space="preserve"> understanding of yield responses under warming.</w:t>
+        </w:r>
+      </w:ins>
+      <w:ins w:id="108" w:author="Elvis F. Elli" w:date="2026-06-12T09:17:00Z" w16du:dateUtc="2026-06-12T14:17:00Z">
+        <w:r>
+          <w:rPr>
+            <w:rFonts w:ascii="Times New Roman" w:hAnsi="Times New Roman" w:cs="Times New Roman"/>
+            <w:color w:val="000000" w:themeColor="text1"/>
+            <w:sz w:val="24"/>
+            <w:szCs w:val="24"/>
+          </w:rPr>
+          <w:t xml:space="preserve"> </w:t>
+        </w:r>
+      </w:ins>
+      <w:del w:id="109" w:author="Elvis F. Elli" w:date="2026-06-12T09:16:00Z" w16du:dateUtc="2026-06-12T14:16:00Z">
+        <w:r>
+          <w:rPr>
+            <w:rFonts w:ascii="Times New Roman" w:eastAsia="Arial" w:hAnsi="Times New Roman" w:cs="Times New Roman"/>
+            <w:color w:val="000000" w:themeColor="text1"/>
+            <w:sz w:val="24"/>
+            <w:szCs w:val="24"/>
+          </w:rPr>
+          <w:delText>.</w:delText>
+        </w:r>
+        <w:r>
+          <w:rPr>
+            <w:rFonts w:eastAsia="Arial"/>
+            <w:color w:val="000000" w:themeColor="text1"/>
+            <w:sz w:val="24"/>
+            <w:szCs w:val="24"/>
+          </w:rPr>
+          <w:delText xml:space="preserve"> </w:delText>
+        </w:r>
+      </w:del>
     </w:p>
     <w:p>
       <w:pPr>
@@ -10269,7 +10722,7 @@
         </w:rPr>
         <w:t>high</w:t>
       </w:r>
-      <w:del w:id="63" w:author="Elvis F. Elli" w:date="2026-06-09T11:14:00Z" w16du:dateUtc="2026-06-09T16:14:00Z">
+      <w:del w:id="110" w:author="Elvis F. Elli" w:date="2026-06-09T11:14:00Z" w16du:dateUtc="2026-06-09T16:14:00Z">
         <w:r>
           <w:rPr>
             <w:rFonts w:ascii="Times New Roman" w:hAnsi="Times New Roman" w:cs="Times New Roman"/>
@@ -10296,7 +10749,7 @@
         </w:rPr>
         <w:t xml:space="preserve"> risks</w:t>
       </w:r>
-      <w:ins w:id="64" w:author="Elvis F. Elli" w:date="2026-06-09T11:13:00Z" w16du:dateUtc="2026-06-09T16:13:00Z">
+      <w:ins w:id="111" w:author="Elvis F. Elli" w:date="2026-06-09T11:13:00Z" w16du:dateUtc="2026-06-09T16:13:00Z">
         <w:r>
           <w:rPr>
             <w:rFonts w:ascii="Times New Roman" w:hAnsi="Times New Roman" w:cs="Times New Roman"/>
@@ -10306,7 +10759,7 @@
           <w:t xml:space="preserve">, providing </w:t>
         </w:r>
       </w:ins>
-      <w:ins w:id="65" w:author="Elvis F. Elli" w:date="2026-06-09T11:14:00Z" w16du:dateUtc="2026-06-09T16:14:00Z">
+      <w:ins w:id="112" w:author="Elvis F. Elli" w:date="2026-06-09T11:14:00Z" w16du:dateUtc="2026-06-09T16:14:00Z">
         <w:r>
           <w:rPr>
             <w:rFonts w:ascii="Times New Roman" w:hAnsi="Times New Roman" w:cs="Times New Roman"/>
@@ -10316,7 +10769,7 @@
           <w:t xml:space="preserve">new </w:t>
         </w:r>
       </w:ins>
-      <w:ins w:id="66" w:author="Elvis F. Elli" w:date="2026-06-09T11:13:00Z" w16du:dateUtc="2026-06-09T16:13:00Z">
+      <w:ins w:id="113" w:author="Elvis F. Elli" w:date="2026-06-09T11:13:00Z" w16du:dateUtc="2026-06-09T16:13:00Z">
         <w:r>
           <w:rPr>
             <w:rFonts w:ascii="Times New Roman" w:hAnsi="Times New Roman" w:cs="Times New Roman"/>
@@ -10326,7 +10779,7 @@
           <w:t xml:space="preserve">quantitative </w:t>
         </w:r>
       </w:ins>
-      <w:ins w:id="67" w:author="Elvis F. Elli" w:date="2026-06-09T11:14:00Z" w16du:dateUtc="2026-06-09T16:14:00Z">
+      <w:ins w:id="114" w:author="Elvis F. Elli" w:date="2026-06-09T11:14:00Z" w16du:dateUtc="2026-06-09T16:14:00Z">
         <w:r>
           <w:rPr>
             <w:rFonts w:ascii="Times New Roman" w:hAnsi="Times New Roman" w:cs="Times New Roman"/>
@@ -10336,7 +10789,7 @@
           <w:t xml:space="preserve">evidence </w:t>
         </w:r>
       </w:ins>
-      <w:ins w:id="68" w:author="Elvis F. Elli" w:date="2026-06-09T11:13:00Z" w16du:dateUtc="2026-06-09T16:13:00Z">
+      <w:ins w:id="115" w:author="Elvis F. Elli" w:date="2026-06-09T11:13:00Z" w16du:dateUtc="2026-06-09T16:13:00Z">
         <w:r>
           <w:rPr>
             <w:rFonts w:ascii="Times New Roman" w:hAnsi="Times New Roman" w:cs="Times New Roman"/>
@@ -10346,7 +10799,7 @@
           <w:t xml:space="preserve">for the irrigated Arkansas delta that </w:t>
         </w:r>
       </w:ins>
-      <w:ins w:id="69" w:author="Elvis F. Elli" w:date="2026-06-09T11:15:00Z" w16du:dateUtc="2026-06-09T16:15:00Z">
+      <w:ins w:id="116" w:author="Elvis F. Elli" w:date="2026-06-09T11:15:00Z" w16du:dateUtc="2026-06-09T16:15:00Z">
         <w:r>
           <w:rPr>
             <w:rFonts w:ascii="Times New Roman" w:hAnsi="Times New Roman" w:cs="Times New Roman"/>
@@ -10356,7 +10809,7 @@
           <w:t>extends</w:t>
         </w:r>
       </w:ins>
-      <w:ins w:id="70" w:author="Elvis F. Elli" w:date="2026-06-09T11:13:00Z" w16du:dateUtc="2026-06-09T16:13:00Z">
+      <w:ins w:id="117" w:author="Elvis F. Elli" w:date="2026-06-09T11:13:00Z" w16du:dateUtc="2026-06-09T16:13:00Z">
         <w:r>
           <w:rPr>
             <w:rFonts w:ascii="Times New Roman" w:hAnsi="Times New Roman" w:cs="Times New Roman"/>
@@ -10366,7 +10819,7 @@
           <w:t xml:space="preserve"> </w:t>
         </w:r>
       </w:ins>
-      <w:ins w:id="71" w:author="Elvis F. Elli" w:date="2026-06-09T11:14:00Z" w16du:dateUtc="2026-06-09T16:14:00Z">
+      <w:ins w:id="118" w:author="Elvis F. Elli" w:date="2026-06-09T11:14:00Z" w16du:dateUtc="2026-06-09T16:14:00Z">
         <w:r>
           <w:rPr>
             <w:rFonts w:ascii="Times New Roman" w:hAnsi="Times New Roman" w:cs="Times New Roman"/>
@@ -10729,6 +11182,7 @@
           <w:sz w:val="24"/>
           <w:szCs w:val="24"/>
         </w:rPr>
+        <w:lastRenderedPageBreak/>
         <w:t>Conflict of Interest</w:t>
       </w:r>
     </w:p>
@@ -10793,7 +11247,6 @@
           <w:bCs/>
           <w:szCs w:val="24"/>
         </w:rPr>
-        <w:lastRenderedPageBreak/>
         <w:t>Elvis F. Elli</w:t>
       </w:r>
       <w:r>
@@ -11157,6 +11610,7 @@
           <w:sz w:val="24"/>
           <w:szCs w:val="24"/>
         </w:rPr>
+        <w:lastRenderedPageBreak/>
         <w:t>Table S1.</w:t>
       </w:r>
       <w:r>
@@ -11252,7 +11706,6 @@
           <w:sz w:val="24"/>
           <w:szCs w:val="24"/>
         </w:rPr>
-        <w:lastRenderedPageBreak/>
         <w:t>Figure S</w:t>
       </w:r>
       <w:r>
@@ -11628,16 +12081,7 @@
           <w:sz w:val="24"/>
           <w:szCs w:val="24"/>
         </w:rPr>
-        <w:t xml:space="preserve">) physiology, growth and </w:t>
-      </w:r>
-      <w:r>
-        <w:rPr>
-          <w:rFonts w:ascii="Times New Roman" w:hAnsi="Times New Roman" w:cs="Times New Roman"/>
-          <w:sz w:val="24"/>
-          <w:szCs w:val="24"/>
-        </w:rPr>
-        <w:lastRenderedPageBreak/>
-        <w:t xml:space="preserve">yield. </w:t>
+        <w:t xml:space="preserve">) physiology, growth and yield. </w:t>
       </w:r>
       <w:r>
         <w:rPr>
@@ -12058,6 +12502,7 @@
           <w:sz w:val="24"/>
           <w:szCs w:val="24"/>
         </w:rPr>
+        <w:lastRenderedPageBreak/>
         <w:t>Deryng</w:t>
       </w:r>
       <w:proofErr w:type="spellEnd"/>
@@ -12151,7 +12596,6 @@
           <w:sz w:val="24"/>
           <w:szCs w:val="24"/>
         </w:rPr>
-        <w:lastRenderedPageBreak/>
         <w:t xml:space="preserve">Djanaguiraman, M., Prasad, P. V. V., Boyle, D. L., &amp; </w:t>
       </w:r>
       <w:proofErr w:type="spellStart"/>
@@ -12554,6 +12998,7 @@
           <w:sz w:val="24"/>
           <w:szCs w:val="24"/>
         </w:rPr>
+        <w:lastRenderedPageBreak/>
         <w:t xml:space="preserve">Kothari, K., Battisti, R., Boote, K. J., Archontoulis, S. V., Confalone, A., Constantin, J., Cuadra, S. V., Debaeke, P., Faye, B., Grant, B., Hoogenboom, G., Jing, Q., van der Laan, M., Macena da Silva, F. A., Marin, F. R., </w:t>
       </w:r>
       <w:proofErr w:type="spellStart"/>
@@ -12590,16 +13035,7 @@
           <w:sz w:val="24"/>
           <w:szCs w:val="24"/>
         </w:rPr>
-        <w:t xml:space="preserve">, C., Silva, E. H. F. M., Smith, W., Soltani, A., Srivastava, A., Vieira, N. A., </w:t>
-      </w:r>
-      <w:r>
-        <w:rPr>
-          <w:rFonts w:ascii="Times New Roman" w:hAnsi="Times New Roman" w:cs="Times New Roman"/>
-          <w:sz w:val="24"/>
-          <w:szCs w:val="24"/>
-        </w:rPr>
-        <w:lastRenderedPageBreak/>
-        <w:t xml:space="preserve">Slone, S., &amp; Salmerón, M. (2022). Are soybean models ready for climate change food impact assessments? </w:t>
+        <w:t xml:space="preserve">, C., Silva, E. H. F. M., Smith, W., Soltani, A., Srivastava, A., Vieira, N. A., Slone, S., &amp; Salmerón, M. (2022). Are soybean models ready for climate change food impact assessments? </w:t>
       </w:r>
       <w:r>
         <w:rPr>
@@ -12947,6 +13383,7 @@
           <w:sz w:val="24"/>
           <w:szCs w:val="24"/>
         </w:rPr>
+        <w:lastRenderedPageBreak/>
         <w:t xml:space="preserve">Mourtzinis, S., Specht, J. E., &amp; Conley, S. P. (2019). Defining optimal soybean sowing dates across the US. </w:t>
       </w:r>
       <w:r>
@@ -13061,7 +13498,6 @@
           <w:sz w:val="24"/>
           <w:szCs w:val="24"/>
         </w:rPr>
-        <w:lastRenderedPageBreak/>
         <w:t xml:space="preserve">Nendel, C., Reckling, M., </w:t>
       </w:r>
       <w:proofErr w:type="spellStart"/>
@@ -13570,6 +14006,7 @@
           <w:sz w:val="24"/>
           <w:szCs w:val="24"/>
         </w:rPr>
+        <w:lastRenderedPageBreak/>
         <w:t xml:space="preserve">Salmerón, M., Gbur, E. E., Bourland, F. M., Buehring, N. W., Earnest, L., Fritschi, F. B., Golden, B. R., Hathcoat, D., Lofton, J., McClure, A. T., Miller, T. D., Neely, C., Shannon, G., </w:t>
       </w:r>
       <w:proofErr w:type="spellStart"/>
@@ -13606,16 +14043,7 @@
           <w:sz w:val="24"/>
           <w:szCs w:val="24"/>
         </w:rPr>
-        <w:t xml:space="preserve">, D. A., Vories, E. D., Wiebold, W. J., &amp; Purcell, L. C. (2016). Yield </w:t>
-      </w:r>
-      <w:r>
-        <w:rPr>
-          <w:rFonts w:ascii="Times New Roman" w:hAnsi="Times New Roman" w:cs="Times New Roman"/>
-          <w:sz w:val="24"/>
-          <w:szCs w:val="24"/>
-        </w:rPr>
-        <w:lastRenderedPageBreak/>
-        <w:t xml:space="preserve">response to planting date among soybean maturity groups for irrigated production in the US Midsouth. </w:t>
+        <w:t xml:space="preserve">, D. A., Vories, E. D., Wiebold, W. J., &amp; Purcell, L. C. (2016). Yield response to planting date among soybean maturity groups for irrigated production in the US Midsouth. </w:t>
       </w:r>
       <w:r>
         <w:rPr>
@@ -15852,6 +16280,7 @@
     <w:rsid w:val="00297FB9"/>
     <w:rsid w:val="002B76B2"/>
     <w:rsid w:val="002C032B"/>
+    <w:rsid w:val="002C17D3"/>
     <w:rsid w:val="002C74D3"/>
     <w:rsid w:val="00311B29"/>
     <w:rsid w:val="00330CA9"/>
@@ -15904,6 +16333,7 @@
     <w:rsid w:val="00F459E4"/>
     <w:rsid w:val="00F471E8"/>
     <w:rsid w:val="00F92F05"/>
+    <w:rsid w:val="00FA37E1"/>
     <w:rsid w:val="00FE34C3"/>
   </w:rsids>
   <m:mathPr>

</xml_diff>